<commit_message>
fix(supplier-orders): Confirm Order button was a no-op (PUT vs PATCH) + notify admins on supplier action
- Frontend was sending PUT /orders/:id/status; backend declares
  @Patch(':id/status'). Result: clicking "Confirm Order" silently
  404'd inside a try/catch that swallowed every error, and the
  supplier saw nothing happen. Method now matches the controller +
  toast surfaces success/failure so the supplier knows what happened.

- Backend: when the actor on a status change is the supplier (their
  id appears in the order's supplier set), notifyAdmins() fires with
  a clear "<Supplier> confirmed/shipped/cancelled order #XXXX" line.
  Appears in the admin notification bell + on the /admin/orders page,
  exactly as the operator requested: "أول ما يدوس على كونفيرم علطول
  يوصل عند الأدمن في صفحة الاردر".

- Self-ping skip: the supplier who initiated the change is no longer
  notified of their own action.

Co-Authored-By: Claude Opus 4.7 <noreply@anthropic.com>
</commit_message>
<xml_diff>
--- a/B2B_Marketplace_Handover_Document.docx
+++ b/B2B_Marketplace_Handover_Document.docx
@@ -117,7 +117,7 @@
           <w:sz w:val="22"/>
           <w:szCs w:val="22"/>
         </w:rPr>
-        <w:t xml:space="preserve">Version: 1.0 — Production Ready</w:t>
+        <w:t xml:space="preserve">Version: 1.1 — Production Ready</w:t>
       </w:r>
     </w:p>
     <w:p>
@@ -747,7 +747,7 @@
                 <w:sz w:val="19"/>
                 <w:szCs w:val="19"/>
               </w:rPr>
-              <w:t xml:space="preserve">Storage</w:t>
+              <w:t xml:space="preserve">Email</w:t>
             </w:r>
           </w:p>
         </w:tc>
@@ -780,7 +780,7 @@
                 <w:sz w:val="19"/>
                 <w:szCs w:val="19"/>
               </w:rPr>
-              <w:t xml:space="preserve">Supabase Storage (KYC files)</w:t>
+              <w:t xml:space="preserve">Hostinger SMTP + Resend fallback</w:t>
             </w:r>
           </w:p>
         </w:tc>
@@ -816,7 +816,7 @@
                 <w:sz w:val="19"/>
                 <w:szCs w:val="19"/>
               </w:rPr>
-              <w:t xml:space="preserve">Email</w:t>
+              <w:t xml:space="preserve">Deployment</w:t>
             </w:r>
           </w:p>
         </w:tc>
@@ -850,7 +850,7 @@
                 <w:sz w:val="19"/>
                 <w:szCs w:val="19"/>
               </w:rPr>
-              <w:t xml:space="preserve">Hostinger SMTP + Resend fallback</w:t>
+              <w:t xml:space="preserve">Vercel (Frontend) + Railway (Backend + Database)</w:t>
             </w:r>
           </w:p>
         </w:tc>
@@ -885,7 +885,7 @@
                 <w:sz w:val="19"/>
                 <w:szCs w:val="19"/>
               </w:rPr>
-              <w:t xml:space="preserve">Deployment</w:t>
+              <w:t xml:space="preserve">Security</w:t>
             </w:r>
           </w:p>
         </w:tc>
@@ -918,7 +918,7 @@
                 <w:sz w:val="19"/>
                 <w:szCs w:val="19"/>
               </w:rPr>
-              <w:t xml:space="preserve">Vercel (Frontend) + Railway (Backend)</w:t>
+              <w:t xml:space="preserve">Custom NestJS Security Module (crypto, threat detection, auto-heal)</w:t>
             </w:r>
           </w:p>
         </w:tc>
@@ -954,7 +954,7 @@
                 <w:sz w:val="19"/>
                 <w:szCs w:val="19"/>
               </w:rPr>
-              <w:t xml:space="preserve">Security</w:t>
+              <w:t xml:space="preserve">i18n</w:t>
             </w:r>
           </w:p>
         </w:tc>
@@ -968,74 +968,6 @@
               <w:right w:val="single" w:color="CCCCCC" w:sz="1"/>
             </w:tcBorders>
             <w:shd w:fill="F0F4F8" w:val="clear"/>
-            <w:tcMar>
-              <w:top w:type="dxa" w:w="80"/>
-              <w:left w:type="dxa" w:w="120"/>
-              <w:bottom w:type="dxa" w:w="80"/>
-              <w:right w:type="dxa" w:w="120"/>
-            </w:tcMar>
-          </w:tcPr>
-          <w:p>
-            <w:pPr>
-              <w:jc w:val="left"/>
-            </w:pPr>
-            <w:r>
-              <w:rPr>
-                <w:rFonts w:ascii="Arial" w:cs="Arial" w:eastAsia="Arial" w:hAnsi="Arial"/>
-                <w:b w:val="false"/>
-                <w:bCs w:val="false"/>
-                <w:color w:val="222222"/>
-                <w:sz w:val="19"/>
-                <w:szCs w:val="19"/>
-              </w:rPr>
-              <w:t xml:space="preserve">Custom NestJS Security Module (crypto, threat detection, auto-heal)</w:t>
-            </w:r>
-          </w:p>
-        </w:tc>
-      </w:tr>
-      <w:tr>
-        <w:tc>
-          <w:tcPr>
-            <w:tcW w:type="dxa" w:w="3500"/>
-            <w:tcBorders>
-              <w:top w:val="single" w:color="CCCCCC" w:sz="1"/>
-              <w:left w:val="single" w:color="CCCCCC" w:sz="1"/>
-              <w:bottom w:val="single" w:color="CCCCCC" w:sz="1"/>
-              <w:right w:val="single" w:color="CCCCCC" w:sz="1"/>
-            </w:tcBorders>
-            <w:tcMar>
-              <w:top w:type="dxa" w:w="80"/>
-              <w:left w:type="dxa" w:w="120"/>
-              <w:bottom w:type="dxa" w:w="80"/>
-              <w:right w:type="dxa" w:w="120"/>
-            </w:tcMar>
-          </w:tcPr>
-          <w:p>
-            <w:pPr>
-              <w:jc w:val="left"/>
-            </w:pPr>
-            <w:r>
-              <w:rPr>
-                <w:rFonts w:ascii="Arial" w:cs="Arial" w:eastAsia="Arial" w:hAnsi="Arial"/>
-                <w:b w:val="false"/>
-                <w:bCs w:val="false"/>
-                <w:color w:val="222222"/>
-                <w:sz w:val="19"/>
-                <w:szCs w:val="19"/>
-              </w:rPr>
-              <w:t xml:space="preserve">i18n</w:t>
-            </w:r>
-          </w:p>
-        </w:tc>
-        <w:tc>
-          <w:tcPr>
-            <w:tcW w:type="dxa" w:w="5860"/>
-            <w:tcBorders>
-              <w:top w:val="single" w:color="CCCCCC" w:sz="1"/>
-              <w:left w:val="single" w:color="CCCCCC" w:sz="1"/>
-              <w:bottom w:val="single" w:color="CCCCCC" w:sz="1"/>
-              <w:right w:val="single" w:color="CCCCCC" w:sz="1"/>
-            </w:tcBorders>
             <w:tcMar>
               <w:top w:type="dxa" w:w="80"/>
               <w:left w:type="dxa" w:w="120"/>
@@ -4799,110 +4731,6 @@
                 <w:szCs w:val="19"/>
               </w:rPr>
               <w:t xml:space="preserve">Health check endpoint at GET /health</w:t>
-            </w:r>
-          </w:p>
-        </w:tc>
-      </w:tr>
-      <w:tr>
-        <w:tc>
-          <w:tcPr>
-            <w:tcW w:type="dxa" w:w="3500"/>
-            <w:tcBorders>
-              <w:top w:val="single" w:color="CCCCCC" w:sz="1"/>
-              <w:left w:val="single" w:color="CCCCCC" w:sz="1"/>
-              <w:bottom w:val="single" w:color="CCCCCC" w:sz="1"/>
-              <w:right w:val="single" w:color="CCCCCC" w:sz="1"/>
-            </w:tcBorders>
-            <w:shd w:fill="D6F0DC" w:val="clear"/>
-            <w:tcMar>
-              <w:top w:type="dxa" w:w="80"/>
-              <w:left w:type="dxa" w:w="120"/>
-              <w:bottom w:type="dxa" w:w="80"/>
-              <w:right w:type="dxa" w:w="120"/>
-            </w:tcMar>
-          </w:tcPr>
-          <w:p>
-            <w:pPr>
-              <w:jc w:val="left"/>
-            </w:pPr>
-            <w:r>
-              <w:rPr>
-                <w:rFonts w:ascii="Arial" w:cs="Arial" w:eastAsia="Arial" w:hAnsi="Arial"/>
-                <w:b w:val="false"/>
-                <w:bCs w:val="false"/>
-                <w:color w:val="222222"/>
-                <w:sz w:val="19"/>
-                <w:szCs w:val="19"/>
-              </w:rPr>
-              <w:t xml:space="preserve">storage</w:t>
-            </w:r>
-          </w:p>
-        </w:tc>
-        <w:tc>
-          <w:tcPr>
-            <w:tcW w:type="dxa" w:w="2000"/>
-            <w:tcBorders>
-              <w:top w:val="single" w:color="CCCCCC" w:sz="1"/>
-              <w:left w:val="single" w:color="CCCCCC" w:sz="1"/>
-              <w:bottom w:val="single" w:color="CCCCCC" w:sz="1"/>
-              <w:right w:val="single" w:color="CCCCCC" w:sz="1"/>
-            </w:tcBorders>
-            <w:shd w:fill="D6F0DC" w:val="clear"/>
-            <w:tcMar>
-              <w:top w:type="dxa" w:w="80"/>
-              <w:left w:type="dxa" w:w="120"/>
-              <w:bottom w:type="dxa" w:w="80"/>
-              <w:right w:type="dxa" w:w="120"/>
-            </w:tcMar>
-          </w:tcPr>
-          <w:p>
-            <w:pPr>
-              <w:jc w:val="left"/>
-            </w:pPr>
-            <w:r>
-              <w:rPr>
-                <w:rFonts w:ascii="Arial" w:cs="Arial" w:eastAsia="Arial" w:hAnsi="Arial"/>
-                <w:b w:val="false"/>
-                <w:bCs w:val="false"/>
-                <w:color w:val="222222"/>
-                <w:sz w:val="19"/>
-                <w:szCs w:val="19"/>
-              </w:rPr>
-              <w:t xml:space="preserve">✅ Done</w:t>
-            </w:r>
-          </w:p>
-        </w:tc>
-        <w:tc>
-          <w:tcPr>
-            <w:tcW w:type="dxa" w:w="3860"/>
-            <w:tcBorders>
-              <w:top w:val="single" w:color="CCCCCC" w:sz="1"/>
-              <w:left w:val="single" w:color="CCCCCC" w:sz="1"/>
-              <w:bottom w:val="single" w:color="CCCCCC" w:sz="1"/>
-              <w:right w:val="single" w:color="CCCCCC" w:sz="1"/>
-            </w:tcBorders>
-            <w:shd w:fill="D6F0DC" w:val="clear"/>
-            <w:tcMar>
-              <w:top w:type="dxa" w:w="80"/>
-              <w:left w:type="dxa" w:w="120"/>
-              <w:bottom w:type="dxa" w:w="80"/>
-              <w:right w:type="dxa" w:w="120"/>
-            </w:tcMar>
-          </w:tcPr>
-          <w:p>
-            <w:pPr>
-              <w:jc w:val="left"/>
-            </w:pPr>
-            <w:r>
-              <w:rPr>
-                <w:rFonts w:ascii="Arial" w:cs="Arial" w:eastAsia="Arial" w:hAnsi="Arial"/>
-                <w:b w:val="false"/>
-                <w:bCs w:val="false"/>
-                <w:color w:val="222222"/>
-                <w:sz w:val="19"/>
-                <w:szCs w:val="19"/>
-              </w:rPr>
-              <w:t xml:space="preserve">Supabase storage service for KYC documents (cloud, not local)</w:t>
             </w:r>
           </w:p>
         </w:tc>
@@ -12134,7 +11962,7 @@
                 <w:sz w:val="19"/>
                 <w:szCs w:val="19"/>
               </w:rPr>
-              <w:t xml:space="preserve">SUPABASE_URL</w:t>
+              <w:t xml:space="preserve">SEED_ADMIN_SECRET</w:t>
             </w:r>
           </w:p>
         </w:tc>
@@ -12167,7 +11995,7 @@
                 <w:sz w:val="19"/>
                 <w:szCs w:val="19"/>
               </w:rPr>
-              <w:t xml:space="preserve">From your Supabase project dashboard. Needed to store KYC documents in the cloud.</w:t>
+              <w:t xml:space="preserve">A secret password used when running the admin seed script. Set to any secure string.</w:t>
             </w:r>
           </w:p>
         </w:tc>
@@ -12203,7 +12031,7 @@
                 <w:sz w:val="19"/>
                 <w:szCs w:val="19"/>
               </w:rPr>
-              <w:t xml:space="preserve">SUPABASE_SERVICE_ROLE_KEY</w:t>
+              <w:t xml:space="preserve">NODE_ENV</w:t>
             </w:r>
           </w:p>
         </w:tc>
@@ -12237,7 +12065,7 @@
                 <w:sz w:val="19"/>
                 <w:szCs w:val="19"/>
               </w:rPr>
-              <w:t xml:space="preserve">From Supabase → Project Settings → API → service_role key. Keep secret.</w:t>
+              <w:t xml:space="preserve">Set to: production</w:t>
             </w:r>
           </w:p>
         </w:tc>
@@ -12272,7 +12100,7 @@
                 <w:sz w:val="19"/>
                 <w:szCs w:val="19"/>
               </w:rPr>
-              <w:t xml:space="preserve">SEED_ADMIN_SECRET</w:t>
+              <w:t xml:space="preserve">PORT</w:t>
             </w:r>
           </w:p>
         </w:tc>
@@ -12305,7 +12133,7 @@
                 <w:sz w:val="19"/>
                 <w:szCs w:val="19"/>
               </w:rPr>
-              <w:t xml:space="preserve">A secret password used when running the admin seed script. Set to any secure string.</w:t>
+              <w:t xml:space="preserve">Set to: 3005</w:t>
             </w:r>
           </w:p>
         </w:tc>
@@ -12341,7 +12169,7 @@
                 <w:sz w:val="19"/>
                 <w:szCs w:val="19"/>
               </w:rPr>
-              <w:t xml:space="preserve">NODE_ENV</w:t>
+              <w:t xml:space="preserve">OPENROUTER_API_KEY</w:t>
             </w:r>
           </w:p>
         </w:tc>
@@ -12375,145 +12203,7 @@
                 <w:sz w:val="19"/>
                 <w:szCs w:val="19"/>
               </w:rPr>
-              <w:t xml:space="preserve">Set to: production</w:t>
-            </w:r>
-          </w:p>
-        </w:tc>
-      </w:tr>
-      <w:tr>
-        <w:tc>
-          <w:tcPr>
-            <w:tcW w:type="dxa" w:w="3200"/>
-            <w:tcBorders>
-              <w:top w:val="single" w:color="CCCCCC" w:sz="1"/>
-              <w:left w:val="single" w:color="CCCCCC" w:sz="1"/>
-              <w:bottom w:val="single" w:color="CCCCCC" w:sz="1"/>
-              <w:right w:val="single" w:color="CCCCCC" w:sz="1"/>
-            </w:tcBorders>
-            <w:tcMar>
-              <w:top w:type="dxa" w:w="80"/>
-              <w:left w:type="dxa" w:w="120"/>
-              <w:bottom w:type="dxa" w:w="80"/>
-              <w:right w:type="dxa" w:w="120"/>
-            </w:tcMar>
-          </w:tcPr>
-          <w:p>
-            <w:pPr>
-              <w:jc w:val="left"/>
-            </w:pPr>
-            <w:r>
-              <w:rPr>
-                <w:rFonts w:ascii="Arial" w:cs="Arial" w:eastAsia="Arial" w:hAnsi="Arial"/>
-                <w:b w:val="false"/>
-                <w:bCs w:val="false"/>
-                <w:color w:val="222222"/>
-                <w:sz w:val="19"/>
-                <w:szCs w:val="19"/>
-              </w:rPr>
-              <w:t xml:space="preserve">PORT</w:t>
-            </w:r>
-          </w:p>
-        </w:tc>
-        <w:tc>
-          <w:tcPr>
-            <w:tcW w:type="dxa" w:w="6160"/>
-            <w:tcBorders>
-              <w:top w:val="single" w:color="CCCCCC" w:sz="1"/>
-              <w:left w:val="single" w:color="CCCCCC" w:sz="1"/>
-              <w:bottom w:val="single" w:color="CCCCCC" w:sz="1"/>
-              <w:right w:val="single" w:color="CCCCCC" w:sz="1"/>
-            </w:tcBorders>
-            <w:tcMar>
-              <w:top w:type="dxa" w:w="80"/>
-              <w:left w:type="dxa" w:w="120"/>
-              <w:bottom w:type="dxa" w:w="80"/>
-              <w:right w:type="dxa" w:w="120"/>
-            </w:tcMar>
-          </w:tcPr>
-          <w:p>
-            <w:pPr>
-              <w:jc w:val="left"/>
-            </w:pPr>
-            <w:r>
-              <w:rPr>
-                <w:rFonts w:ascii="Arial" w:cs="Arial" w:eastAsia="Arial" w:hAnsi="Arial"/>
-                <w:b w:val="false"/>
-                <w:bCs w:val="false"/>
-                <w:color w:val="222222"/>
-                <w:sz w:val="19"/>
-                <w:szCs w:val="19"/>
-              </w:rPr>
-              <w:t xml:space="preserve">Set to: 3005</w:t>
-            </w:r>
-          </w:p>
-        </w:tc>
-      </w:tr>
-      <w:tr>
-        <w:tc>
-          <w:tcPr>
-            <w:tcW w:type="dxa" w:w="3200"/>
-            <w:tcBorders>
-              <w:top w:val="single" w:color="CCCCCC" w:sz="1"/>
-              <w:left w:val="single" w:color="CCCCCC" w:sz="1"/>
-              <w:bottom w:val="single" w:color="CCCCCC" w:sz="1"/>
-              <w:right w:val="single" w:color="CCCCCC" w:sz="1"/>
-            </w:tcBorders>
-            <w:shd w:fill="F0F4F8" w:val="clear"/>
-            <w:tcMar>
-              <w:top w:type="dxa" w:w="80"/>
-              <w:left w:type="dxa" w:w="120"/>
-              <w:bottom w:type="dxa" w:w="80"/>
-              <w:right w:type="dxa" w:w="120"/>
-            </w:tcMar>
-          </w:tcPr>
-          <w:p>
-            <w:pPr>
-              <w:jc w:val="left"/>
-            </w:pPr>
-            <w:r>
-              <w:rPr>
-                <w:rFonts w:ascii="Arial" w:cs="Arial" w:eastAsia="Arial" w:hAnsi="Arial"/>
-                <w:b w:val="false"/>
-                <w:bCs w:val="false"/>
-                <w:color w:val="222222"/>
-                <w:sz w:val="19"/>
-                <w:szCs w:val="19"/>
-              </w:rPr>
-              <w:t xml:space="preserve">OPENROUTER_API_KEY</w:t>
-            </w:r>
-          </w:p>
-        </w:tc>
-        <w:tc>
-          <w:tcPr>
-            <w:tcW w:type="dxa" w:w="6160"/>
-            <w:tcBorders>
-              <w:top w:val="single" w:color="CCCCCC" w:sz="1"/>
-              <w:left w:val="single" w:color="CCCCCC" w:sz="1"/>
-              <w:bottom w:val="single" w:color="CCCCCC" w:sz="1"/>
-              <w:right w:val="single" w:color="CCCCCC" w:sz="1"/>
-            </w:tcBorders>
-            <w:shd w:fill="F0F4F8" w:val="clear"/>
-            <w:tcMar>
-              <w:top w:type="dxa" w:w="80"/>
-              <w:left w:type="dxa" w:w="120"/>
-              <w:bottom w:type="dxa" w:w="80"/>
-              <w:right w:type="dxa" w:w="120"/>
-            </w:tcMar>
-          </w:tcPr>
-          <w:p>
-            <w:pPr>
-              <w:jc w:val="left"/>
-            </w:pPr>
-            <w:r>
-              <w:rPr>
-                <w:rFonts w:ascii="Arial" w:cs="Arial" w:eastAsia="Arial" w:hAnsi="Arial"/>
-                <w:b w:val="false"/>
-                <w:bCs w:val="false"/>
-                <w:color w:val="222222"/>
-                <w:sz w:val="19"/>
-                <w:szCs w:val="19"/>
-              </w:rPr>
-              <w:t xml:space="preserve">OPTIONAL — only needed if you want AI chat bot. Get from openrouter.ai</w:t>
+              <w:t xml:space="preserve">OPTIONAL — only needed if you want AI chat bot. Get from openrouter.ai. You will be charged per message sent.</w:t>
             </w:r>
           </w:p>
         </w:tc>
@@ -13218,7 +12908,7 @@
           <w:sz w:val="32"/>
           <w:szCs w:val="32"/>
         </w:rPr>
-        <w:t xml:space="preserve">4. Third-Party Accounts the Client Must Set Up</w:t>
+        <w:t xml:space="preserve">4. Third-Party Accounts &amp; Services</w:t>
       </w:r>
     </w:p>
     <w:p>
@@ -13689,7 +13379,7 @@
                 <w:sz w:val="19"/>
                 <w:szCs w:val="19"/>
               </w:rPr>
-              <w:t xml:space="preserve">Dashboard → Developers → Webhooks → Add endpoint. URL: https://your-backend.railway.app/api/payments/webhook. Select events listed in Section 4.1a below.</w:t>
+              <w:t xml:space="preserve">Dashboard → Developers → Webhooks → Add endpoint. URL: https://your-backend.railway.app/api/payments/webhook. Select events listed below.</w:t>
             </w:r>
           </w:p>
         </w:tc>
@@ -13852,7 +13542,7 @@
           <w:sz w:val="22"/>
           <w:szCs w:val="22"/>
         </w:rPr>
-        <w:t xml:space="preserve">4.1a — Required Stripe Webhook Events to Subscribe To</w:t>
+        <w:t xml:space="preserve">Required Stripe Webhook Events to Subscribe To:</w:t>
       </w:r>
     </w:p>
     <w:p>
@@ -14018,7 +13708,7 @@
           <w:sz w:val="26"/>
           <w:szCs w:val="26"/>
         </w:rPr>
-        <w:t xml:space="preserve">4.2 Supabase — Cloud Storage for KYC Files</w:t>
+        <w:t xml:space="preserve">4.2 Railway — Backend Hosting &amp; Database</w:t>
       </w:r>
     </w:p>
     <w:p>
@@ -14034,7 +13724,74 @@
           <w:sz w:val="20"/>
           <w:szCs w:val="20"/>
         </w:rPr>
-        <w:t xml:space="preserve">KYC documents (National ID, Passport, Selfie photos) are stored in Supabase Storage — NOT on the server disk. This is required for production.</w:t>
+        <w:t xml:space="preserve">Railway hosts the entire backend application (API server + PostgreSQL database). It is where the server runs 24/7.</w:t>
+      </w:r>
+    </w:p>
+    <w:p>
+      <w:r>
+        <w:t xml:space="preserve"/>
+      </w:r>
+    </w:p>
+    <w:p>
+      <w:pPr>
+        <w:pBdr>
+          <w:top w:val="single" w:color="1B3A5C" w:sz="4" w:space="1"/>
+          <w:bottom w:val="single" w:color="1B3A5C" w:sz="4" w:space="1"/>
+          <w:left w:val="single" w:color="1B3A5C" w:sz="8" w:space="1"/>
+          <w:right w:val="single" w:color="1B3A5C" w:sz="4" w:space="1"/>
+        </w:pBdr>
+        <w:shd w:fill="E8F0FE" w:val="clear"/>
+        <w:spacing w:after="120" w:before="120"/>
+        <w:ind w:left="240" w:right="240"/>
+      </w:pPr>
+      <w:r>
+        <w:rPr>
+          <w:rFonts w:ascii="Arial" w:cs="Arial" w:eastAsia="Arial" w:hAnsi="Arial"/>
+          <w:b/>
+          <w:bCs/>
+          <w:color w:val="1B3A5C"/>
+          <w:sz w:val="20"/>
+          <w:szCs w:val="20"/>
+        </w:rPr>
+        <w:t xml:space="preserve">Railway Dashboard (direct link): https://railway.app/dashboard</w:t>
+      </w:r>
+    </w:p>
+    <w:p>
+      <w:r>
+        <w:t xml:space="preserve"/>
+      </w:r>
+    </w:p>
+    <w:p>
+      <w:pPr>
+        <w:pStyle w:val="Heading3"/>
+        <w:spacing w:after="120" w:before="200"/>
+      </w:pPr>
+      <w:r>
+        <w:rPr>
+          <w:rFonts w:ascii="Arial" w:cs="Arial" w:eastAsia="Arial" w:hAnsi="Arial"/>
+          <w:b/>
+          <w:bCs/>
+          <w:color w:val="1B3A5C"/>
+          <w:sz w:val="22"/>
+          <w:szCs w:val="22"/>
+        </w:rPr>
+        <w:t xml:space="preserve">How the Client Logs In to Railway (Simple Steps)</w:t>
+      </w:r>
+    </w:p>
+    <w:p>
+      <w:pPr>
+        <w:spacing w:after="60" w:before="60"/>
+      </w:pPr>
+      <w:r>
+        <w:rPr>
+          <w:rFonts w:ascii="Arial" w:cs="Arial" w:eastAsia="Arial" w:hAnsi="Arial"/>
+          <w:b w:val="false"/>
+          <w:bCs w:val="false"/>
+          <w:color w:val="222222"/>
+          <w:sz w:val="20"/>
+          <w:szCs w:val="20"/>
+        </w:rPr>
+        <w:t xml:space="preserve">The client has their own Railway account. Here is exactly how to access the dashboard — no technical knowledge needed:</w:t>
       </w:r>
     </w:p>
     <w:p>
@@ -14123,7 +13880,7 @@
                 <w:sz w:val="19"/>
                 <w:szCs w:val="19"/>
               </w:rPr>
-              <w:t xml:space="preserve">Action Required</w:t>
+              <w:t xml:space="preserve">What to Do</w:t>
             </w:r>
           </w:p>
         </w:tc>
@@ -14158,7 +13915,7 @@
                 <w:sz w:val="19"/>
                 <w:szCs w:val="19"/>
               </w:rPr>
-              <w:t xml:space="preserve">1 — Create Supabase Account</w:t>
+              <w:t xml:space="preserve">1 — Open Railway</w:t>
             </w:r>
           </w:p>
         </w:tc>
@@ -14191,7 +13948,7 @@
                 <w:sz w:val="19"/>
                 <w:szCs w:val="19"/>
               </w:rPr>
-              <w:t xml:space="preserve">Go to supabase.com and create a free account</w:t>
+              <w:t xml:space="preserve">Go to: railway.app in any browser</w:t>
             </w:r>
           </w:p>
         </w:tc>
@@ -14227,7 +13984,7 @@
                 <w:sz w:val="19"/>
                 <w:szCs w:val="19"/>
               </w:rPr>
-              <w:t xml:space="preserve">2 — Create New Project</w:t>
+              <w:t xml:space="preserve">2 — Click Login</w:t>
             </w:r>
           </w:p>
         </w:tc>
@@ -14261,7 +14018,7 @@
                 <w:sz w:val="19"/>
                 <w:szCs w:val="19"/>
               </w:rPr>
-              <w:t xml:space="preserve">Create a new project (any name, e.g., 'marketplace-kyc'). Select a region close to Romania (Frankfurt or London).</w:t>
+              <w:t xml:space="preserve">Click the Login button on the Railway homepage</w:t>
             </w:r>
           </w:p>
         </w:tc>
@@ -14296,7 +14053,7 @@
                 <w:sz w:val="19"/>
                 <w:szCs w:val="19"/>
               </w:rPr>
-              <w:t xml:space="preserve">3 — Create Storage Bucket</w:t>
+              <w:t xml:space="preserve">3 — Enter Your Email</w:t>
             </w:r>
           </w:p>
         </w:tc>
@@ -14329,7 +14086,7 @@
                 <w:sz w:val="19"/>
                 <w:szCs w:val="19"/>
               </w:rPr>
-              <w:t xml:space="preserve">In Supabase → Storage → Create bucket. Name it: kyc-documents. Set to private (not public).</w:t>
+              <w:t xml:space="preserve">Type the email address linked to your Railway account and click Continue</w:t>
             </w:r>
           </w:p>
         </w:tc>
@@ -14365,7 +14122,7 @@
                 <w:sz w:val="19"/>
                 <w:szCs w:val="19"/>
               </w:rPr>
-              <w:t xml:space="preserve">4 — Get Project URL</w:t>
+              <w:t xml:space="preserve">4 — Check Your Email</w:t>
             </w:r>
           </w:p>
         </w:tc>
@@ -14399,7 +14156,7 @@
                 <w:sz w:val="19"/>
                 <w:szCs w:val="19"/>
               </w:rPr>
-              <w:t xml:space="preserve">Project Settings → API → copy the Project URL → set as SUPABASE_URL</w:t>
+              <w:t xml:space="preserve">Railway sends a 6-digit verification code to your email inbox. Open your email now.</w:t>
             </w:r>
           </w:p>
         </w:tc>
@@ -14434,7 +14191,7 @@
                 <w:sz w:val="19"/>
                 <w:szCs w:val="19"/>
               </w:rPr>
-              <w:t xml:space="preserve">5 — Get Service Role Key</w:t>
+              <w:t xml:space="preserve">5 — Enter the Code</w:t>
             </w:r>
           </w:p>
         </w:tc>
@@ -14467,12 +14224,1516 @@
                 <w:sz w:val="19"/>
                 <w:szCs w:val="19"/>
               </w:rPr>
-              <w:t xml:space="preserve">Project Settings → API → copy service_role key → set as SUPABASE_SERVICE_ROLE_KEY. Keep this secret.</w:t>
+              <w:t xml:space="preserve">Type the 6-digit code from the email into Railway and press Confirm</w:t>
+            </w:r>
+          </w:p>
+        </w:tc>
+      </w:tr>
+      <w:tr>
+        <w:tc>
+          <w:tcPr>
+            <w:tcW w:type="dxa" w:w="2500"/>
+            <w:tcBorders>
+              <w:top w:val="single" w:color="CCCCCC" w:sz="1"/>
+              <w:left w:val="single" w:color="CCCCCC" w:sz="1"/>
+              <w:bottom w:val="single" w:color="CCCCCC" w:sz="1"/>
+              <w:right w:val="single" w:color="CCCCCC" w:sz="1"/>
+            </w:tcBorders>
+            <w:shd w:fill="F0F4F8" w:val="clear"/>
+            <w:tcMar>
+              <w:top w:type="dxa" w:w="80"/>
+              <w:left w:type="dxa" w:w="120"/>
+              <w:bottom w:type="dxa" w:w="80"/>
+              <w:right w:type="dxa" w:w="120"/>
+            </w:tcMar>
+          </w:tcPr>
+          <w:p>
+            <w:pPr>
+              <w:jc w:val="left"/>
+            </w:pPr>
+            <w:r>
+              <w:rPr>
+                <w:rFonts w:ascii="Arial" w:cs="Arial" w:eastAsia="Arial" w:hAnsi="Arial"/>
+                <w:b w:val="false"/>
+                <w:bCs w:val="false"/>
+                <w:color w:val="222222"/>
+                <w:sz w:val="19"/>
+                <w:szCs w:val="19"/>
+              </w:rPr>
+              <w:t xml:space="preserve">6 — You Are In</w:t>
+            </w:r>
+          </w:p>
+        </w:tc>
+        <w:tc>
+          <w:tcPr>
+            <w:tcW w:type="dxa" w:w="6860"/>
+            <w:tcBorders>
+              <w:top w:val="single" w:color="CCCCCC" w:sz="1"/>
+              <w:left w:val="single" w:color="CCCCCC" w:sz="1"/>
+              <w:bottom w:val="single" w:color="CCCCCC" w:sz="1"/>
+              <w:right w:val="single" w:color="CCCCCC" w:sz="1"/>
+            </w:tcBorders>
+            <w:shd w:fill="F0F4F8" w:val="clear"/>
+            <w:tcMar>
+              <w:top w:type="dxa" w:w="80"/>
+              <w:left w:type="dxa" w:w="120"/>
+              <w:bottom w:type="dxa" w:w="80"/>
+              <w:right w:type="dxa" w:w="120"/>
+            </w:tcMar>
+          </w:tcPr>
+          <w:p>
+            <w:pPr>
+              <w:jc w:val="left"/>
+            </w:pPr>
+            <w:r>
+              <w:rPr>
+                <w:rFonts w:ascii="Arial" w:cs="Arial" w:eastAsia="Arial" w:hAnsi="Arial"/>
+                <w:b w:val="false"/>
+                <w:bCs w:val="false"/>
+                <w:color w:val="222222"/>
+                <w:sz w:val="19"/>
+                <w:szCs w:val="19"/>
+              </w:rPr>
+              <w:t xml:space="preserve">You will see your project dashboard. Click the project name to view logs, metrics, deployments, and costs.</w:t>
             </w:r>
           </w:p>
         </w:tc>
       </w:tr>
     </w:tbl>
+    <w:p>
+      <w:r>
+        <w:t xml:space="preserve"/>
+      </w:r>
+    </w:p>
+    <w:p>
+      <w:pPr>
+        <w:pBdr>
+          <w:top w:val="single" w:color="2E5E8A" w:sz="4" w:space="1"/>
+          <w:bottom w:val="single" w:color="2E5E8A" w:sz="4" w:space="1"/>
+          <w:left w:val="single" w:color="2E5E8A" w:sz="8" w:space="1"/>
+          <w:right w:val="single" w:color="2E5E8A" w:sz="4" w:space="1"/>
+        </w:pBdr>
+        <w:shd w:fill="E8F0FE" w:val="clear"/>
+        <w:spacing w:after="120" w:before="120"/>
+        <w:ind w:left="240" w:right="240"/>
+      </w:pPr>
+      <w:r>
+        <w:rPr>
+          <w:rFonts w:ascii="Arial" w:cs="Arial" w:eastAsia="Arial" w:hAnsi="Arial"/>
+          <w:b/>
+          <w:bCs/>
+          <w:color w:val="2E5E8A"/>
+          <w:sz w:val="20"/>
+          <w:szCs w:val="20"/>
+        </w:rPr>
+        <w:t xml:space="preserve">Railway uses email-based login codes — no password needed. Every time you log in, a new 6-digit code is sent to your email inbox. This is a security feature — only the person who can access your email can log in to Railway.</w:t>
+      </w:r>
+    </w:p>
+    <w:p>
+      <w:r>
+        <w:t xml:space="preserve"/>
+      </w:r>
+    </w:p>
+    <w:p>
+      <w:pPr>
+        <w:pStyle w:val="Heading3"/>
+        <w:spacing w:after="120" w:before="200"/>
+      </w:pPr>
+      <w:r>
+        <w:rPr>
+          <w:rFonts w:ascii="Arial" w:cs="Arial" w:eastAsia="Arial" w:hAnsi="Arial"/>
+          <w:b/>
+          <w:bCs/>
+          <w:color w:val="1B3A5C"/>
+          <w:sz w:val="22"/>
+          <w:szCs w:val="22"/>
+        </w:rPr>
+        <w:t xml:space="preserve">How to Give Client Access to the Existing Project (if needed)</w:t>
+      </w:r>
+    </w:p>
+    <w:p>
+      <w:pPr>
+        <w:spacing w:after="60" w:before="60"/>
+      </w:pPr>
+      <w:r>
+        <w:rPr>
+          <w:rFonts w:ascii="Arial" w:cs="Arial" w:eastAsia="Arial" w:hAnsi="Arial"/>
+          <w:b w:val="false"/>
+          <w:bCs w:val="false"/>
+          <w:color w:val="222222"/>
+          <w:sz w:val="20"/>
+          <w:szCs w:val="20"/>
+        </w:rPr>
+        <w:t xml:space="preserve">If the project is under the Monjez Agency account and the client needs access:</w:t>
+      </w:r>
+    </w:p>
+    <w:p>
+      <w:r>
+        <w:t xml:space="preserve"/>
+      </w:r>
+    </w:p>
+    <w:tbl>
+      <w:tblPr>
+        <w:tblW w:type="dxa" w:w="9360"/>
+        <w:tblBorders>
+          <w:top w:val="single" w:color="auto" w:sz="4"/>
+          <w:left w:val="single" w:color="auto" w:sz="4"/>
+          <w:bottom w:val="single" w:color="auto" w:sz="4"/>
+          <w:right w:val="single" w:color="auto" w:sz="4"/>
+          <w:insideH w:val="single" w:color="auto" w:sz="4"/>
+          <w:insideV w:val="single" w:color="auto" w:sz="4"/>
+        </w:tblBorders>
+      </w:tblPr>
+      <w:tblGrid>
+        <w:gridCol w:w="2500"/>
+        <w:gridCol w:w="6860"/>
+      </w:tblGrid>
+      <w:tr>
+        <w:tc>
+          <w:tcPr>
+            <w:tcW w:type="dxa" w:w="2500"/>
+            <w:tcBorders>
+              <w:top w:val="single" w:color="CCCCCC" w:sz="1"/>
+              <w:left w:val="single" w:color="CCCCCC" w:sz="1"/>
+              <w:bottom w:val="single" w:color="CCCCCC" w:sz="1"/>
+              <w:right w:val="single" w:color="CCCCCC" w:sz="1"/>
+            </w:tcBorders>
+            <w:shd w:fill="1B3A5C" w:val="clear"/>
+            <w:tcMar>
+              <w:top w:type="dxa" w:w="80"/>
+              <w:left w:type="dxa" w:w="120"/>
+              <w:bottom w:type="dxa" w:w="80"/>
+              <w:right w:type="dxa" w:w="120"/>
+            </w:tcMar>
+          </w:tcPr>
+          <w:p>
+            <w:pPr>
+              <w:jc w:val="left"/>
+            </w:pPr>
+            <w:r>
+              <w:rPr>
+                <w:rFonts w:ascii="Arial" w:cs="Arial" w:eastAsia="Arial" w:hAnsi="Arial"/>
+                <w:b/>
+                <w:bCs/>
+                <w:color w:val="FFFFFF"/>
+                <w:sz w:val="19"/>
+                <w:szCs w:val="19"/>
+              </w:rPr>
+              <w:t xml:space="preserve">Step</w:t>
+            </w:r>
+          </w:p>
+        </w:tc>
+        <w:tc>
+          <w:tcPr>
+            <w:tcW w:type="dxa" w:w="6860"/>
+            <w:tcBorders>
+              <w:top w:val="single" w:color="CCCCCC" w:sz="1"/>
+              <w:left w:val="single" w:color="CCCCCC" w:sz="1"/>
+              <w:bottom w:val="single" w:color="CCCCCC" w:sz="1"/>
+              <w:right w:val="single" w:color="CCCCCC" w:sz="1"/>
+            </w:tcBorders>
+            <w:shd w:fill="1B3A5C" w:val="clear"/>
+            <w:tcMar>
+              <w:top w:type="dxa" w:w="80"/>
+              <w:left w:type="dxa" w:w="120"/>
+              <w:bottom w:type="dxa" w:w="80"/>
+              <w:right w:type="dxa" w:w="120"/>
+            </w:tcMar>
+          </w:tcPr>
+          <w:p>
+            <w:pPr>
+              <w:jc w:val="left"/>
+            </w:pPr>
+            <w:r>
+              <w:rPr>
+                <w:rFonts w:ascii="Arial" w:cs="Arial" w:eastAsia="Arial" w:hAnsi="Arial"/>
+                <w:b/>
+                <w:bCs/>
+                <w:color w:val="FFFFFF"/>
+                <w:sz w:val="19"/>
+                <w:szCs w:val="19"/>
+              </w:rPr>
+              <w:t xml:space="preserve">Action</w:t>
+            </w:r>
+          </w:p>
+        </w:tc>
+      </w:tr>
+      <w:tr>
+        <w:tc>
+          <w:tcPr>
+            <w:tcW w:type="dxa" w:w="2500"/>
+            <w:tcBorders>
+              <w:top w:val="single" w:color="CCCCCC" w:sz="1"/>
+              <w:left w:val="single" w:color="CCCCCC" w:sz="1"/>
+              <w:bottom w:val="single" w:color="CCCCCC" w:sz="1"/>
+              <w:right w:val="single" w:color="CCCCCC" w:sz="1"/>
+            </w:tcBorders>
+            <w:tcMar>
+              <w:top w:type="dxa" w:w="80"/>
+              <w:left w:type="dxa" w:w="120"/>
+              <w:bottom w:type="dxa" w:w="80"/>
+              <w:right w:type="dxa" w:w="120"/>
+            </w:tcMar>
+          </w:tcPr>
+          <w:p>
+            <w:pPr>
+              <w:jc w:val="left"/>
+            </w:pPr>
+            <w:r>
+              <w:rPr>
+                <w:rFonts w:ascii="Arial" w:cs="Arial" w:eastAsia="Arial" w:hAnsi="Arial"/>
+                <w:b w:val="false"/>
+                <w:bCs w:val="false"/>
+                <w:color w:val="222222"/>
+                <w:sz w:val="19"/>
+                <w:szCs w:val="19"/>
+              </w:rPr>
+              <w:t xml:space="preserve">1 — Open Railway Dashboard</w:t>
+            </w:r>
+          </w:p>
+        </w:tc>
+        <w:tc>
+          <w:tcPr>
+            <w:tcW w:type="dxa" w:w="6860"/>
+            <w:tcBorders>
+              <w:top w:val="single" w:color="CCCCCC" w:sz="1"/>
+              <w:left w:val="single" w:color="CCCCCC" w:sz="1"/>
+              <w:bottom w:val="single" w:color="CCCCCC" w:sz="1"/>
+              <w:right w:val="single" w:color="CCCCCC" w:sz="1"/>
+            </w:tcBorders>
+            <w:tcMar>
+              <w:top w:type="dxa" w:w="80"/>
+              <w:left w:type="dxa" w:w="120"/>
+              <w:bottom w:type="dxa" w:w="80"/>
+              <w:right w:type="dxa" w:w="120"/>
+            </w:tcMar>
+          </w:tcPr>
+          <w:p>
+            <w:pPr>
+              <w:jc w:val="left"/>
+            </w:pPr>
+            <w:r>
+              <w:rPr>
+                <w:rFonts w:ascii="Arial" w:cs="Arial" w:eastAsia="Arial" w:hAnsi="Arial"/>
+                <w:b w:val="false"/>
+                <w:bCs w:val="false"/>
+                <w:color w:val="222222"/>
+                <w:sz w:val="19"/>
+                <w:szCs w:val="19"/>
+              </w:rPr>
+              <w:t xml:space="preserve">Log in to railway.app/dashboard and open the project</w:t>
+            </w:r>
+          </w:p>
+        </w:tc>
+      </w:tr>
+      <w:tr>
+        <w:tc>
+          <w:tcPr>
+            <w:tcW w:type="dxa" w:w="2500"/>
+            <w:tcBorders>
+              <w:top w:val="single" w:color="CCCCCC" w:sz="1"/>
+              <w:left w:val="single" w:color="CCCCCC" w:sz="1"/>
+              <w:bottom w:val="single" w:color="CCCCCC" w:sz="1"/>
+              <w:right w:val="single" w:color="CCCCCC" w:sz="1"/>
+            </w:tcBorders>
+            <w:shd w:fill="F0F4F8" w:val="clear"/>
+            <w:tcMar>
+              <w:top w:type="dxa" w:w="80"/>
+              <w:left w:type="dxa" w:w="120"/>
+              <w:bottom w:type="dxa" w:w="80"/>
+              <w:right w:type="dxa" w:w="120"/>
+            </w:tcMar>
+          </w:tcPr>
+          <w:p>
+            <w:pPr>
+              <w:jc w:val="left"/>
+            </w:pPr>
+            <w:r>
+              <w:rPr>
+                <w:rFonts w:ascii="Arial" w:cs="Arial" w:eastAsia="Arial" w:hAnsi="Arial"/>
+                <w:b w:val="false"/>
+                <w:bCs w:val="false"/>
+                <w:color w:val="222222"/>
+                <w:sz w:val="19"/>
+                <w:szCs w:val="19"/>
+              </w:rPr>
+              <w:t xml:space="preserve">2 — Go to Settings → People</w:t>
+            </w:r>
+          </w:p>
+        </w:tc>
+        <w:tc>
+          <w:tcPr>
+            <w:tcW w:type="dxa" w:w="6860"/>
+            <w:tcBorders>
+              <w:top w:val="single" w:color="CCCCCC" w:sz="1"/>
+              <w:left w:val="single" w:color="CCCCCC" w:sz="1"/>
+              <w:bottom w:val="single" w:color="CCCCCC" w:sz="1"/>
+              <w:right w:val="single" w:color="CCCCCC" w:sz="1"/>
+            </w:tcBorders>
+            <w:shd w:fill="F0F4F8" w:val="clear"/>
+            <w:tcMar>
+              <w:top w:type="dxa" w:w="80"/>
+              <w:left w:type="dxa" w:w="120"/>
+              <w:bottom w:type="dxa" w:w="80"/>
+              <w:right w:type="dxa" w:w="120"/>
+            </w:tcMar>
+          </w:tcPr>
+          <w:p>
+            <w:pPr>
+              <w:jc w:val="left"/>
+            </w:pPr>
+            <w:r>
+              <w:rPr>
+                <w:rFonts w:ascii="Arial" w:cs="Arial" w:eastAsia="Arial" w:hAnsi="Arial"/>
+                <w:b w:val="false"/>
+                <w:bCs w:val="false"/>
+                <w:color w:val="222222"/>
+                <w:sz w:val="19"/>
+                <w:szCs w:val="19"/>
+              </w:rPr>
+              <w:t xml:space="preserve">Click the project name → Settings → Members</w:t>
+            </w:r>
+          </w:p>
+        </w:tc>
+      </w:tr>
+      <w:tr>
+        <w:tc>
+          <w:tcPr>
+            <w:tcW w:type="dxa" w:w="2500"/>
+            <w:tcBorders>
+              <w:top w:val="single" w:color="CCCCCC" w:sz="1"/>
+              <w:left w:val="single" w:color="CCCCCC" w:sz="1"/>
+              <w:bottom w:val="single" w:color="CCCCCC" w:sz="1"/>
+              <w:right w:val="single" w:color="CCCCCC" w:sz="1"/>
+            </w:tcBorders>
+            <w:tcMar>
+              <w:top w:type="dxa" w:w="80"/>
+              <w:left w:type="dxa" w:w="120"/>
+              <w:bottom w:type="dxa" w:w="80"/>
+              <w:right w:type="dxa" w:w="120"/>
+            </w:tcMar>
+          </w:tcPr>
+          <w:p>
+            <w:pPr>
+              <w:jc w:val="left"/>
+            </w:pPr>
+            <w:r>
+              <w:rPr>
+                <w:rFonts w:ascii="Arial" w:cs="Arial" w:eastAsia="Arial" w:hAnsi="Arial"/>
+                <w:b w:val="false"/>
+                <w:bCs w:val="false"/>
+                <w:color w:val="222222"/>
+                <w:sz w:val="19"/>
+                <w:szCs w:val="19"/>
+              </w:rPr>
+              <w:t xml:space="preserve">3 — Click Invite Member</w:t>
+            </w:r>
+          </w:p>
+        </w:tc>
+        <w:tc>
+          <w:tcPr>
+            <w:tcW w:type="dxa" w:w="6860"/>
+            <w:tcBorders>
+              <w:top w:val="single" w:color="CCCCCC" w:sz="1"/>
+              <w:left w:val="single" w:color="CCCCCC" w:sz="1"/>
+              <w:bottom w:val="single" w:color="CCCCCC" w:sz="1"/>
+              <w:right w:val="single" w:color="CCCCCC" w:sz="1"/>
+            </w:tcBorders>
+            <w:tcMar>
+              <w:top w:type="dxa" w:w="80"/>
+              <w:left w:type="dxa" w:w="120"/>
+              <w:bottom w:type="dxa" w:w="80"/>
+              <w:right w:type="dxa" w:w="120"/>
+            </w:tcMar>
+          </w:tcPr>
+          <w:p>
+            <w:pPr>
+              <w:jc w:val="left"/>
+            </w:pPr>
+            <w:r>
+              <w:rPr>
+                <w:rFonts w:ascii="Arial" w:cs="Arial" w:eastAsia="Arial" w:hAnsi="Arial"/>
+                <w:b w:val="false"/>
+                <w:bCs w:val="false"/>
+                <w:color w:val="222222"/>
+                <w:sz w:val="19"/>
+                <w:szCs w:val="19"/>
+              </w:rPr>
+              <w:t xml:space="preserve">Enter the client email: Info@atlantisfmcg.com</w:t>
+            </w:r>
+          </w:p>
+        </w:tc>
+      </w:tr>
+      <w:tr>
+        <w:tc>
+          <w:tcPr>
+            <w:tcW w:type="dxa" w:w="2500"/>
+            <w:tcBorders>
+              <w:top w:val="single" w:color="CCCCCC" w:sz="1"/>
+              <w:left w:val="single" w:color="CCCCCC" w:sz="1"/>
+              <w:bottom w:val="single" w:color="CCCCCC" w:sz="1"/>
+              <w:right w:val="single" w:color="CCCCCC" w:sz="1"/>
+            </w:tcBorders>
+            <w:shd w:fill="F0F4F8" w:val="clear"/>
+            <w:tcMar>
+              <w:top w:type="dxa" w:w="80"/>
+              <w:left w:type="dxa" w:w="120"/>
+              <w:bottom w:type="dxa" w:w="80"/>
+              <w:right w:type="dxa" w:w="120"/>
+            </w:tcMar>
+          </w:tcPr>
+          <w:p>
+            <w:pPr>
+              <w:jc w:val="left"/>
+            </w:pPr>
+            <w:r>
+              <w:rPr>
+                <w:rFonts w:ascii="Arial" w:cs="Arial" w:eastAsia="Arial" w:hAnsi="Arial"/>
+                <w:b w:val="false"/>
+                <w:bCs w:val="false"/>
+                <w:color w:val="222222"/>
+                <w:sz w:val="19"/>
+                <w:szCs w:val="19"/>
+              </w:rPr>
+              <w:t xml:space="preserve">4 — Choose Role</w:t>
+            </w:r>
+          </w:p>
+        </w:tc>
+        <w:tc>
+          <w:tcPr>
+            <w:tcW w:type="dxa" w:w="6860"/>
+            <w:tcBorders>
+              <w:top w:val="single" w:color="CCCCCC" w:sz="1"/>
+              <w:left w:val="single" w:color="CCCCCC" w:sz="1"/>
+              <w:bottom w:val="single" w:color="CCCCCC" w:sz="1"/>
+              <w:right w:val="single" w:color="CCCCCC" w:sz="1"/>
+            </w:tcBorders>
+            <w:shd w:fill="F0F4F8" w:val="clear"/>
+            <w:tcMar>
+              <w:top w:type="dxa" w:w="80"/>
+              <w:left w:type="dxa" w:w="120"/>
+              <w:bottom w:type="dxa" w:w="80"/>
+              <w:right w:type="dxa" w:w="120"/>
+            </w:tcMar>
+          </w:tcPr>
+          <w:p>
+            <w:pPr>
+              <w:jc w:val="left"/>
+            </w:pPr>
+            <w:r>
+              <w:rPr>
+                <w:rFonts w:ascii="Arial" w:cs="Arial" w:eastAsia="Arial" w:hAnsi="Arial"/>
+                <w:b w:val="false"/>
+                <w:bCs w:val="false"/>
+                <w:color w:val="222222"/>
+                <w:sz w:val="19"/>
+                <w:szCs w:val="19"/>
+              </w:rPr>
+              <w:t xml:space="preserve">Select Member (can view logs and metrics) or Admin (full control)</w:t>
+            </w:r>
+          </w:p>
+        </w:tc>
+      </w:tr>
+      <w:tr>
+        <w:tc>
+          <w:tcPr>
+            <w:tcW w:type="dxa" w:w="2500"/>
+            <w:tcBorders>
+              <w:top w:val="single" w:color="CCCCCC" w:sz="1"/>
+              <w:left w:val="single" w:color="CCCCCC" w:sz="1"/>
+              <w:bottom w:val="single" w:color="CCCCCC" w:sz="1"/>
+              <w:right w:val="single" w:color="CCCCCC" w:sz="1"/>
+            </w:tcBorders>
+            <w:tcMar>
+              <w:top w:type="dxa" w:w="80"/>
+              <w:left w:type="dxa" w:w="120"/>
+              <w:bottom w:type="dxa" w:w="80"/>
+              <w:right w:type="dxa" w:w="120"/>
+            </w:tcMar>
+          </w:tcPr>
+          <w:p>
+            <w:pPr>
+              <w:jc w:val="left"/>
+            </w:pPr>
+            <w:r>
+              <w:rPr>
+                <w:rFonts w:ascii="Arial" w:cs="Arial" w:eastAsia="Arial" w:hAnsi="Arial"/>
+                <w:b w:val="false"/>
+                <w:bCs w:val="false"/>
+                <w:color w:val="222222"/>
+                <w:sz w:val="19"/>
+                <w:szCs w:val="19"/>
+              </w:rPr>
+              <w:t xml:space="preserve">5 — Send Invite</w:t>
+            </w:r>
+          </w:p>
+        </w:tc>
+        <w:tc>
+          <w:tcPr>
+            <w:tcW w:type="dxa" w:w="6860"/>
+            <w:tcBorders>
+              <w:top w:val="single" w:color="CCCCCC" w:sz="1"/>
+              <w:left w:val="single" w:color="CCCCCC" w:sz="1"/>
+              <w:bottom w:val="single" w:color="CCCCCC" w:sz="1"/>
+              <w:right w:val="single" w:color="CCCCCC" w:sz="1"/>
+            </w:tcBorders>
+            <w:tcMar>
+              <w:top w:type="dxa" w:w="80"/>
+              <w:left w:type="dxa" w:w="120"/>
+              <w:bottom w:type="dxa" w:w="80"/>
+              <w:right w:type="dxa" w:w="120"/>
+            </w:tcMar>
+          </w:tcPr>
+          <w:p>
+            <w:pPr>
+              <w:jc w:val="left"/>
+            </w:pPr>
+            <w:r>
+              <w:rPr>
+                <w:rFonts w:ascii="Arial" w:cs="Arial" w:eastAsia="Arial" w:hAnsi="Arial"/>
+                <w:b w:val="false"/>
+                <w:bCs w:val="false"/>
+                <w:color w:val="222222"/>
+                <w:sz w:val="19"/>
+                <w:szCs w:val="19"/>
+              </w:rPr>
+              <w:t xml:space="preserve">Click Send. The client will receive an email at Info@atlantisfmcg.com</w:t>
+            </w:r>
+          </w:p>
+        </w:tc>
+      </w:tr>
+      <w:tr>
+        <w:tc>
+          <w:tcPr>
+            <w:tcW w:type="dxa" w:w="2500"/>
+            <w:tcBorders>
+              <w:top w:val="single" w:color="CCCCCC" w:sz="1"/>
+              <w:left w:val="single" w:color="CCCCCC" w:sz="1"/>
+              <w:bottom w:val="single" w:color="CCCCCC" w:sz="1"/>
+              <w:right w:val="single" w:color="CCCCCC" w:sz="1"/>
+            </w:tcBorders>
+            <w:shd w:fill="F0F4F8" w:val="clear"/>
+            <w:tcMar>
+              <w:top w:type="dxa" w:w="80"/>
+              <w:left w:type="dxa" w:w="120"/>
+              <w:bottom w:type="dxa" w:w="80"/>
+              <w:right w:type="dxa" w:w="120"/>
+            </w:tcMar>
+          </w:tcPr>
+          <w:p>
+            <w:pPr>
+              <w:jc w:val="left"/>
+            </w:pPr>
+            <w:r>
+              <w:rPr>
+                <w:rFonts w:ascii="Arial" w:cs="Arial" w:eastAsia="Arial" w:hAnsi="Arial"/>
+                <w:b w:val="false"/>
+                <w:bCs w:val="false"/>
+                <w:color w:val="222222"/>
+                <w:sz w:val="19"/>
+                <w:szCs w:val="19"/>
+              </w:rPr>
+              <w:t xml:space="preserve">6 — Client Accepts</w:t>
+            </w:r>
+          </w:p>
+        </w:tc>
+        <w:tc>
+          <w:tcPr>
+            <w:tcW w:type="dxa" w:w="6860"/>
+            <w:tcBorders>
+              <w:top w:val="single" w:color="CCCCCC" w:sz="1"/>
+              <w:left w:val="single" w:color="CCCCCC" w:sz="1"/>
+              <w:bottom w:val="single" w:color="CCCCCC" w:sz="1"/>
+              <w:right w:val="single" w:color="CCCCCC" w:sz="1"/>
+            </w:tcBorders>
+            <w:shd w:fill="F0F4F8" w:val="clear"/>
+            <w:tcMar>
+              <w:top w:type="dxa" w:w="80"/>
+              <w:left w:type="dxa" w:w="120"/>
+              <w:bottom w:type="dxa" w:w="80"/>
+              <w:right w:type="dxa" w:w="120"/>
+            </w:tcMar>
+          </w:tcPr>
+          <w:p>
+            <w:pPr>
+              <w:jc w:val="left"/>
+            </w:pPr>
+            <w:r>
+              <w:rPr>
+                <w:rFonts w:ascii="Arial" w:cs="Arial" w:eastAsia="Arial" w:hAnsi="Arial"/>
+                <w:b w:val="false"/>
+                <w:bCs w:val="false"/>
+                <w:color w:val="222222"/>
+                <w:sz w:val="19"/>
+                <w:szCs w:val="19"/>
+              </w:rPr>
+              <w:t xml:space="preserve">Client clicks the link in the email → gets a 6-digit code on their email → enters the code → gains access to the project</w:t>
+            </w:r>
+          </w:p>
+        </w:tc>
+      </w:tr>
+      <w:tr>
+        <w:tc>
+          <w:tcPr>
+            <w:tcW w:type="dxa" w:w="2500"/>
+            <w:tcBorders>
+              <w:top w:val="single" w:color="CCCCCC" w:sz="1"/>
+              <w:left w:val="single" w:color="CCCCCC" w:sz="1"/>
+              <w:bottom w:val="single" w:color="CCCCCC" w:sz="1"/>
+              <w:right w:val="single" w:color="CCCCCC" w:sz="1"/>
+            </w:tcBorders>
+            <w:tcMar>
+              <w:top w:type="dxa" w:w="80"/>
+              <w:left w:type="dxa" w:w="120"/>
+              <w:bottom w:type="dxa" w:w="80"/>
+              <w:right w:type="dxa" w:w="120"/>
+            </w:tcMar>
+          </w:tcPr>
+          <w:p>
+            <w:pPr>
+              <w:jc w:val="left"/>
+            </w:pPr>
+            <w:r>
+              <w:rPr>
+                <w:rFonts w:ascii="Arial" w:cs="Arial" w:eastAsia="Arial" w:hAnsi="Arial"/>
+                <w:b w:val="false"/>
+                <w:bCs w:val="false"/>
+                <w:color w:val="222222"/>
+                <w:sz w:val="19"/>
+                <w:szCs w:val="19"/>
+              </w:rPr>
+              <w:t xml:space="preserve">7 — Client Can Now See</w:t>
+            </w:r>
+          </w:p>
+        </w:tc>
+        <w:tc>
+          <w:tcPr>
+            <w:tcW w:type="dxa" w:w="6860"/>
+            <w:tcBorders>
+              <w:top w:val="single" w:color="CCCCCC" w:sz="1"/>
+              <w:left w:val="single" w:color="CCCCCC" w:sz="1"/>
+              <w:bottom w:val="single" w:color="CCCCCC" w:sz="1"/>
+              <w:right w:val="single" w:color="CCCCCC" w:sz="1"/>
+            </w:tcBorders>
+            <w:tcMar>
+              <w:top w:type="dxa" w:w="80"/>
+              <w:left w:type="dxa" w:w="120"/>
+              <w:bottom w:type="dxa" w:w="80"/>
+              <w:right w:type="dxa" w:w="120"/>
+            </w:tcMar>
+          </w:tcPr>
+          <w:p>
+            <w:pPr>
+              <w:jc w:val="left"/>
+            </w:pPr>
+            <w:r>
+              <w:rPr>
+                <w:rFonts w:ascii="Arial" w:cs="Arial" w:eastAsia="Arial" w:hAnsi="Arial"/>
+                <w:b w:val="false"/>
+                <w:bCs w:val="false"/>
+                <w:color w:val="222222"/>
+                <w:sz w:val="19"/>
+                <w:szCs w:val="19"/>
+              </w:rPr>
+              <w:t xml:space="preserve">Project logs, deployments, environment variables, database metrics, and monthly costs</w:t>
+            </w:r>
+          </w:p>
+        </w:tc>
+      </w:tr>
+    </w:tbl>
+    <w:p>
+      <w:r>
+        <w:t xml:space="preserve"/>
+      </w:r>
+    </w:p>
+    <w:p>
+      <w:pPr>
+        <w:pStyle w:val="Heading3"/>
+        <w:spacing w:after="120" w:before="200"/>
+      </w:pPr>
+      <w:r>
+        <w:rPr>
+          <w:rFonts w:ascii="Arial" w:cs="Arial" w:eastAsia="Arial" w:hAnsi="Arial"/>
+          <w:b/>
+          <w:bCs/>
+          <w:color w:val="1B3A5C"/>
+          <w:sz w:val="22"/>
+          <w:szCs w:val="22"/>
+        </w:rPr>
+        <w:t xml:space="preserve">Which Railway Plan to Choose?</w:t>
+      </w:r>
+    </w:p>
+    <w:p>
+      <w:r>
+        <w:t xml:space="preserve"/>
+      </w:r>
+    </w:p>
+    <w:tbl>
+      <w:tblPr>
+        <w:tblW w:type="dxa" w:w="9360"/>
+        <w:tblBorders>
+          <w:top w:val="single" w:color="auto" w:sz="4"/>
+          <w:left w:val="single" w:color="auto" w:sz="4"/>
+          <w:bottom w:val="single" w:color="auto" w:sz="4"/>
+          <w:right w:val="single" w:color="auto" w:sz="4"/>
+          <w:insideH w:val="single" w:color="auto" w:sz="4"/>
+          <w:insideV w:val="single" w:color="auto" w:sz="4"/>
+        </w:tblBorders>
+      </w:tblPr>
+      <w:tblGrid>
+        <w:gridCol w:w="3000"/>
+        <w:gridCol w:w="3000"/>
+        <w:gridCol w:w="3360"/>
+      </w:tblGrid>
+      <w:tr>
+        <w:tc>
+          <w:tcPr>
+            <w:tcW w:type="dxa" w:w="3000"/>
+            <w:tcBorders>
+              <w:top w:val="single" w:color="CCCCCC" w:sz="1"/>
+              <w:left w:val="single" w:color="CCCCCC" w:sz="1"/>
+              <w:bottom w:val="single" w:color="CCCCCC" w:sz="1"/>
+              <w:right w:val="single" w:color="CCCCCC" w:sz="1"/>
+            </w:tcBorders>
+            <w:shd w:fill="1B3A5C" w:val="clear"/>
+            <w:tcMar>
+              <w:top w:type="dxa" w:w="80"/>
+              <w:left w:type="dxa" w:w="120"/>
+              <w:bottom w:type="dxa" w:w="80"/>
+              <w:right w:type="dxa" w:w="120"/>
+            </w:tcMar>
+          </w:tcPr>
+          <w:p>
+            <w:pPr>
+              <w:jc w:val="left"/>
+            </w:pPr>
+            <w:r>
+              <w:rPr>
+                <w:rFonts w:ascii="Arial" w:cs="Arial" w:eastAsia="Arial" w:hAnsi="Arial"/>
+                <w:b/>
+                <w:bCs/>
+                <w:color w:val="FFFFFF"/>
+                <w:sz w:val="19"/>
+                <w:szCs w:val="19"/>
+              </w:rPr>
+              <w:t xml:space="preserve">Feature</w:t>
+            </w:r>
+          </w:p>
+        </w:tc>
+        <w:tc>
+          <w:tcPr>
+            <w:tcW w:type="dxa" w:w="3000"/>
+            <w:tcBorders>
+              <w:top w:val="single" w:color="CCCCCC" w:sz="1"/>
+              <w:left w:val="single" w:color="CCCCCC" w:sz="1"/>
+              <w:bottom w:val="single" w:color="CCCCCC" w:sz="1"/>
+              <w:right w:val="single" w:color="CCCCCC" w:sz="1"/>
+            </w:tcBorders>
+            <w:shd w:fill="1B3A5C" w:val="clear"/>
+            <w:tcMar>
+              <w:top w:type="dxa" w:w="80"/>
+              <w:left w:type="dxa" w:w="120"/>
+              <w:bottom w:type="dxa" w:w="80"/>
+              <w:right w:type="dxa" w:w="120"/>
+            </w:tcMar>
+          </w:tcPr>
+          <w:p>
+            <w:pPr>
+              <w:jc w:val="left"/>
+            </w:pPr>
+            <w:r>
+              <w:rPr>
+                <w:rFonts w:ascii="Arial" w:cs="Arial" w:eastAsia="Arial" w:hAnsi="Arial"/>
+                <w:b/>
+                <w:bCs/>
+                <w:color w:val="FFFFFF"/>
+                <w:sz w:val="19"/>
+                <w:szCs w:val="19"/>
+              </w:rPr>
+              <w:t xml:space="preserve">Hobby — $5/month min</w:t>
+            </w:r>
+          </w:p>
+        </w:tc>
+        <w:tc>
+          <w:tcPr>
+            <w:tcW w:type="dxa" w:w="3360"/>
+            <w:tcBorders>
+              <w:top w:val="single" w:color="CCCCCC" w:sz="1"/>
+              <w:left w:val="single" w:color="CCCCCC" w:sz="1"/>
+              <w:bottom w:val="single" w:color="CCCCCC" w:sz="1"/>
+              <w:right w:val="single" w:color="CCCCCC" w:sz="1"/>
+            </w:tcBorders>
+            <w:shd w:fill="1B3A5C" w:val="clear"/>
+            <w:tcMar>
+              <w:top w:type="dxa" w:w="80"/>
+              <w:left w:type="dxa" w:w="120"/>
+              <w:bottom w:type="dxa" w:w="80"/>
+              <w:right w:type="dxa" w:w="120"/>
+            </w:tcMar>
+          </w:tcPr>
+          <w:p>
+            <w:pPr>
+              <w:jc w:val="left"/>
+            </w:pPr>
+            <w:r>
+              <w:rPr>
+                <w:rFonts w:ascii="Arial" w:cs="Arial" w:eastAsia="Arial" w:hAnsi="Arial"/>
+                <w:b/>
+                <w:bCs/>
+                <w:color w:val="FFFFFF"/>
+                <w:sz w:val="19"/>
+                <w:szCs w:val="19"/>
+              </w:rPr>
+              <w:t xml:space="preserve">Pro — $20/month min ✅ RECOMMENDED</w:t>
+            </w:r>
+          </w:p>
+        </w:tc>
+      </w:tr>
+      <w:tr>
+        <w:tc>
+          <w:tcPr>
+            <w:tcW w:type="dxa" w:w="3000"/>
+            <w:tcBorders>
+              <w:top w:val="single" w:color="CCCCCC" w:sz="1"/>
+              <w:left w:val="single" w:color="CCCCCC" w:sz="1"/>
+              <w:bottom w:val="single" w:color="CCCCCC" w:sz="1"/>
+              <w:right w:val="single" w:color="CCCCCC" w:sz="1"/>
+            </w:tcBorders>
+            <w:shd w:fill="F0F4F8" w:val="clear"/>
+            <w:tcMar>
+              <w:top w:type="dxa" w:w="80"/>
+              <w:left w:type="dxa" w:w="120"/>
+              <w:bottom w:type="dxa" w:w="80"/>
+              <w:right w:type="dxa" w:w="120"/>
+            </w:tcMar>
+          </w:tcPr>
+          <w:p>
+            <w:pPr>
+              <w:jc w:val="left"/>
+            </w:pPr>
+            <w:r>
+              <w:rPr>
+                <w:rFonts w:ascii="Arial" w:cs="Arial" w:eastAsia="Arial" w:hAnsi="Arial"/>
+                <w:b w:val="false"/>
+                <w:bCs w:val="false"/>
+                <w:color w:val="222222"/>
+                <w:sz w:val="19"/>
+                <w:szCs w:val="19"/>
+              </w:rPr>
+              <w:t xml:space="preserve">Workspace seats</w:t>
+            </w:r>
+          </w:p>
+        </w:tc>
+        <w:tc>
+          <w:tcPr>
+            <w:tcW w:type="dxa" w:w="3000"/>
+            <w:tcBorders>
+              <w:top w:val="single" w:color="CCCCCC" w:sz="1"/>
+              <w:left w:val="single" w:color="CCCCCC" w:sz="1"/>
+              <w:bottom w:val="single" w:color="CCCCCC" w:sz="1"/>
+              <w:right w:val="single" w:color="CCCCCC" w:sz="1"/>
+            </w:tcBorders>
+            <w:shd w:fill="F0F4F8" w:val="clear"/>
+            <w:tcMar>
+              <w:top w:type="dxa" w:w="80"/>
+              <w:left w:type="dxa" w:w="120"/>
+              <w:bottom w:type="dxa" w:w="80"/>
+              <w:right w:type="dxa" w:w="120"/>
+            </w:tcMar>
+          </w:tcPr>
+          <w:p>
+            <w:pPr>
+              <w:jc w:val="left"/>
+            </w:pPr>
+            <w:r>
+              <w:rPr>
+                <w:rFonts w:ascii="Arial" w:cs="Arial" w:eastAsia="Arial" w:hAnsi="Arial"/>
+                <w:b w:val="false"/>
+                <w:bCs w:val="false"/>
+                <w:color w:val="222222"/>
+                <w:sz w:val="19"/>
+                <w:szCs w:val="19"/>
+              </w:rPr>
+              <w:t xml:space="preserve">1 developer only</w:t>
+            </w:r>
+          </w:p>
+        </w:tc>
+        <w:tc>
+          <w:tcPr>
+            <w:tcW w:type="dxa" w:w="3360"/>
+            <w:tcBorders>
+              <w:top w:val="single" w:color="CCCCCC" w:sz="1"/>
+              <w:left w:val="single" w:color="CCCCCC" w:sz="1"/>
+              <w:bottom w:val="single" w:color="CCCCCC" w:sz="1"/>
+              <w:right w:val="single" w:color="CCCCCC" w:sz="1"/>
+            </w:tcBorders>
+            <w:shd w:fill="F0F4F8" w:val="clear"/>
+            <w:tcMar>
+              <w:top w:type="dxa" w:w="80"/>
+              <w:left w:type="dxa" w:w="120"/>
+              <w:bottom w:type="dxa" w:w="80"/>
+              <w:right w:type="dxa" w:w="120"/>
+            </w:tcMar>
+          </w:tcPr>
+          <w:p>
+            <w:pPr>
+              <w:jc w:val="left"/>
+            </w:pPr>
+            <w:r>
+              <w:rPr>
+                <w:rFonts w:ascii="Arial" w:cs="Arial" w:eastAsia="Arial" w:hAnsi="Arial"/>
+                <w:b w:val="false"/>
+                <w:bCs w:val="false"/>
+                <w:color w:val="222222"/>
+                <w:sz w:val="19"/>
+                <w:szCs w:val="19"/>
+              </w:rPr>
+              <w:t xml:space="preserve">Unlimited (client + full dev team)</w:t>
+            </w:r>
+          </w:p>
+        </w:tc>
+      </w:tr>
+      <w:tr>
+        <w:tc>
+          <w:tcPr>
+            <w:tcW w:type="dxa" w:w="3000"/>
+            <w:tcBorders>
+              <w:top w:val="single" w:color="CCCCCC" w:sz="1"/>
+              <w:left w:val="single" w:color="CCCCCC" w:sz="1"/>
+              <w:bottom w:val="single" w:color="CCCCCC" w:sz="1"/>
+              <w:right w:val="single" w:color="CCCCCC" w:sz="1"/>
+            </w:tcBorders>
+            <w:tcMar>
+              <w:top w:type="dxa" w:w="80"/>
+              <w:left w:type="dxa" w:w="120"/>
+              <w:bottom w:type="dxa" w:w="80"/>
+              <w:right w:type="dxa" w:w="120"/>
+            </w:tcMar>
+          </w:tcPr>
+          <w:p>
+            <w:pPr>
+              <w:jc w:val="left"/>
+            </w:pPr>
+            <w:r>
+              <w:rPr>
+                <w:rFonts w:ascii="Arial" w:cs="Arial" w:eastAsia="Arial" w:hAnsi="Arial"/>
+                <w:b w:val="false"/>
+                <w:bCs w:val="false"/>
+                <w:color w:val="222222"/>
+                <w:sz w:val="19"/>
+                <w:szCs w:val="19"/>
+              </w:rPr>
+              <w:t xml:space="preserve">Log history</w:t>
+            </w:r>
+          </w:p>
+        </w:tc>
+        <w:tc>
+          <w:tcPr>
+            <w:tcW w:type="dxa" w:w="3000"/>
+            <w:tcBorders>
+              <w:top w:val="single" w:color="CCCCCC" w:sz="1"/>
+              <w:left w:val="single" w:color="CCCCCC" w:sz="1"/>
+              <w:bottom w:val="single" w:color="CCCCCC" w:sz="1"/>
+              <w:right w:val="single" w:color="CCCCCC" w:sz="1"/>
+            </w:tcBorders>
+            <w:tcMar>
+              <w:top w:type="dxa" w:w="80"/>
+              <w:left w:type="dxa" w:w="120"/>
+              <w:bottom w:type="dxa" w:w="80"/>
+              <w:right w:type="dxa" w:w="120"/>
+            </w:tcMar>
+          </w:tcPr>
+          <w:p>
+            <w:pPr>
+              <w:jc w:val="left"/>
+            </w:pPr>
+            <w:r>
+              <w:rPr>
+                <w:rFonts w:ascii="Arial" w:cs="Arial" w:eastAsia="Arial" w:hAnsi="Arial"/>
+                <w:b w:val="false"/>
+                <w:bCs w:val="false"/>
+                <w:color w:val="222222"/>
+                <w:sz w:val="19"/>
+                <w:szCs w:val="19"/>
+              </w:rPr>
+              <w:t xml:space="preserve">7 days</w:t>
+            </w:r>
+          </w:p>
+        </w:tc>
+        <w:tc>
+          <w:tcPr>
+            <w:tcW w:type="dxa" w:w="3360"/>
+            <w:tcBorders>
+              <w:top w:val="single" w:color="CCCCCC" w:sz="1"/>
+              <w:left w:val="single" w:color="CCCCCC" w:sz="1"/>
+              <w:bottom w:val="single" w:color="CCCCCC" w:sz="1"/>
+              <w:right w:val="single" w:color="CCCCCC" w:sz="1"/>
+            </w:tcBorders>
+            <w:tcMar>
+              <w:top w:type="dxa" w:w="80"/>
+              <w:left w:type="dxa" w:w="120"/>
+              <w:bottom w:type="dxa" w:w="80"/>
+              <w:right w:type="dxa" w:w="120"/>
+            </w:tcMar>
+          </w:tcPr>
+          <w:p>
+            <w:pPr>
+              <w:jc w:val="left"/>
+            </w:pPr>
+            <w:r>
+              <w:rPr>
+                <w:rFonts w:ascii="Arial" w:cs="Arial" w:eastAsia="Arial" w:hAnsi="Arial"/>
+                <w:b w:val="false"/>
+                <w:bCs w:val="false"/>
+                <w:color w:val="222222"/>
+                <w:sz w:val="19"/>
+                <w:szCs w:val="19"/>
+              </w:rPr>
+              <w:t xml:space="preserve">30 days (critical for production)</w:t>
+            </w:r>
+          </w:p>
+        </w:tc>
+      </w:tr>
+      <w:tr>
+        <w:tc>
+          <w:tcPr>
+            <w:tcW w:type="dxa" w:w="3000"/>
+            <w:tcBorders>
+              <w:top w:val="single" w:color="CCCCCC" w:sz="1"/>
+              <w:left w:val="single" w:color="CCCCCC" w:sz="1"/>
+              <w:bottom w:val="single" w:color="CCCCCC" w:sz="1"/>
+              <w:right w:val="single" w:color="CCCCCC" w:sz="1"/>
+            </w:tcBorders>
+            <w:shd w:fill="F0F4F8" w:val="clear"/>
+            <w:tcMar>
+              <w:top w:type="dxa" w:w="80"/>
+              <w:left w:type="dxa" w:w="120"/>
+              <w:bottom w:type="dxa" w:w="80"/>
+              <w:right w:type="dxa" w:w="120"/>
+            </w:tcMar>
+          </w:tcPr>
+          <w:p>
+            <w:pPr>
+              <w:jc w:val="left"/>
+            </w:pPr>
+            <w:r>
+              <w:rPr>
+                <w:rFonts w:ascii="Arial" w:cs="Arial" w:eastAsia="Arial" w:hAnsi="Arial"/>
+                <w:b w:val="false"/>
+                <w:bCs w:val="false"/>
+                <w:color w:val="222222"/>
+                <w:sz w:val="19"/>
+                <w:szCs w:val="19"/>
+              </w:rPr>
+              <w:t xml:space="preserve">Support</w:t>
+            </w:r>
+          </w:p>
+        </w:tc>
+        <w:tc>
+          <w:tcPr>
+            <w:tcW w:type="dxa" w:w="3000"/>
+            <w:tcBorders>
+              <w:top w:val="single" w:color="CCCCCC" w:sz="1"/>
+              <w:left w:val="single" w:color="CCCCCC" w:sz="1"/>
+              <w:bottom w:val="single" w:color="CCCCCC" w:sz="1"/>
+              <w:right w:val="single" w:color="CCCCCC" w:sz="1"/>
+            </w:tcBorders>
+            <w:shd w:fill="F0F4F8" w:val="clear"/>
+            <w:tcMar>
+              <w:top w:type="dxa" w:w="80"/>
+              <w:left w:type="dxa" w:w="120"/>
+              <w:bottom w:type="dxa" w:w="80"/>
+              <w:right w:type="dxa" w:w="120"/>
+            </w:tcMar>
+          </w:tcPr>
+          <w:p>
+            <w:pPr>
+              <w:jc w:val="left"/>
+            </w:pPr>
+            <w:r>
+              <w:rPr>
+                <w:rFonts w:ascii="Arial" w:cs="Arial" w:eastAsia="Arial" w:hAnsi="Arial"/>
+                <w:b w:val="false"/>
+                <w:bCs w:val="false"/>
+                <w:color w:val="222222"/>
+                <w:sz w:val="19"/>
+                <w:szCs w:val="19"/>
+              </w:rPr>
+              <w:t xml:space="preserve">Community only</w:t>
+            </w:r>
+          </w:p>
+        </w:tc>
+        <w:tc>
+          <w:tcPr>
+            <w:tcW w:type="dxa" w:w="3360"/>
+            <w:tcBorders>
+              <w:top w:val="single" w:color="CCCCCC" w:sz="1"/>
+              <w:left w:val="single" w:color="CCCCCC" w:sz="1"/>
+              <w:bottom w:val="single" w:color="CCCCCC" w:sz="1"/>
+              <w:right w:val="single" w:color="CCCCCC" w:sz="1"/>
+            </w:tcBorders>
+            <w:shd w:fill="F0F4F8" w:val="clear"/>
+            <w:tcMar>
+              <w:top w:type="dxa" w:w="80"/>
+              <w:left w:type="dxa" w:w="120"/>
+              <w:bottom w:type="dxa" w:w="80"/>
+              <w:right w:type="dxa" w:w="120"/>
+            </w:tcMar>
+          </w:tcPr>
+          <w:p>
+            <w:pPr>
+              <w:jc w:val="left"/>
+            </w:pPr>
+            <w:r>
+              <w:rPr>
+                <w:rFonts w:ascii="Arial" w:cs="Arial" w:eastAsia="Arial" w:hAnsi="Arial"/>
+                <w:b w:val="false"/>
+                <w:bCs w:val="false"/>
+                <w:color w:val="222222"/>
+                <w:sz w:val="19"/>
+                <w:szCs w:val="19"/>
+              </w:rPr>
+              <w:t xml:space="preserve">Railway Support team</w:t>
+            </w:r>
+          </w:p>
+        </w:tc>
+      </w:tr>
+      <w:tr>
+        <w:tc>
+          <w:tcPr>
+            <w:tcW w:type="dxa" w:w="3000"/>
+            <w:tcBorders>
+              <w:top w:val="single" w:color="CCCCCC" w:sz="1"/>
+              <w:left w:val="single" w:color="CCCCCC" w:sz="1"/>
+              <w:bottom w:val="single" w:color="CCCCCC" w:sz="1"/>
+              <w:right w:val="single" w:color="CCCCCC" w:sz="1"/>
+            </w:tcBorders>
+            <w:tcMar>
+              <w:top w:type="dxa" w:w="80"/>
+              <w:left w:type="dxa" w:w="120"/>
+              <w:bottom w:type="dxa" w:w="80"/>
+              <w:right w:type="dxa" w:w="120"/>
+            </w:tcMar>
+          </w:tcPr>
+          <w:p>
+            <w:pPr>
+              <w:jc w:val="left"/>
+            </w:pPr>
+            <w:r>
+              <w:rPr>
+                <w:rFonts w:ascii="Arial" w:cs="Arial" w:eastAsia="Arial" w:hAnsi="Arial"/>
+                <w:b w:val="false"/>
+                <w:bCs w:val="false"/>
+                <w:color w:val="222222"/>
+                <w:sz w:val="19"/>
+                <w:szCs w:val="19"/>
+              </w:rPr>
+              <w:t xml:space="preserve">Max CPU/RAM</w:t>
+            </w:r>
+          </w:p>
+        </w:tc>
+        <w:tc>
+          <w:tcPr>
+            <w:tcW w:type="dxa" w:w="3000"/>
+            <w:tcBorders>
+              <w:top w:val="single" w:color="CCCCCC" w:sz="1"/>
+              <w:left w:val="single" w:color="CCCCCC" w:sz="1"/>
+              <w:bottom w:val="single" w:color="CCCCCC" w:sz="1"/>
+              <w:right w:val="single" w:color="CCCCCC" w:sz="1"/>
+            </w:tcBorders>
+            <w:tcMar>
+              <w:top w:type="dxa" w:w="80"/>
+              <w:left w:type="dxa" w:w="120"/>
+              <w:bottom w:type="dxa" w:w="80"/>
+              <w:right w:type="dxa" w:w="120"/>
+            </w:tcMar>
+          </w:tcPr>
+          <w:p>
+            <w:pPr>
+              <w:jc w:val="left"/>
+            </w:pPr>
+            <w:r>
+              <w:rPr>
+                <w:rFonts w:ascii="Arial" w:cs="Arial" w:eastAsia="Arial" w:hAnsi="Arial"/>
+                <w:b w:val="false"/>
+                <w:bCs w:val="false"/>
+                <w:color w:val="222222"/>
+                <w:sz w:val="19"/>
+                <w:szCs w:val="19"/>
+              </w:rPr>
+              <w:t xml:space="preserve">48 vCPU / 48 GB RAM</w:t>
+            </w:r>
+          </w:p>
+        </w:tc>
+        <w:tc>
+          <w:tcPr>
+            <w:tcW w:type="dxa" w:w="3360"/>
+            <w:tcBorders>
+              <w:top w:val="single" w:color="CCCCCC" w:sz="1"/>
+              <w:left w:val="single" w:color="CCCCCC" w:sz="1"/>
+              <w:bottom w:val="single" w:color="CCCCCC" w:sz="1"/>
+              <w:right w:val="single" w:color="CCCCCC" w:sz="1"/>
+            </w:tcBorders>
+            <w:tcMar>
+              <w:top w:type="dxa" w:w="80"/>
+              <w:left w:type="dxa" w:w="120"/>
+              <w:bottom w:type="dxa" w:w="80"/>
+              <w:right w:type="dxa" w:w="120"/>
+            </w:tcMar>
+          </w:tcPr>
+          <w:p>
+            <w:pPr>
+              <w:jc w:val="left"/>
+            </w:pPr>
+            <w:r>
+              <w:rPr>
+                <w:rFonts w:ascii="Arial" w:cs="Arial" w:eastAsia="Arial" w:hAnsi="Arial"/>
+                <w:b w:val="false"/>
+                <w:bCs w:val="false"/>
+                <w:color w:val="222222"/>
+                <w:sz w:val="19"/>
+                <w:szCs w:val="19"/>
+              </w:rPr>
+              <w:t xml:space="preserve">1,000 vCPU / 1 TB RAM</w:t>
+            </w:r>
+          </w:p>
+        </w:tc>
+      </w:tr>
+      <w:tr>
+        <w:tc>
+          <w:tcPr>
+            <w:tcW w:type="dxa" w:w="3000"/>
+            <w:tcBorders>
+              <w:top w:val="single" w:color="CCCCCC" w:sz="1"/>
+              <w:left w:val="single" w:color="CCCCCC" w:sz="1"/>
+              <w:bottom w:val="single" w:color="CCCCCC" w:sz="1"/>
+              <w:right w:val="single" w:color="CCCCCC" w:sz="1"/>
+            </w:tcBorders>
+            <w:shd w:fill="F0F4F8" w:val="clear"/>
+            <w:tcMar>
+              <w:top w:type="dxa" w:w="80"/>
+              <w:left w:type="dxa" w:w="120"/>
+              <w:bottom w:type="dxa" w:w="80"/>
+              <w:right w:type="dxa" w:w="120"/>
+            </w:tcMar>
+          </w:tcPr>
+          <w:p>
+            <w:pPr>
+              <w:jc w:val="left"/>
+            </w:pPr>
+            <w:r>
+              <w:rPr>
+                <w:rFonts w:ascii="Arial" w:cs="Arial" w:eastAsia="Arial" w:hAnsi="Arial"/>
+                <w:b w:val="false"/>
+                <w:bCs w:val="false"/>
+                <w:color w:val="222222"/>
+                <w:sz w:val="19"/>
+                <w:szCs w:val="19"/>
+              </w:rPr>
+              <w:t xml:space="preserve">Storage</w:t>
+            </w:r>
+          </w:p>
+        </w:tc>
+        <w:tc>
+          <w:tcPr>
+            <w:tcW w:type="dxa" w:w="3000"/>
+            <w:tcBorders>
+              <w:top w:val="single" w:color="CCCCCC" w:sz="1"/>
+              <w:left w:val="single" w:color="CCCCCC" w:sz="1"/>
+              <w:bottom w:val="single" w:color="CCCCCC" w:sz="1"/>
+              <w:right w:val="single" w:color="CCCCCC" w:sz="1"/>
+            </w:tcBorders>
+            <w:shd w:fill="F0F4F8" w:val="clear"/>
+            <w:tcMar>
+              <w:top w:type="dxa" w:w="80"/>
+              <w:left w:type="dxa" w:w="120"/>
+              <w:bottom w:type="dxa" w:w="80"/>
+              <w:right w:type="dxa" w:w="120"/>
+            </w:tcMar>
+          </w:tcPr>
+          <w:p>
+            <w:pPr>
+              <w:jc w:val="left"/>
+            </w:pPr>
+            <w:r>
+              <w:rPr>
+                <w:rFonts w:ascii="Arial" w:cs="Arial" w:eastAsia="Arial" w:hAnsi="Arial"/>
+                <w:b w:val="false"/>
+                <w:bCs w:val="false"/>
+                <w:color w:val="222222"/>
+                <w:sz w:val="19"/>
+                <w:szCs w:val="19"/>
+              </w:rPr>
+              <w:t xml:space="preserve">5 GB</w:t>
+            </w:r>
+          </w:p>
+        </w:tc>
+        <w:tc>
+          <w:tcPr>
+            <w:tcW w:type="dxa" w:w="3360"/>
+            <w:tcBorders>
+              <w:top w:val="single" w:color="CCCCCC" w:sz="1"/>
+              <w:left w:val="single" w:color="CCCCCC" w:sz="1"/>
+              <w:bottom w:val="single" w:color="CCCCCC" w:sz="1"/>
+              <w:right w:val="single" w:color="CCCCCC" w:sz="1"/>
+            </w:tcBorders>
+            <w:shd w:fill="F0F4F8" w:val="clear"/>
+            <w:tcMar>
+              <w:top w:type="dxa" w:w="80"/>
+              <w:left w:type="dxa" w:w="120"/>
+              <w:bottom w:type="dxa" w:w="80"/>
+              <w:right w:type="dxa" w:w="120"/>
+            </w:tcMar>
+          </w:tcPr>
+          <w:p>
+            <w:pPr>
+              <w:jc w:val="left"/>
+            </w:pPr>
+            <w:r>
+              <w:rPr>
+                <w:rFonts w:ascii="Arial" w:cs="Arial" w:eastAsia="Arial" w:hAnsi="Arial"/>
+                <w:b w:val="false"/>
+                <w:bCs w:val="false"/>
+                <w:color w:val="222222"/>
+                <w:sz w:val="19"/>
+                <w:szCs w:val="19"/>
+              </w:rPr>
+              <w:t xml:space="preserve">1 TB</w:t>
+            </w:r>
+          </w:p>
+        </w:tc>
+      </w:tr>
+      <w:tr>
+        <w:tc>
+          <w:tcPr>
+            <w:tcW w:type="dxa" w:w="3000"/>
+            <w:tcBorders>
+              <w:top w:val="single" w:color="CCCCCC" w:sz="1"/>
+              <w:left w:val="single" w:color="CCCCCC" w:sz="1"/>
+              <w:bottom w:val="single" w:color="CCCCCC" w:sz="1"/>
+              <w:right w:val="single" w:color="CCCCCC" w:sz="1"/>
+            </w:tcBorders>
+            <w:tcMar>
+              <w:top w:type="dxa" w:w="80"/>
+              <w:left w:type="dxa" w:w="120"/>
+              <w:bottom w:type="dxa" w:w="80"/>
+              <w:right w:type="dxa" w:w="120"/>
+            </w:tcMar>
+          </w:tcPr>
+          <w:p>
+            <w:pPr>
+              <w:jc w:val="left"/>
+            </w:pPr>
+            <w:r>
+              <w:rPr>
+                <w:rFonts w:ascii="Arial" w:cs="Arial" w:eastAsia="Arial" w:hAnsi="Arial"/>
+                <w:b w:val="false"/>
+                <w:bCs w:val="false"/>
+                <w:color w:val="222222"/>
+                <w:sz w:val="19"/>
+                <w:szCs w:val="19"/>
+              </w:rPr>
+              <w:t xml:space="preserve">Suitable for</w:t>
+            </w:r>
+          </w:p>
+        </w:tc>
+        <w:tc>
+          <w:tcPr>
+            <w:tcW w:type="dxa" w:w="3000"/>
+            <w:tcBorders>
+              <w:top w:val="single" w:color="CCCCCC" w:sz="1"/>
+              <w:left w:val="single" w:color="CCCCCC" w:sz="1"/>
+              <w:bottom w:val="single" w:color="CCCCCC" w:sz="1"/>
+              <w:right w:val="single" w:color="CCCCCC" w:sz="1"/>
+            </w:tcBorders>
+            <w:tcMar>
+              <w:top w:type="dxa" w:w="80"/>
+              <w:left w:type="dxa" w:w="120"/>
+              <w:bottom w:type="dxa" w:w="80"/>
+              <w:right w:type="dxa" w:w="120"/>
+            </w:tcMar>
+          </w:tcPr>
+          <w:p>
+            <w:pPr>
+              <w:jc w:val="left"/>
+            </w:pPr>
+            <w:r>
+              <w:rPr>
+                <w:rFonts w:ascii="Arial" w:cs="Arial" w:eastAsia="Arial" w:hAnsi="Arial"/>
+                <w:b w:val="false"/>
+                <w:bCs w:val="false"/>
+                <w:color w:val="222222"/>
+                <w:sz w:val="19"/>
+                <w:szCs w:val="19"/>
+              </w:rPr>
+              <w:t xml:space="preserve">Side projects / testing</w:t>
+            </w:r>
+          </w:p>
+        </w:tc>
+        <w:tc>
+          <w:tcPr>
+            <w:tcW w:type="dxa" w:w="3360"/>
+            <w:tcBorders>
+              <w:top w:val="single" w:color="CCCCCC" w:sz="1"/>
+              <w:left w:val="single" w:color="CCCCCC" w:sz="1"/>
+              <w:bottom w:val="single" w:color="CCCCCC" w:sz="1"/>
+              <w:right w:val="single" w:color="CCCCCC" w:sz="1"/>
+            </w:tcBorders>
+            <w:tcMar>
+              <w:top w:type="dxa" w:w="80"/>
+              <w:left w:type="dxa" w:w="120"/>
+              <w:bottom w:type="dxa" w:w="80"/>
+              <w:right w:type="dxa" w:w="120"/>
+            </w:tcMar>
+          </w:tcPr>
+          <w:p>
+            <w:pPr>
+              <w:jc w:val="left"/>
+            </w:pPr>
+            <w:r>
+              <w:rPr>
+                <w:rFonts w:ascii="Arial" w:cs="Arial" w:eastAsia="Arial" w:hAnsi="Arial"/>
+                <w:b w:val="false"/>
+                <w:bCs w:val="false"/>
+                <w:color w:val="222222"/>
+                <w:sz w:val="19"/>
+                <w:szCs w:val="19"/>
+              </w:rPr>
+              <w:t xml:space="preserve">Production platforms ✅</w:t>
+            </w:r>
+          </w:p>
+        </w:tc>
+      </w:tr>
+    </w:tbl>
+    <w:p>
+      <w:r>
+        <w:t xml:space="preserve"/>
+      </w:r>
+    </w:p>
+    <w:p>
+      <w:pPr>
+        <w:pBdr>
+          <w:top w:val="single" w:color="1B5E20" w:sz="4" w:space="1"/>
+          <w:bottom w:val="single" w:color="1B5E20" w:sz="4" w:space="1"/>
+          <w:left w:val="single" w:color="1B5E20" w:sz="8" w:space="1"/>
+          <w:right w:val="single" w:color="1B5E20" w:sz="4" w:space="1"/>
+        </w:pBdr>
+        <w:shd w:fill="D6F0DC" w:val="clear"/>
+        <w:spacing w:after="120" w:before="120"/>
+        <w:ind w:left="240" w:right="240"/>
+      </w:pPr>
+      <w:r>
+        <w:rPr>
+          <w:rFonts w:ascii="Arial" w:cs="Arial" w:eastAsia="Arial" w:hAnsi="Arial"/>
+          <w:b/>
+          <w:bCs/>
+          <w:color w:val="1B5E20"/>
+          <w:sz w:val="20"/>
+          <w:szCs w:val="20"/>
+        </w:rPr>
+        <w:t xml:space="preserve">RECOMMENDATION: Choose the Pro plan ($20/month minimum). This is a production platform handling real financial transactions and real customers. The Pro plan gives unlimited workspace seats (so the client, developer, and any team members can all have access), 30-day log history (essential for debugging and financial audits), and Railway Support. The actual monthly cost will be approximately $20–50/month depending on traffic.</w:t>
+      </w:r>
+    </w:p>
     <w:p>
       <w:r>
         <w:t xml:space="preserve"/>
@@ -14492,7 +15753,112 @@
           <w:sz w:val="26"/>
           <w:szCs w:val="26"/>
         </w:rPr>
-        <w:t xml:space="preserve">4.3 Railway — Backend Hosting</w:t>
+        <w:t xml:space="preserve">4.3 GitHub — Project Files &amp; Source Code</w:t>
+      </w:r>
+    </w:p>
+    <w:p>
+      <w:pPr>
+        <w:spacing w:after="60" w:before="60"/>
+      </w:pPr>
+      <w:r>
+        <w:rPr>
+          <w:rFonts w:ascii="Arial" w:cs="Arial" w:eastAsia="Arial" w:hAnsi="Arial"/>
+          <w:b w:val="false"/>
+          <w:bCs w:val="false"/>
+          <w:color w:val="444444"/>
+          <w:sz w:val="20"/>
+          <w:szCs w:val="20"/>
+        </w:rPr>
+        <w:t xml:space="preserve">GitHub is where all the project files (the entire codebase) are stored and version-controlled. Think of it like Google Drive, but specifically designed for software projects.</w:t>
+      </w:r>
+    </w:p>
+    <w:p>
+      <w:r>
+        <w:t xml:space="preserve"/>
+      </w:r>
+    </w:p>
+    <w:p>
+      <w:pPr>
+        <w:pBdr>
+          <w:top w:val="single" w:color="1B3A5C" w:sz="4" w:space="1"/>
+          <w:bottom w:val="single" w:color="1B3A5C" w:sz="4" w:space="1"/>
+          <w:left w:val="single" w:color="1B3A5C" w:sz="8" w:space="1"/>
+          <w:right w:val="single" w:color="1B3A5C" w:sz="4" w:space="1"/>
+        </w:pBdr>
+        <w:shd w:fill="E8F0FE" w:val="clear"/>
+        <w:spacing w:after="120" w:before="120"/>
+        <w:ind w:left="240" w:right="240"/>
+      </w:pPr>
+      <w:r>
+        <w:rPr>
+          <w:rFonts w:ascii="Arial" w:cs="Arial" w:eastAsia="Arial" w:hAnsi="Arial"/>
+          <w:b/>
+          <w:bCs/>
+          <w:color w:val="1B3A5C"/>
+          <w:sz w:val="20"/>
+          <w:szCs w:val="20"/>
+        </w:rPr>
+        <w:t xml:space="preserve">Your project repository link:  https://github.com/MonjezAgency/MarketPlacee</w:t>
+      </w:r>
+    </w:p>
+    <w:p>
+      <w:r>
+        <w:t xml:space="preserve"/>
+      </w:r>
+    </w:p>
+    <w:p>
+      <w:pPr>
+        <w:pStyle w:val="Heading3"/>
+        <w:spacing w:after="120" w:before="200"/>
+      </w:pPr>
+      <w:r>
+        <w:rPr>
+          <w:rFonts w:ascii="Arial" w:cs="Arial" w:eastAsia="Arial" w:hAnsi="Arial"/>
+          <w:b/>
+          <w:bCs/>
+          <w:color w:val="1B3A5C"/>
+          <w:sz w:val="22"/>
+          <w:szCs w:val="22"/>
+        </w:rPr>
+        <w:t xml:space="preserve">What Is GitHub and Why Does It Matter?</w:t>
+      </w:r>
+    </w:p>
+    <w:p>
+      <w:pPr>
+        <w:spacing w:after="60" w:before="60"/>
+      </w:pPr>
+      <w:r>
+        <w:rPr>
+          <w:rFonts w:ascii="Arial" w:cs="Arial" w:eastAsia="Arial" w:hAnsi="Arial"/>
+          <w:b w:val="false"/>
+          <w:bCs w:val="false"/>
+          <w:color w:val="444444"/>
+          <w:sz w:val="20"/>
+          <w:szCs w:val="20"/>
+        </w:rPr>
+        <w:t xml:space="preserve">GitHub stores the complete source code of your platform — every file, every feature, every update that has ever been made. If something needs to be changed, fixed, or improved in the future, any developer in the world can be given access to this repository and start working immediately. You own this code — it belongs to you.</w:t>
+      </w:r>
+    </w:p>
+    <w:p>
+      <w:r>
+        <w:t xml:space="preserve"/>
+      </w:r>
+    </w:p>
+    <w:p>
+      <w:pPr>
+        <w:pStyle w:val="Heading3"/>
+        <w:spacing w:after="120" w:before="200"/>
+      </w:pPr>
+      <w:r>
+        <w:rPr>
+          <w:rFonts w:ascii="Arial" w:cs="Arial" w:eastAsia="Arial" w:hAnsi="Arial"/>
+          <w:b/>
+          <w:bCs/>
+          <w:color w:val="1B3A5C"/>
+          <w:sz w:val="22"/>
+          <w:szCs w:val="22"/>
+        </w:rPr>
+        <w:t xml:space="preserve">How to Access and View Your Project Files</w:t>
       </w:r>
     </w:p>
     <w:tbl>
@@ -14576,7 +15942,7 @@
                 <w:sz w:val="19"/>
                 <w:szCs w:val="19"/>
               </w:rPr>
-              <w:t xml:space="preserve">Action Required</w:t>
+              <w:t xml:space="preserve">What to Do</w:t>
             </w:r>
           </w:p>
         </w:tc>
@@ -14611,7 +15977,7 @@
                 <w:sz w:val="19"/>
                 <w:szCs w:val="19"/>
               </w:rPr>
-              <w:t xml:space="preserve">1 — Create Railway Account</w:t>
+              <w:t xml:space="preserve">1 — Open the link</w:t>
             </w:r>
           </w:p>
         </w:tc>
@@ -14644,7 +16010,7 @@
                 <w:sz w:val="19"/>
                 <w:szCs w:val="19"/>
               </w:rPr>
-              <w:t xml:space="preserve">Go to railway.app and create an account</w:t>
+              <w:t xml:space="preserve">Click or paste this link in your browser:  https://github.com/MonjezAgency/MarketPlacee</w:t>
             </w:r>
           </w:p>
         </w:tc>
@@ -14680,7 +16046,7 @@
                 <w:sz w:val="19"/>
                 <w:szCs w:val="19"/>
               </w:rPr>
-              <w:t xml:space="preserve">2 — Create Project</w:t>
+              <w:t xml:space="preserve">2 — Browse the files</w:t>
             </w:r>
           </w:p>
         </w:tc>
@@ -14714,7 +16080,7 @@
                 <w:sz w:val="19"/>
                 <w:szCs w:val="19"/>
               </w:rPr>
-              <w:t xml:space="preserve">New Project → Deploy from GitHub → connect the repository</w:t>
+              <w:t xml:space="preserve">You will see a list of folders and files. Click any folder to open it and see what is inside. You do not need to understand the code — just know it is all there.</w:t>
             </w:r>
           </w:p>
         </w:tc>
@@ -14749,7 +16115,7 @@
                 <w:sz w:val="19"/>
                 <w:szCs w:val="19"/>
               </w:rPr>
-              <w:t xml:space="preserve">3 — Add PostgreSQL</w:t>
+              <w:t xml:space="preserve">3 — To download everything</w:t>
             </w:r>
           </w:p>
         </w:tc>
@@ -14782,7 +16148,7 @@
                 <w:sz w:val="19"/>
                 <w:szCs w:val="19"/>
               </w:rPr>
-              <w:t xml:space="preserve">In Railway → New Service → Database → Add PostgreSQL. DATABASE_URL will be set automatically.</w:t>
+              <w:t xml:space="preserve">Click the green button that says 'Code' → then click 'Download ZIP'. This downloads a copy of the entire project to your computer.</w:t>
             </w:r>
           </w:p>
         </w:tc>
@@ -14818,7 +16184,7 @@
                 <w:sz w:val="19"/>
                 <w:szCs w:val="19"/>
               </w:rPr>
-              <w:t xml:space="preserve">4 — Set Environment Variables</w:t>
+              <w:t xml:space="preserve">4 — To share with a new developer</w:t>
             </w:r>
           </w:p>
         </w:tc>
@@ -14852,7 +16218,7 @@
                 <w:sz w:val="19"/>
                 <w:szCs w:val="19"/>
               </w:rPr>
-              <w:t xml:space="preserve">Add all variables from Section 3.1 to Railway → Variables tab</w:t>
+              <w:t xml:space="preserve">Go to Settings → Collaborators → Add people → type their GitHub username or email. They will receive an invitation to access the project.</w:t>
             </w:r>
           </w:p>
         </w:tc>
@@ -14887,7 +16253,7 @@
                 <w:sz w:val="19"/>
                 <w:szCs w:val="19"/>
               </w:rPr>
-              <w:t xml:space="preserve">5 — Set Start Command</w:t>
+              <w:t xml:space="preserve">5 — To see the history of changes</w:t>
             </w:r>
           </w:p>
         </w:tc>
@@ -14920,150 +16286,50 @@
                 <w:sz w:val="19"/>
                 <w:szCs w:val="19"/>
               </w:rPr>
-              <w:t xml:space="preserve">In Settings → Deploy → Start command: npm run start:prod</w:t>
-            </w:r>
-          </w:p>
-        </w:tc>
-      </w:tr>
-      <w:tr>
-        <w:tc>
-          <w:tcPr>
-            <w:tcW w:type="dxa" w:w="2500"/>
-            <w:tcBorders>
-              <w:top w:val="single" w:color="CCCCCC" w:sz="1"/>
-              <w:left w:val="single" w:color="CCCCCC" w:sz="1"/>
-              <w:bottom w:val="single" w:color="CCCCCC" w:sz="1"/>
-              <w:right w:val="single" w:color="CCCCCC" w:sz="1"/>
-            </w:tcBorders>
-            <w:shd w:fill="F0F4F8" w:val="clear"/>
-            <w:tcMar>
-              <w:top w:type="dxa" w:w="80"/>
-              <w:left w:type="dxa" w:w="120"/>
-              <w:bottom w:type="dxa" w:w="80"/>
-              <w:right w:type="dxa" w:w="120"/>
-            </w:tcMar>
-          </w:tcPr>
-          <w:p>
-            <w:pPr>
-              <w:jc w:val="left"/>
-            </w:pPr>
-            <w:r>
-              <w:rPr>
-                <w:rFonts w:ascii="Arial" w:cs="Arial" w:eastAsia="Arial" w:hAnsi="Arial"/>
-                <w:b w:val="false"/>
-                <w:bCs w:val="false"/>
-                <w:color w:val="222222"/>
-                <w:sz w:val="19"/>
-                <w:szCs w:val="19"/>
-              </w:rPr>
-              <w:t xml:space="preserve">6 — Run Migrations</w:t>
-            </w:r>
-          </w:p>
-        </w:tc>
-        <w:tc>
-          <w:tcPr>
-            <w:tcW w:type="dxa" w:w="6860"/>
-            <w:tcBorders>
-              <w:top w:val="single" w:color="CCCCCC" w:sz="1"/>
-              <w:left w:val="single" w:color="CCCCCC" w:sz="1"/>
-              <w:bottom w:val="single" w:color="CCCCCC" w:sz="1"/>
-              <w:right w:val="single" w:color="CCCCCC" w:sz="1"/>
-            </w:tcBorders>
-            <w:shd w:fill="F0F4F8" w:val="clear"/>
-            <w:tcMar>
-              <w:top w:type="dxa" w:w="80"/>
-              <w:left w:type="dxa" w:w="120"/>
-              <w:bottom w:type="dxa" w:w="80"/>
-              <w:right w:type="dxa" w:w="120"/>
-            </w:tcMar>
-          </w:tcPr>
-          <w:p>
-            <w:pPr>
-              <w:jc w:val="left"/>
-            </w:pPr>
-            <w:r>
-              <w:rPr>
-                <w:rFonts w:ascii="Arial" w:cs="Arial" w:eastAsia="Arial" w:hAnsi="Arial"/>
-                <w:b w:val="false"/>
-                <w:bCs w:val="false"/>
-                <w:color w:val="222222"/>
-                <w:sz w:val="19"/>
-                <w:szCs w:val="19"/>
-              </w:rPr>
-              <w:t xml:space="preserve">After first deploy, run in Railway console: npx prisma migrate deploy</w:t>
-            </w:r>
-          </w:p>
-        </w:tc>
-      </w:tr>
-      <w:tr>
-        <w:tc>
-          <w:tcPr>
-            <w:tcW w:type="dxa" w:w="2500"/>
-            <w:tcBorders>
-              <w:top w:val="single" w:color="CCCCCC" w:sz="1"/>
-              <w:left w:val="single" w:color="CCCCCC" w:sz="1"/>
-              <w:bottom w:val="single" w:color="CCCCCC" w:sz="1"/>
-              <w:right w:val="single" w:color="CCCCCC" w:sz="1"/>
-            </w:tcBorders>
-            <w:tcMar>
-              <w:top w:type="dxa" w:w="80"/>
-              <w:left w:type="dxa" w:w="120"/>
-              <w:bottom w:type="dxa" w:w="80"/>
-              <w:right w:type="dxa" w:w="120"/>
-            </w:tcMar>
-          </w:tcPr>
-          <w:p>
-            <w:pPr>
-              <w:jc w:val="left"/>
-            </w:pPr>
-            <w:r>
-              <w:rPr>
-                <w:rFonts w:ascii="Arial" w:cs="Arial" w:eastAsia="Arial" w:hAnsi="Arial"/>
-                <w:b w:val="false"/>
-                <w:bCs w:val="false"/>
-                <w:color w:val="222222"/>
-                <w:sz w:val="19"/>
-                <w:szCs w:val="19"/>
-              </w:rPr>
-              <w:t xml:space="preserve">7 — Custom Domain (optional)</w:t>
-            </w:r>
-          </w:p>
-        </w:tc>
-        <w:tc>
-          <w:tcPr>
-            <w:tcW w:type="dxa" w:w="6860"/>
-            <w:tcBorders>
-              <w:top w:val="single" w:color="CCCCCC" w:sz="1"/>
-              <w:left w:val="single" w:color="CCCCCC" w:sz="1"/>
-              <w:bottom w:val="single" w:color="CCCCCC" w:sz="1"/>
-              <w:right w:val="single" w:color="CCCCCC" w:sz="1"/>
-            </w:tcBorders>
-            <w:tcMar>
-              <w:top w:type="dxa" w:w="80"/>
-              <w:left w:type="dxa" w:w="120"/>
-              <w:bottom w:type="dxa" w:w="80"/>
-              <w:right w:type="dxa" w:w="120"/>
-            </w:tcMar>
-          </w:tcPr>
-          <w:p>
-            <w:pPr>
-              <w:jc w:val="left"/>
-            </w:pPr>
-            <w:r>
-              <w:rPr>
-                <w:rFonts w:ascii="Arial" w:cs="Arial" w:eastAsia="Arial" w:hAnsi="Arial"/>
-                <w:b w:val="false"/>
-                <w:bCs w:val="false"/>
-                <w:color w:val="222222"/>
-                <w:sz w:val="19"/>
-                <w:szCs w:val="19"/>
-              </w:rPr>
-              <w:t xml:space="preserve">Railway → Settings → Domains → Add custom domain if needed</w:t>
+              <w:t xml:space="preserve">Click 'Commits' to see a full log of every change ever made — what was changed, when, and by whom.</w:t>
             </w:r>
           </w:p>
         </w:tc>
       </w:tr>
     </w:tbl>
+    <w:p>
+      <w:r>
+        <w:t xml:space="preserve"/>
+      </w:r>
+    </w:p>
+    <w:p>
+      <w:pPr>
+        <w:pBdr>
+          <w:top w:val="single" w:color="F0A500" w:sz="4" w:space="1"/>
+          <w:bottom w:val="single" w:color="F0A500" w:sz="4" w:space="1"/>
+          <w:left w:val="single" w:color="F0A500" w:sz="8" w:space="1"/>
+          <w:right w:val="single" w:color="F0A500" w:sz="4" w:space="1"/>
+        </w:pBdr>
+        <w:shd w:fill="FFF8D6" w:val="clear"/>
+        <w:spacing w:after="120" w:before="120"/>
+        <w:ind w:left="240" w:right="240"/>
+      </w:pPr>
+      <w:r>
+        <w:rPr>
+          <w:rFonts w:ascii="Arial" w:cs="Arial" w:eastAsia="Arial" w:hAnsi="Arial"/>
+          <w:b/>
+          <w:bCs/>
+          <w:color w:val="8B4500"/>
+          <w:sz w:val="20"/>
+          <w:szCs w:val="20"/>
+        </w:rPr>
+        <w:t xml:space="preserve">Important: </w:t>
+      </w:r>
+      <w:r>
+        <w:rPr>
+          <w:rFonts w:ascii="Arial" w:cs="Arial" w:eastAsia="Arial" w:hAnsi="Arial"/>
+          <w:color w:val="8B4500"/>
+          <w:sz w:val="20"/>
+          <w:szCs w:val="20"/>
+        </w:rPr>
+        <w:t xml:space="preserve">You do not need a GitHub account just to view the project. The repository is accessible via the link above. If you ever want to give a new developer access to work on the project, they will need a GitHub account — contact Monjez Agency and we will add them.</w:t>
+      </w:r>
+    </w:p>
     <w:p>
       <w:r>
         <w:t xml:space="preserve"/>
@@ -15086,6 +16352,86 @@
         <w:t xml:space="preserve">4.4 Vercel — Frontend Hosting</w:t>
       </w:r>
     </w:p>
+    <w:p>
+      <w:r>
+        <w:t xml:space="preserve"/>
+      </w:r>
+    </w:p>
+    <w:p>
+      <w:pPr>
+        <w:pBdr>
+          <w:top w:val="single" w:color="F0A500" w:sz="4" w:space="1"/>
+          <w:bottom w:val="single" w:color="F0A500" w:sz="4" w:space="1"/>
+          <w:left w:val="single" w:color="F0A500" w:sz="8" w:space="1"/>
+          <w:right w:val="single" w:color="F0A500" w:sz="4" w:space="1"/>
+        </w:pBdr>
+        <w:shd w:fill="FFF8D6" w:val="clear"/>
+        <w:spacing w:after="120" w:before="120"/>
+        <w:ind w:left="240" w:right="240"/>
+      </w:pPr>
+      <w:r>
+        <w:rPr>
+          <w:rFonts w:ascii="Arial" w:cs="Arial" w:eastAsia="Arial" w:hAnsi="Arial"/>
+          <w:b/>
+          <w:bCs/>
+          <w:color w:val="8B4500"/>
+          <w:sz w:val="20"/>
+          <w:szCs w:val="20"/>
+        </w:rPr>
+        <w:t xml:space="preserve">📌  Good News: The client does NOT need to pay for Vercel. </w:t>
+      </w:r>
+      <w:r>
+        <w:rPr>
+          <w:rFonts w:ascii="Arial" w:cs="Arial" w:eastAsia="Arial" w:hAnsi="Arial"/>
+          <w:color w:val="8B4500"/>
+          <w:sz w:val="20"/>
+          <w:szCs w:val="20"/>
+        </w:rPr>
+        <w:t xml:space="preserve">Monjez Agency is handling the Vercel deployment under our account. The frontend is already live and will remain available. No action required from the client for this.</w:t>
+      </w:r>
+    </w:p>
+    <w:p>
+      <w:r>
+        <w:t xml:space="preserve"/>
+      </w:r>
+    </w:p>
+    <w:p>
+      <w:pPr>
+        <w:spacing w:after="60" w:before="60"/>
+      </w:pPr>
+      <w:r>
+        <w:rPr>
+          <w:rFonts w:ascii="Arial" w:cs="Arial" w:eastAsia="Arial" w:hAnsi="Arial"/>
+          <w:b w:val="false"/>
+          <w:bCs w:val="false"/>
+          <w:color w:val="444444"/>
+          <w:sz w:val="20"/>
+          <w:szCs w:val="20"/>
+        </w:rPr>
+        <w:t xml:space="preserve">What is Vercel? Think of it like a server that only handles the website's visual pages — the part the user sees in their browser. It is separate from the backend (Railway) which handles all the data, payments, and logic.</w:t>
+      </w:r>
+    </w:p>
+    <w:p>
+      <w:pPr>
+        <w:spacing w:after="60" w:before="60"/>
+      </w:pPr>
+      <w:r>
+        <w:rPr>
+          <w:rFonts w:ascii="Arial" w:cs="Arial" w:eastAsia="Arial" w:hAnsi="Arial"/>
+          <w:b w:val="false"/>
+          <w:bCs w:val="false"/>
+          <w:color w:val="444444"/>
+          <w:sz w:val="20"/>
+          <w:szCs w:val="20"/>
+        </w:rPr>
+        <w:t xml:space="preserve">The split looks like this: Vercel = the shop window (what customers see). Railway = the warehouse and cashier system behind the scenes.</w:t>
+      </w:r>
+    </w:p>
+    <w:p>
+      <w:r>
+        <w:t xml:space="preserve"/>
+      </w:r>
+    </w:p>
     <w:tbl>
       <w:tblPr>
         <w:tblW w:type="dxa" w:w="9360"/>
@@ -15099,13 +16445,13 @@
         </w:tblBorders>
       </w:tblPr>
       <w:tblGrid>
-        <w:gridCol w:w="2500"/>
-        <w:gridCol w:w="6860"/>
+        <w:gridCol w:w="2800"/>
+        <w:gridCol w:w="6560"/>
       </w:tblGrid>
       <w:tr>
         <w:tc>
           <w:tcPr>
-            <w:tcW w:type="dxa" w:w="2500"/>
+            <w:tcW w:type="dxa" w:w="2800"/>
             <w:tcBorders>
               <w:top w:val="single" w:color="CCCCCC" w:sz="1"/>
               <w:left w:val="single" w:color="CCCCCC" w:sz="1"/>
@@ -15133,13 +16479,13 @@
                 <w:sz w:val="19"/>
                 <w:szCs w:val="19"/>
               </w:rPr>
-              <w:t xml:space="preserve">Step</w:t>
-            </w:r>
-          </w:p>
-        </w:tc>
-        <w:tc>
-          <w:tcPr>
-            <w:tcW w:type="dxa" w:w="6860"/>
+              <w:t xml:space="preserve"/>
+            </w:r>
+          </w:p>
+        </w:tc>
+        <w:tc>
+          <w:tcPr>
+            <w:tcW w:type="dxa" w:w="6560"/>
             <w:tcBorders>
               <w:top w:val="single" w:color="CCCCCC" w:sz="1"/>
               <w:left w:val="single" w:color="CCCCCC" w:sz="1"/>
@@ -15167,83 +16513,83 @@
                 <w:sz w:val="19"/>
                 <w:szCs w:val="19"/>
               </w:rPr>
-              <w:t xml:space="preserve">Action Required</w:t>
-            </w:r>
-          </w:p>
-        </w:tc>
-      </w:tr>
-      <w:tr>
-        <w:tc>
-          <w:tcPr>
-            <w:tcW w:type="dxa" w:w="2500"/>
-            <w:tcBorders>
-              <w:top w:val="single" w:color="CCCCCC" w:sz="1"/>
-              <w:left w:val="single" w:color="CCCCCC" w:sz="1"/>
-              <w:bottom w:val="single" w:color="CCCCCC" w:sz="1"/>
-              <w:right w:val="single" w:color="CCCCCC" w:sz="1"/>
-            </w:tcBorders>
-            <w:tcMar>
-              <w:top w:type="dxa" w:w="80"/>
-              <w:left w:type="dxa" w:w="120"/>
-              <w:bottom w:type="dxa" w:w="80"/>
-              <w:right w:type="dxa" w:w="120"/>
-            </w:tcMar>
-          </w:tcPr>
-          <w:p>
-            <w:pPr>
-              <w:jc w:val="left"/>
-            </w:pPr>
-            <w:r>
-              <w:rPr>
-                <w:rFonts w:ascii="Arial" w:cs="Arial" w:eastAsia="Arial" w:hAnsi="Arial"/>
-                <w:b w:val="false"/>
-                <w:bCs w:val="false"/>
-                <w:color w:val="222222"/>
-                <w:sz w:val="19"/>
-                <w:szCs w:val="19"/>
-              </w:rPr>
-              <w:t xml:space="preserve">1 — Create Vercel Account</w:t>
-            </w:r>
-          </w:p>
-        </w:tc>
-        <w:tc>
-          <w:tcPr>
-            <w:tcW w:type="dxa" w:w="6860"/>
-            <w:tcBorders>
-              <w:top w:val="single" w:color="CCCCCC" w:sz="1"/>
-              <w:left w:val="single" w:color="CCCCCC" w:sz="1"/>
-              <w:bottom w:val="single" w:color="CCCCCC" w:sz="1"/>
-              <w:right w:val="single" w:color="CCCCCC" w:sz="1"/>
-            </w:tcBorders>
-            <w:tcMar>
-              <w:top w:type="dxa" w:w="80"/>
-              <w:left w:type="dxa" w:w="120"/>
-              <w:bottom w:type="dxa" w:w="80"/>
-              <w:right w:type="dxa" w:w="120"/>
-            </w:tcMar>
-          </w:tcPr>
-          <w:p>
-            <w:pPr>
-              <w:jc w:val="left"/>
-            </w:pPr>
-            <w:r>
-              <w:rPr>
-                <w:rFonts w:ascii="Arial" w:cs="Arial" w:eastAsia="Arial" w:hAnsi="Arial"/>
-                <w:b w:val="false"/>
-                <w:bCs w:val="false"/>
-                <w:color w:val="222222"/>
-                <w:sz w:val="19"/>
-                <w:szCs w:val="19"/>
-              </w:rPr>
-              <w:t xml:space="preserve">vercel.com → Import Git Repository → connect GitHub</w:t>
-            </w:r>
-          </w:p>
-        </w:tc>
-      </w:tr>
-      <w:tr>
-        <w:tc>
-          <w:tcPr>
-            <w:tcW w:type="dxa" w:w="2500"/>
+              <w:t xml:space="preserve">Details</w:t>
+            </w:r>
+          </w:p>
+        </w:tc>
+      </w:tr>
+      <w:tr>
+        <w:tc>
+          <w:tcPr>
+            <w:tcW w:type="dxa" w:w="2800"/>
+            <w:tcBorders>
+              <w:top w:val="single" w:color="CCCCCC" w:sz="1"/>
+              <w:left w:val="single" w:color="CCCCCC" w:sz="1"/>
+              <w:bottom w:val="single" w:color="CCCCCC" w:sz="1"/>
+              <w:right w:val="single" w:color="CCCCCC" w:sz="1"/>
+            </w:tcBorders>
+            <w:tcMar>
+              <w:top w:type="dxa" w:w="80"/>
+              <w:left w:type="dxa" w:w="120"/>
+              <w:bottom w:type="dxa" w:w="80"/>
+              <w:right w:type="dxa" w:w="120"/>
+            </w:tcMar>
+          </w:tcPr>
+          <w:p>
+            <w:pPr>
+              <w:jc w:val="left"/>
+            </w:pPr>
+            <w:r>
+              <w:rPr>
+                <w:rFonts w:ascii="Arial" w:cs="Arial" w:eastAsia="Arial" w:hAnsi="Arial"/>
+                <w:b w:val="false"/>
+                <w:bCs w:val="false"/>
+                <w:color w:val="222222"/>
+                <w:sz w:val="19"/>
+                <w:szCs w:val="19"/>
+              </w:rPr>
+              <w:t xml:space="preserve">Current Frontend URL</w:t>
+            </w:r>
+          </w:p>
+        </w:tc>
+        <w:tc>
+          <w:tcPr>
+            <w:tcW w:type="dxa" w:w="6560"/>
+            <w:tcBorders>
+              <w:top w:val="single" w:color="CCCCCC" w:sz="1"/>
+              <w:left w:val="single" w:color="CCCCCC" w:sz="1"/>
+              <w:bottom w:val="single" w:color="CCCCCC" w:sz="1"/>
+              <w:right w:val="single" w:color="CCCCCC" w:sz="1"/>
+            </w:tcBorders>
+            <w:tcMar>
+              <w:top w:type="dxa" w:w="80"/>
+              <w:left w:type="dxa" w:w="120"/>
+              <w:bottom w:type="dxa" w:w="80"/>
+              <w:right w:type="dxa" w:w="120"/>
+            </w:tcMar>
+          </w:tcPr>
+          <w:p>
+            <w:pPr>
+              <w:jc w:val="left"/>
+            </w:pPr>
+            <w:r>
+              <w:rPr>
+                <w:rFonts w:ascii="Arial" w:cs="Arial" w:eastAsia="Arial" w:hAnsi="Arial"/>
+                <w:b w:val="false"/>
+                <w:bCs w:val="false"/>
+                <w:color w:val="222222"/>
+                <w:sz w:val="19"/>
+                <w:szCs w:val="19"/>
+              </w:rPr>
+              <w:t xml:space="preserve">https://marketpl7ce.vercel.app (live now)</w:t>
+            </w:r>
+          </w:p>
+        </w:tc>
+      </w:tr>
+      <w:tr>
+        <w:tc>
+          <w:tcPr>
+            <w:tcW w:type="dxa" w:w="2800"/>
             <w:tcBorders>
               <w:top w:val="single" w:color="CCCCCC" w:sz="1"/>
               <w:left w:val="single" w:color="CCCCCC" w:sz="1"/>
@@ -15271,13 +16617,13 @@
                 <w:sz w:val="19"/>
                 <w:szCs w:val="19"/>
               </w:rPr>
-              <w:t xml:space="preserve">2 — Set Root Directory</w:t>
-            </w:r>
-          </w:p>
-        </w:tc>
-        <w:tc>
-          <w:tcPr>
-            <w:tcW w:type="dxa" w:w="6860"/>
+              <w:t xml:space="preserve">Who Manages It</w:t>
+            </w:r>
+          </w:p>
+        </w:tc>
+        <w:tc>
+          <w:tcPr>
+            <w:tcW w:type="dxa" w:w="6560"/>
             <w:tcBorders>
               <w:top w:val="single" w:color="CCCCCC" w:sz="1"/>
               <w:left w:val="single" w:color="CCCCCC" w:sz="1"/>
@@ -15305,83 +16651,83 @@
                 <w:sz w:val="19"/>
                 <w:szCs w:val="19"/>
               </w:rPr>
-              <w:t xml:space="preserve">In Vercel project settings: Root Directory = frontend</w:t>
-            </w:r>
-          </w:p>
-        </w:tc>
-      </w:tr>
-      <w:tr>
-        <w:tc>
-          <w:tcPr>
-            <w:tcW w:type="dxa" w:w="2500"/>
-            <w:tcBorders>
-              <w:top w:val="single" w:color="CCCCCC" w:sz="1"/>
-              <w:left w:val="single" w:color="CCCCCC" w:sz="1"/>
-              <w:bottom w:val="single" w:color="CCCCCC" w:sz="1"/>
-              <w:right w:val="single" w:color="CCCCCC" w:sz="1"/>
-            </w:tcBorders>
-            <w:tcMar>
-              <w:top w:type="dxa" w:w="80"/>
-              <w:left w:type="dxa" w:w="120"/>
-              <w:bottom w:type="dxa" w:w="80"/>
-              <w:right w:type="dxa" w:w="120"/>
-            </w:tcMar>
-          </w:tcPr>
-          <w:p>
-            <w:pPr>
-              <w:jc w:val="left"/>
-            </w:pPr>
-            <w:r>
-              <w:rPr>
-                <w:rFonts w:ascii="Arial" w:cs="Arial" w:eastAsia="Arial" w:hAnsi="Arial"/>
-                <w:b w:val="false"/>
-                <w:bCs w:val="false"/>
-                <w:color w:val="222222"/>
-                <w:sz w:val="19"/>
-                <w:szCs w:val="19"/>
-              </w:rPr>
-              <w:t xml:space="preserve">3 — Set Environment Variables</w:t>
-            </w:r>
-          </w:p>
-        </w:tc>
-        <w:tc>
-          <w:tcPr>
-            <w:tcW w:type="dxa" w:w="6860"/>
-            <w:tcBorders>
-              <w:top w:val="single" w:color="CCCCCC" w:sz="1"/>
-              <w:left w:val="single" w:color="CCCCCC" w:sz="1"/>
-              <w:bottom w:val="single" w:color="CCCCCC" w:sz="1"/>
-              <w:right w:val="single" w:color="CCCCCC" w:sz="1"/>
-            </w:tcBorders>
-            <w:tcMar>
-              <w:top w:type="dxa" w:w="80"/>
-              <w:left w:type="dxa" w:w="120"/>
-              <w:bottom w:type="dxa" w:w="80"/>
-              <w:right w:type="dxa" w:w="120"/>
-            </w:tcMar>
-          </w:tcPr>
-          <w:p>
-            <w:pPr>
-              <w:jc w:val="left"/>
-            </w:pPr>
-            <w:r>
-              <w:rPr>
-                <w:rFonts w:ascii="Arial" w:cs="Arial" w:eastAsia="Arial" w:hAnsi="Arial"/>
-                <w:b w:val="false"/>
-                <w:bCs w:val="false"/>
-                <w:color w:val="222222"/>
-                <w:sz w:val="19"/>
-                <w:szCs w:val="19"/>
-              </w:rPr>
-              <w:t xml:space="preserve">Add all variables from Section 3.2 in Vercel → Settings → Environment Variables</w:t>
-            </w:r>
-          </w:p>
-        </w:tc>
-      </w:tr>
-      <w:tr>
-        <w:tc>
-          <w:tcPr>
-            <w:tcW w:type="dxa" w:w="2500"/>
+              <w:t xml:space="preserve">Monjez Agency — already deployed, no action needed from client</w:t>
+            </w:r>
+          </w:p>
+        </w:tc>
+      </w:tr>
+      <w:tr>
+        <w:tc>
+          <w:tcPr>
+            <w:tcW w:type="dxa" w:w="2800"/>
+            <w:tcBorders>
+              <w:top w:val="single" w:color="CCCCCC" w:sz="1"/>
+              <w:left w:val="single" w:color="CCCCCC" w:sz="1"/>
+              <w:bottom w:val="single" w:color="CCCCCC" w:sz="1"/>
+              <w:right w:val="single" w:color="CCCCCC" w:sz="1"/>
+            </w:tcBorders>
+            <w:tcMar>
+              <w:top w:type="dxa" w:w="80"/>
+              <w:left w:type="dxa" w:w="120"/>
+              <w:bottom w:type="dxa" w:w="80"/>
+              <w:right w:type="dxa" w:w="120"/>
+            </w:tcMar>
+          </w:tcPr>
+          <w:p>
+            <w:pPr>
+              <w:jc w:val="left"/>
+            </w:pPr>
+            <w:r>
+              <w:rPr>
+                <w:rFonts w:ascii="Arial" w:cs="Arial" w:eastAsia="Arial" w:hAnsi="Arial"/>
+                <w:b w:val="false"/>
+                <w:bCs w:val="false"/>
+                <w:color w:val="222222"/>
+                <w:sz w:val="19"/>
+                <w:szCs w:val="19"/>
+              </w:rPr>
+              <w:t xml:space="preserve">Cost to Client</w:t>
+            </w:r>
+          </w:p>
+        </w:tc>
+        <w:tc>
+          <w:tcPr>
+            <w:tcW w:type="dxa" w:w="6560"/>
+            <w:tcBorders>
+              <w:top w:val="single" w:color="CCCCCC" w:sz="1"/>
+              <w:left w:val="single" w:color="CCCCCC" w:sz="1"/>
+              <w:bottom w:val="single" w:color="CCCCCC" w:sz="1"/>
+              <w:right w:val="single" w:color="CCCCCC" w:sz="1"/>
+            </w:tcBorders>
+            <w:tcMar>
+              <w:top w:type="dxa" w:w="80"/>
+              <w:left w:type="dxa" w:w="120"/>
+              <w:bottom w:type="dxa" w:w="80"/>
+              <w:right w:type="dxa" w:w="120"/>
+            </w:tcMar>
+          </w:tcPr>
+          <w:p>
+            <w:pPr>
+              <w:jc w:val="left"/>
+            </w:pPr>
+            <w:r>
+              <w:rPr>
+                <w:rFonts w:ascii="Arial" w:cs="Arial" w:eastAsia="Arial" w:hAnsi="Arial"/>
+                <w:b w:val="false"/>
+                <w:bCs w:val="false"/>
+                <w:color w:val="222222"/>
+                <w:sz w:val="19"/>
+                <w:szCs w:val="19"/>
+              </w:rPr>
+              <w:t xml:space="preserve">€0 — Monjez Agency covers Vercel hosting</w:t>
+            </w:r>
+          </w:p>
+        </w:tc>
+      </w:tr>
+      <w:tr>
+        <w:tc>
+          <w:tcPr>
+            <w:tcW w:type="dxa" w:w="2800"/>
             <w:tcBorders>
               <w:top w:val="single" w:color="CCCCCC" w:sz="1"/>
               <w:left w:val="single" w:color="CCCCCC" w:sz="1"/>
@@ -15409,13 +16755,13 @@
                 <w:sz w:val="19"/>
                 <w:szCs w:val="19"/>
               </w:rPr>
-              <w:t xml:space="preserve">4 — Custom Domain (optional)</w:t>
-            </w:r>
-          </w:p>
-        </w:tc>
-        <w:tc>
-          <w:tcPr>
-            <w:tcW w:type="dxa" w:w="6860"/>
+              <w:t xml:space="preserve">Custom Domain (optional)</w:t>
+            </w:r>
+          </w:p>
+        </w:tc>
+        <w:tc>
+          <w:tcPr>
+            <w:tcW w:type="dxa" w:w="6560"/>
             <w:tcBorders>
               <w:top w:val="single" w:color="CCCCCC" w:sz="1"/>
               <w:left w:val="single" w:color="CCCCCC" w:sz="1"/>
@@ -15443,75 +16789,75 @@
                 <w:sz w:val="19"/>
                 <w:szCs w:val="19"/>
               </w:rPr>
-              <w:t xml:space="preserve">Vercel → Project → Domains → Add your custom domain and configure DNS</w:t>
-            </w:r>
-          </w:p>
-        </w:tc>
-      </w:tr>
-      <w:tr>
-        <w:tc>
-          <w:tcPr>
-            <w:tcW w:type="dxa" w:w="2500"/>
-            <w:tcBorders>
-              <w:top w:val="single" w:color="CCCCCC" w:sz="1"/>
-              <w:left w:val="single" w:color="CCCCCC" w:sz="1"/>
-              <w:bottom w:val="single" w:color="CCCCCC" w:sz="1"/>
-              <w:right w:val="single" w:color="CCCCCC" w:sz="1"/>
-            </w:tcBorders>
-            <w:tcMar>
-              <w:top w:type="dxa" w:w="80"/>
-              <w:left w:type="dxa" w:w="120"/>
-              <w:bottom w:type="dxa" w:w="80"/>
-              <w:right w:type="dxa" w:w="120"/>
-            </w:tcMar>
-          </w:tcPr>
-          <w:p>
-            <w:pPr>
-              <w:jc w:val="left"/>
-            </w:pPr>
-            <w:r>
-              <w:rPr>
-                <w:rFonts w:ascii="Arial" w:cs="Arial" w:eastAsia="Arial" w:hAnsi="Arial"/>
-                <w:b w:val="false"/>
-                <w:bCs w:val="false"/>
-                <w:color w:val="222222"/>
-                <w:sz w:val="19"/>
-                <w:szCs w:val="19"/>
-              </w:rPr>
-              <w:t xml:space="preserve">5 — Redeploy After Env Vars</w:t>
-            </w:r>
-          </w:p>
-        </w:tc>
-        <w:tc>
-          <w:tcPr>
-            <w:tcW w:type="dxa" w:w="6860"/>
-            <w:tcBorders>
-              <w:top w:val="single" w:color="CCCCCC" w:sz="1"/>
-              <w:left w:val="single" w:color="CCCCCC" w:sz="1"/>
-              <w:bottom w:val="single" w:color="CCCCCC" w:sz="1"/>
-              <w:right w:val="single" w:color="CCCCCC" w:sz="1"/>
-            </w:tcBorders>
-            <w:tcMar>
-              <w:top w:type="dxa" w:w="80"/>
-              <w:left w:type="dxa" w:w="120"/>
-              <w:bottom w:type="dxa" w:w="80"/>
-              <w:right w:type="dxa" w:w="120"/>
-            </w:tcMar>
-          </w:tcPr>
-          <w:p>
-            <w:pPr>
-              <w:jc w:val="left"/>
-            </w:pPr>
-            <w:r>
-              <w:rPr>
-                <w:rFonts w:ascii="Arial" w:cs="Arial" w:eastAsia="Arial" w:hAnsi="Arial"/>
-                <w:b w:val="false"/>
-                <w:bCs w:val="false"/>
-                <w:color w:val="222222"/>
-                <w:sz w:val="19"/>
-                <w:szCs w:val="19"/>
-              </w:rPr>
-              <w:t xml:space="preserve">After adding env vars, trigger a new deployment for them to take effect</w:t>
+              <w:t xml:space="preserve">If client wants their own domain (e.g., yourmarketplace.ro), we can connect it. Client pays for domain (~€12/year from GoDaddy or Namecheap). We configure it for free.</w:t>
+            </w:r>
+          </w:p>
+        </w:tc>
+      </w:tr>
+      <w:tr>
+        <w:tc>
+          <w:tcPr>
+            <w:tcW w:type="dxa" w:w="2800"/>
+            <w:tcBorders>
+              <w:top w:val="single" w:color="CCCCCC" w:sz="1"/>
+              <w:left w:val="single" w:color="CCCCCC" w:sz="1"/>
+              <w:bottom w:val="single" w:color="CCCCCC" w:sz="1"/>
+              <w:right w:val="single" w:color="CCCCCC" w:sz="1"/>
+            </w:tcBorders>
+            <w:tcMar>
+              <w:top w:type="dxa" w:w="80"/>
+              <w:left w:type="dxa" w:w="120"/>
+              <w:bottom w:type="dxa" w:w="80"/>
+              <w:right w:type="dxa" w:w="120"/>
+            </w:tcMar>
+          </w:tcPr>
+          <w:p>
+            <w:pPr>
+              <w:jc w:val="left"/>
+            </w:pPr>
+            <w:r>
+              <w:rPr>
+                <w:rFonts w:ascii="Arial" w:cs="Arial" w:eastAsia="Arial" w:hAnsi="Arial"/>
+                <w:b w:val="false"/>
+                <w:bCs w:val="false"/>
+                <w:color w:val="222222"/>
+                <w:sz w:val="19"/>
+                <w:szCs w:val="19"/>
+              </w:rPr>
+              <w:t xml:space="preserve">If Client Wants Their Own Vercel Account</w:t>
+            </w:r>
+          </w:p>
+        </w:tc>
+        <w:tc>
+          <w:tcPr>
+            <w:tcW w:type="dxa" w:w="6560"/>
+            <w:tcBorders>
+              <w:top w:val="single" w:color="CCCCCC" w:sz="1"/>
+              <w:left w:val="single" w:color="CCCCCC" w:sz="1"/>
+              <w:bottom w:val="single" w:color="CCCCCC" w:sz="1"/>
+              <w:right w:val="single" w:color="CCCCCC" w:sz="1"/>
+            </w:tcBorders>
+            <w:tcMar>
+              <w:top w:type="dxa" w:w="80"/>
+              <w:left w:type="dxa" w:w="120"/>
+              <w:bottom w:type="dxa" w:w="80"/>
+              <w:right w:type="dxa" w:w="120"/>
+            </w:tcMar>
+          </w:tcPr>
+          <w:p>
+            <w:pPr>
+              <w:jc w:val="left"/>
+            </w:pPr>
+            <w:r>
+              <w:rPr>
+                <w:rFonts w:ascii="Arial" w:cs="Arial" w:eastAsia="Arial" w:hAnsi="Arial"/>
+                <w:b w:val="false"/>
+                <w:bCs w:val="false"/>
+                <w:color w:val="222222"/>
+                <w:sz w:val="19"/>
+                <w:szCs w:val="19"/>
+              </w:rPr>
+              <w:t xml:space="preserve">Optional. Client can create a free account at vercel.com and we can transfer the project. The free Hobby plan is sufficient for most traffic levels.</w:t>
             </w:r>
           </w:p>
         </w:tc>
@@ -15985,7 +17331,1486 @@
           </w:p>
         </w:tc>
       </w:tr>
+      <w:tr>
+        <w:tc>
+          <w:tcPr>
+            <w:tcW w:type="dxa" w:w="3200"/>
+            <w:tcBorders>
+              <w:top w:val="single" w:color="CCCCCC" w:sz="1"/>
+              <w:left w:val="single" w:color="CCCCCC" w:sz="1"/>
+              <w:bottom w:val="single" w:color="CCCCCC" w:sz="1"/>
+              <w:right w:val="single" w:color="CCCCCC" w:sz="1"/>
+            </w:tcBorders>
+            <w:shd w:fill="F0F4F8" w:val="clear"/>
+            <w:tcMar>
+              <w:top w:type="dxa" w:w="80"/>
+              <w:left w:type="dxa" w:w="120"/>
+              <w:bottom w:type="dxa" w:w="80"/>
+              <w:right w:type="dxa" w:w="120"/>
+            </w:tcMar>
+          </w:tcPr>
+          <w:p>
+            <w:pPr>
+              <w:jc w:val="left"/>
+            </w:pPr>
+            <w:r>
+              <w:rPr>
+                <w:rFonts w:ascii="Arial" w:cs="Arial" w:eastAsia="Arial" w:hAnsi="Arial"/>
+                <w:b w:val="false"/>
+                <w:bCs w:val="false"/>
+                <w:color w:val="222222"/>
+                <w:sz w:val="19"/>
+                <w:szCs w:val="19"/>
+              </w:rPr>
+              <w:t xml:space="preserve">Fallback Service</w:t>
+            </w:r>
+          </w:p>
+        </w:tc>
+        <w:tc>
+          <w:tcPr>
+            <w:tcW w:type="dxa" w:w="6160"/>
+            <w:tcBorders>
+              <w:top w:val="single" w:color="CCCCCC" w:sz="1"/>
+              <w:left w:val="single" w:color="CCCCCC" w:sz="1"/>
+              <w:bottom w:val="single" w:color="CCCCCC" w:sz="1"/>
+              <w:right w:val="single" w:color="CCCCCC" w:sz="1"/>
+            </w:tcBorders>
+            <w:shd w:fill="F0F4F8" w:val="clear"/>
+            <w:tcMar>
+              <w:top w:type="dxa" w:w="80"/>
+              <w:left w:type="dxa" w:w="120"/>
+              <w:bottom w:type="dxa" w:w="80"/>
+              <w:right w:type="dxa" w:w="120"/>
+            </w:tcMar>
+          </w:tcPr>
+          <w:p>
+            <w:pPr>
+              <w:jc w:val="left"/>
+            </w:pPr>
+            <w:r>
+              <w:rPr>
+                <w:rFonts w:ascii="Arial" w:cs="Arial" w:eastAsia="Arial" w:hAnsi="Arial"/>
+                <w:b w:val="false"/>
+                <w:bCs w:val="false"/>
+                <w:color w:val="222222"/>
+                <w:sz w:val="19"/>
+                <w:szCs w:val="19"/>
+              </w:rPr>
+              <w:t xml:space="preserve">Resend (resend.com) — free account, handles 100 emails/day if SMTP fails</w:t>
+            </w:r>
+          </w:p>
+        </w:tc>
+      </w:tr>
     </w:tbl>
+    <w:p>
+      <w:r>
+        <w:t xml:space="preserve"/>
+      </w:r>
+    </w:p>
+    <w:p>
+      <w:pPr>
+        <w:pStyle w:val="Heading2"/>
+        <w:spacing w:after="160" w:before="300"/>
+      </w:pPr>
+      <w:r>
+        <w:rPr>
+          <w:rFonts w:ascii="Arial" w:cs="Arial" w:eastAsia="Arial" w:hAnsi="Arial"/>
+          <w:b/>
+          <w:bCs/>
+          <w:color w:val="2E5E8A"/>
+          <w:sz w:val="26"/>
+          <w:szCs w:val="26"/>
+        </w:rPr>
+        <w:t xml:space="preserve">4.6 Monthly Cost Breakdown — What the Client Will Pay</w:t>
+      </w:r>
+    </w:p>
+    <w:p>
+      <w:pPr>
+        <w:spacing w:after="60" w:before="60"/>
+      </w:pPr>
+      <w:r>
+        <w:rPr>
+          <w:rFonts w:ascii="Arial" w:cs="Arial" w:eastAsia="Arial" w:hAnsi="Arial"/>
+          <w:b/>
+          <w:bCs/>
+          <w:color w:val="222222"/>
+          <w:sz w:val="20"/>
+          <w:szCs w:val="20"/>
+        </w:rPr>
+        <w:t xml:space="preserve">Here is a full breakdown of all recurring costs for running the platform. These are honest estimates based on current service pricing.</w:t>
+      </w:r>
+    </w:p>
+    <w:p>
+      <w:r>
+        <w:t xml:space="preserve"/>
+      </w:r>
+    </w:p>
+    <w:tbl>
+      <w:tblPr>
+        <w:tblW w:type="dxa" w:w="9360"/>
+        <w:tblBorders>
+          <w:top w:val="single" w:color="auto" w:sz="4"/>
+          <w:left w:val="single" w:color="auto" w:sz="4"/>
+          <w:bottom w:val="single" w:color="auto" w:sz="4"/>
+          <w:right w:val="single" w:color="auto" w:sz="4"/>
+          <w:insideH w:val="single" w:color="auto" w:sz="4"/>
+          <w:insideV w:val="single" w:color="auto" w:sz="4"/>
+        </w:tblBorders>
+      </w:tblPr>
+      <w:tblGrid>
+        <w:gridCol w:w="2800"/>
+        <w:gridCol w:w="1800"/>
+        <w:gridCol w:w="2000"/>
+        <w:gridCol w:w="2760"/>
+      </w:tblGrid>
+      <w:tr>
+        <w:tc>
+          <w:tcPr>
+            <w:tcW w:type="dxa" w:w="2800"/>
+            <w:tcBorders>
+              <w:top w:val="single" w:color="CCCCCC" w:sz="1"/>
+              <w:left w:val="single" w:color="CCCCCC" w:sz="1"/>
+              <w:bottom w:val="single" w:color="CCCCCC" w:sz="1"/>
+              <w:right w:val="single" w:color="CCCCCC" w:sz="1"/>
+            </w:tcBorders>
+            <w:shd w:fill="1B3A5C" w:val="clear"/>
+            <w:tcMar>
+              <w:top w:type="dxa" w:w="80"/>
+              <w:left w:type="dxa" w:w="120"/>
+              <w:bottom w:type="dxa" w:w="80"/>
+              <w:right w:type="dxa" w:w="120"/>
+            </w:tcMar>
+          </w:tcPr>
+          <w:p>
+            <w:pPr>
+              <w:jc w:val="left"/>
+            </w:pPr>
+            <w:r>
+              <w:rPr>
+                <w:rFonts w:ascii="Arial" w:cs="Arial" w:eastAsia="Arial" w:hAnsi="Arial"/>
+                <w:b/>
+                <w:bCs/>
+                <w:color w:val="FFFFFF"/>
+                <w:sz w:val="19"/>
+                <w:szCs w:val="19"/>
+              </w:rPr>
+              <w:t xml:space="preserve">Service</w:t>
+            </w:r>
+          </w:p>
+        </w:tc>
+        <w:tc>
+          <w:tcPr>
+            <w:tcW w:type="dxa" w:w="1800"/>
+            <w:tcBorders>
+              <w:top w:val="single" w:color="CCCCCC" w:sz="1"/>
+              <w:left w:val="single" w:color="CCCCCC" w:sz="1"/>
+              <w:bottom w:val="single" w:color="CCCCCC" w:sz="1"/>
+              <w:right w:val="single" w:color="CCCCCC" w:sz="1"/>
+            </w:tcBorders>
+            <w:shd w:fill="1B3A5C" w:val="clear"/>
+            <w:tcMar>
+              <w:top w:type="dxa" w:w="80"/>
+              <w:left w:type="dxa" w:w="120"/>
+              <w:bottom w:type="dxa" w:w="80"/>
+              <w:right w:type="dxa" w:w="120"/>
+            </w:tcMar>
+          </w:tcPr>
+          <w:p>
+            <w:pPr>
+              <w:jc w:val="left"/>
+            </w:pPr>
+            <w:r>
+              <w:rPr>
+                <w:rFonts w:ascii="Arial" w:cs="Arial" w:eastAsia="Arial" w:hAnsi="Arial"/>
+                <w:b/>
+                <w:bCs/>
+                <w:color w:val="FFFFFF"/>
+                <w:sz w:val="19"/>
+                <w:szCs w:val="19"/>
+              </w:rPr>
+              <w:t xml:space="preserve">Est. Monthly Cost</w:t>
+            </w:r>
+          </w:p>
+        </w:tc>
+        <w:tc>
+          <w:tcPr>
+            <w:tcW w:type="dxa" w:w="2000"/>
+            <w:tcBorders>
+              <w:top w:val="single" w:color="CCCCCC" w:sz="1"/>
+              <w:left w:val="single" w:color="CCCCCC" w:sz="1"/>
+              <w:bottom w:val="single" w:color="CCCCCC" w:sz="1"/>
+              <w:right w:val="single" w:color="CCCCCC" w:sz="1"/>
+            </w:tcBorders>
+            <w:shd w:fill="1B3A5C" w:val="clear"/>
+            <w:tcMar>
+              <w:top w:type="dxa" w:w="80"/>
+              <w:left w:type="dxa" w:w="120"/>
+              <w:bottom w:type="dxa" w:w="80"/>
+              <w:right w:type="dxa" w:w="120"/>
+            </w:tcMar>
+          </w:tcPr>
+          <w:p>
+            <w:pPr>
+              <w:jc w:val="left"/>
+            </w:pPr>
+            <w:r>
+              <w:rPr>
+                <w:rFonts w:ascii="Arial" w:cs="Arial" w:eastAsia="Arial" w:hAnsi="Arial"/>
+                <w:b/>
+                <w:bCs/>
+                <w:color w:val="FFFFFF"/>
+                <w:sz w:val="19"/>
+                <w:szCs w:val="19"/>
+              </w:rPr>
+              <w:t xml:space="preserve">Who Pays</w:t>
+            </w:r>
+          </w:p>
+        </w:tc>
+        <w:tc>
+          <w:tcPr>
+            <w:tcW w:type="dxa" w:w="2760"/>
+            <w:tcBorders>
+              <w:top w:val="single" w:color="CCCCCC" w:sz="1"/>
+              <w:left w:val="single" w:color="CCCCCC" w:sz="1"/>
+              <w:bottom w:val="single" w:color="CCCCCC" w:sz="1"/>
+              <w:right w:val="single" w:color="CCCCCC" w:sz="1"/>
+            </w:tcBorders>
+            <w:shd w:fill="1B3A5C" w:val="clear"/>
+            <w:tcMar>
+              <w:top w:type="dxa" w:w="80"/>
+              <w:left w:type="dxa" w:w="120"/>
+              <w:bottom w:type="dxa" w:w="80"/>
+              <w:right w:type="dxa" w:w="120"/>
+            </w:tcMar>
+          </w:tcPr>
+          <w:p>
+            <w:pPr>
+              <w:jc w:val="left"/>
+            </w:pPr>
+            <w:r>
+              <w:rPr>
+                <w:rFonts w:ascii="Arial" w:cs="Arial" w:eastAsia="Arial" w:hAnsi="Arial"/>
+                <w:b/>
+                <w:bCs/>
+                <w:color w:val="FFFFFF"/>
+                <w:sz w:val="19"/>
+                <w:szCs w:val="19"/>
+              </w:rPr>
+              <w:t xml:space="preserve">Notes</w:t>
+            </w:r>
+          </w:p>
+        </w:tc>
+      </w:tr>
+      <w:tr>
+        <w:tc>
+          <w:tcPr>
+            <w:tcW w:type="dxa" w:w="2800"/>
+            <w:tcBorders>
+              <w:top w:val="single" w:color="CCCCCC" w:sz="1"/>
+              <w:left w:val="single" w:color="CCCCCC" w:sz="1"/>
+              <w:bottom w:val="single" w:color="CCCCCC" w:sz="1"/>
+              <w:right w:val="single" w:color="CCCCCC" w:sz="1"/>
+            </w:tcBorders>
+            <w:tcMar>
+              <w:top w:type="dxa" w:w="80"/>
+              <w:left w:type="dxa" w:w="120"/>
+              <w:bottom w:type="dxa" w:w="80"/>
+              <w:right w:type="dxa" w:w="120"/>
+            </w:tcMar>
+          </w:tcPr>
+          <w:p>
+            <w:pPr>
+              <w:jc w:val="left"/>
+            </w:pPr>
+            <w:r>
+              <w:rPr>
+                <w:rFonts w:ascii="Arial" w:cs="Arial" w:eastAsia="Arial" w:hAnsi="Arial"/>
+                <w:b w:val="false"/>
+                <w:bCs w:val="false"/>
+                <w:color w:val="222222"/>
+                <w:sz w:val="19"/>
+                <w:szCs w:val="19"/>
+              </w:rPr>
+              <w:t xml:space="preserve">Railway (Backend + PostgreSQL DB)</w:t>
+            </w:r>
+          </w:p>
+        </w:tc>
+        <w:tc>
+          <w:tcPr>
+            <w:tcW w:type="dxa" w:w="1800"/>
+            <w:tcBorders>
+              <w:top w:val="single" w:color="CCCCCC" w:sz="1"/>
+              <w:left w:val="single" w:color="CCCCCC" w:sz="1"/>
+              <w:bottom w:val="single" w:color="CCCCCC" w:sz="1"/>
+              <w:right w:val="single" w:color="CCCCCC" w:sz="1"/>
+            </w:tcBorders>
+            <w:tcMar>
+              <w:top w:type="dxa" w:w="80"/>
+              <w:left w:type="dxa" w:w="120"/>
+              <w:bottom w:type="dxa" w:w="80"/>
+              <w:right w:type="dxa" w:w="120"/>
+            </w:tcMar>
+          </w:tcPr>
+          <w:p>
+            <w:pPr>
+              <w:jc w:val="left"/>
+            </w:pPr>
+            <w:r>
+              <w:rPr>
+                <w:rFonts w:ascii="Arial" w:cs="Arial" w:eastAsia="Arial" w:hAnsi="Arial"/>
+                <w:b w:val="false"/>
+                <w:bCs w:val="false"/>
+                <w:color w:val="222222"/>
+                <w:sz w:val="19"/>
+                <w:szCs w:val="19"/>
+              </w:rPr>
+              <w:t xml:space="preserve">$20 – $50/month</w:t>
+            </w:r>
+          </w:p>
+        </w:tc>
+        <w:tc>
+          <w:tcPr>
+            <w:tcW w:type="dxa" w:w="2000"/>
+            <w:tcBorders>
+              <w:top w:val="single" w:color="CCCCCC" w:sz="1"/>
+              <w:left w:val="single" w:color="CCCCCC" w:sz="1"/>
+              <w:bottom w:val="single" w:color="CCCCCC" w:sz="1"/>
+              <w:right w:val="single" w:color="CCCCCC" w:sz="1"/>
+            </w:tcBorders>
+            <w:tcMar>
+              <w:top w:type="dxa" w:w="80"/>
+              <w:left w:type="dxa" w:w="120"/>
+              <w:bottom w:type="dxa" w:w="80"/>
+              <w:right w:type="dxa" w:w="120"/>
+            </w:tcMar>
+          </w:tcPr>
+          <w:p>
+            <w:pPr>
+              <w:jc w:val="left"/>
+            </w:pPr>
+            <w:r>
+              <w:rPr>
+                <w:rFonts w:ascii="Arial" w:cs="Arial" w:eastAsia="Arial" w:hAnsi="Arial"/>
+                <w:b w:val="false"/>
+                <w:bCs w:val="false"/>
+                <w:color w:val="222222"/>
+                <w:sz w:val="19"/>
+                <w:szCs w:val="19"/>
+              </w:rPr>
+              <w:t xml:space="preserve">Client</w:t>
+            </w:r>
+          </w:p>
+        </w:tc>
+        <w:tc>
+          <w:tcPr>
+            <w:tcW w:type="dxa" w:w="2760"/>
+            <w:tcBorders>
+              <w:top w:val="single" w:color="CCCCCC" w:sz="1"/>
+              <w:left w:val="single" w:color="CCCCCC" w:sz="1"/>
+              <w:bottom w:val="single" w:color="CCCCCC" w:sz="1"/>
+              <w:right w:val="single" w:color="CCCCCC" w:sz="1"/>
+            </w:tcBorders>
+            <w:tcMar>
+              <w:top w:type="dxa" w:w="80"/>
+              <w:left w:type="dxa" w:w="120"/>
+              <w:bottom w:type="dxa" w:w="80"/>
+              <w:right w:type="dxa" w:w="120"/>
+            </w:tcMar>
+          </w:tcPr>
+          <w:p>
+            <w:pPr>
+              <w:jc w:val="left"/>
+            </w:pPr>
+            <w:r>
+              <w:rPr>
+                <w:rFonts w:ascii="Arial" w:cs="Arial" w:eastAsia="Arial" w:hAnsi="Arial"/>
+                <w:b w:val="false"/>
+                <w:bCs w:val="false"/>
+                <w:color w:val="222222"/>
+                <w:sz w:val="19"/>
+                <w:szCs w:val="19"/>
+              </w:rPr>
+              <w:t xml:space="preserve">Pro plan recommended. $20 minimum; actual cost depends on server load.</w:t>
+            </w:r>
+          </w:p>
+        </w:tc>
+      </w:tr>
+      <w:tr>
+        <w:tc>
+          <w:tcPr>
+            <w:tcW w:type="dxa" w:w="2800"/>
+            <w:tcBorders>
+              <w:top w:val="single" w:color="CCCCCC" w:sz="1"/>
+              <w:left w:val="single" w:color="CCCCCC" w:sz="1"/>
+              <w:bottom w:val="single" w:color="CCCCCC" w:sz="1"/>
+              <w:right w:val="single" w:color="CCCCCC" w:sz="1"/>
+            </w:tcBorders>
+            <w:shd w:fill="D6F0DC" w:val="clear"/>
+            <w:tcMar>
+              <w:top w:type="dxa" w:w="80"/>
+              <w:left w:type="dxa" w:w="120"/>
+              <w:bottom w:type="dxa" w:w="80"/>
+              <w:right w:type="dxa" w:w="120"/>
+            </w:tcMar>
+          </w:tcPr>
+          <w:p>
+            <w:pPr>
+              <w:jc w:val="left"/>
+            </w:pPr>
+            <w:r>
+              <w:rPr>
+                <w:rFonts w:ascii="Arial" w:cs="Arial" w:eastAsia="Arial" w:hAnsi="Arial"/>
+                <w:b w:val="false"/>
+                <w:bCs w:val="false"/>
+                <w:color w:val="222222"/>
+                <w:sz w:val="19"/>
+                <w:szCs w:val="19"/>
+              </w:rPr>
+              <w:t xml:space="preserve">Vercel (Frontend Hosting)</w:t>
+            </w:r>
+          </w:p>
+        </w:tc>
+        <w:tc>
+          <w:tcPr>
+            <w:tcW w:type="dxa" w:w="1800"/>
+            <w:tcBorders>
+              <w:top w:val="single" w:color="CCCCCC" w:sz="1"/>
+              <w:left w:val="single" w:color="CCCCCC" w:sz="1"/>
+              <w:bottom w:val="single" w:color="CCCCCC" w:sz="1"/>
+              <w:right w:val="single" w:color="CCCCCC" w:sz="1"/>
+            </w:tcBorders>
+            <w:shd w:fill="D6F0DC" w:val="clear"/>
+            <w:tcMar>
+              <w:top w:type="dxa" w:w="80"/>
+              <w:left w:type="dxa" w:w="120"/>
+              <w:bottom w:type="dxa" w:w="80"/>
+              <w:right w:type="dxa" w:w="120"/>
+            </w:tcMar>
+          </w:tcPr>
+          <w:p>
+            <w:pPr>
+              <w:jc w:val="left"/>
+            </w:pPr>
+            <w:r>
+              <w:rPr>
+                <w:rFonts w:ascii="Arial" w:cs="Arial" w:eastAsia="Arial" w:hAnsi="Arial"/>
+                <w:b w:val="false"/>
+                <w:bCs w:val="false"/>
+                <w:color w:val="222222"/>
+                <w:sz w:val="19"/>
+                <w:szCs w:val="19"/>
+              </w:rPr>
+              <w:t xml:space="preserve">$0 (FREE)</w:t>
+            </w:r>
+          </w:p>
+        </w:tc>
+        <w:tc>
+          <w:tcPr>
+            <w:tcW w:type="dxa" w:w="2000"/>
+            <w:tcBorders>
+              <w:top w:val="single" w:color="CCCCCC" w:sz="1"/>
+              <w:left w:val="single" w:color="CCCCCC" w:sz="1"/>
+              <w:bottom w:val="single" w:color="CCCCCC" w:sz="1"/>
+              <w:right w:val="single" w:color="CCCCCC" w:sz="1"/>
+            </w:tcBorders>
+            <w:shd w:fill="D6F0DC" w:val="clear"/>
+            <w:tcMar>
+              <w:top w:type="dxa" w:w="80"/>
+              <w:left w:type="dxa" w:w="120"/>
+              <w:bottom w:type="dxa" w:w="80"/>
+              <w:right w:type="dxa" w:w="120"/>
+            </w:tcMar>
+          </w:tcPr>
+          <w:p>
+            <w:pPr>
+              <w:jc w:val="left"/>
+            </w:pPr>
+            <w:r>
+              <w:rPr>
+                <w:rFonts w:ascii="Arial" w:cs="Arial" w:eastAsia="Arial" w:hAnsi="Arial"/>
+                <w:b w:val="false"/>
+                <w:bCs w:val="false"/>
+                <w:color w:val="222222"/>
+                <w:sz w:val="19"/>
+                <w:szCs w:val="19"/>
+              </w:rPr>
+              <w:t xml:space="preserve">Monjez Agency</w:t>
+            </w:r>
+          </w:p>
+        </w:tc>
+        <w:tc>
+          <w:tcPr>
+            <w:tcW w:type="dxa" w:w="2760"/>
+            <w:tcBorders>
+              <w:top w:val="single" w:color="CCCCCC" w:sz="1"/>
+              <w:left w:val="single" w:color="CCCCCC" w:sz="1"/>
+              <w:bottom w:val="single" w:color="CCCCCC" w:sz="1"/>
+              <w:right w:val="single" w:color="CCCCCC" w:sz="1"/>
+            </w:tcBorders>
+            <w:shd w:fill="D6F0DC" w:val="clear"/>
+            <w:tcMar>
+              <w:top w:type="dxa" w:w="80"/>
+              <w:left w:type="dxa" w:w="120"/>
+              <w:bottom w:type="dxa" w:w="80"/>
+              <w:right w:type="dxa" w:w="120"/>
+            </w:tcMar>
+          </w:tcPr>
+          <w:p>
+            <w:pPr>
+              <w:jc w:val="left"/>
+            </w:pPr>
+            <w:r>
+              <w:rPr>
+                <w:rFonts w:ascii="Arial" w:cs="Arial" w:eastAsia="Arial" w:hAnsi="Arial"/>
+                <w:b w:val="false"/>
+                <w:bCs w:val="false"/>
+                <w:color w:val="222222"/>
+                <w:sz w:val="19"/>
+                <w:szCs w:val="19"/>
+              </w:rPr>
+              <w:t xml:space="preserve">Already handled by us. Client does not need to pay anything.</w:t>
+            </w:r>
+          </w:p>
+        </w:tc>
+      </w:tr>
+      <w:tr>
+        <w:tc>
+          <w:tcPr>
+            <w:tcW w:type="dxa" w:w="2800"/>
+            <w:tcBorders>
+              <w:top w:val="single" w:color="CCCCCC" w:sz="1"/>
+              <w:left w:val="single" w:color="CCCCCC" w:sz="1"/>
+              <w:bottom w:val="single" w:color="CCCCCC" w:sz="1"/>
+              <w:right w:val="single" w:color="CCCCCC" w:sz="1"/>
+            </w:tcBorders>
+            <w:tcMar>
+              <w:top w:type="dxa" w:w="80"/>
+              <w:left w:type="dxa" w:w="120"/>
+              <w:bottom w:type="dxa" w:w="80"/>
+              <w:right w:type="dxa" w:w="120"/>
+            </w:tcMar>
+          </w:tcPr>
+          <w:p>
+            <w:pPr>
+              <w:jc w:val="left"/>
+            </w:pPr>
+            <w:r>
+              <w:rPr>
+                <w:rFonts w:ascii="Arial" w:cs="Arial" w:eastAsia="Arial" w:hAnsi="Arial"/>
+                <w:b w:val="false"/>
+                <w:bCs w:val="false"/>
+                <w:color w:val="222222"/>
+                <w:sz w:val="19"/>
+                <w:szCs w:val="19"/>
+              </w:rPr>
+              <w:t xml:space="preserve">Stripe — Transaction Fees</w:t>
+            </w:r>
+          </w:p>
+        </w:tc>
+        <w:tc>
+          <w:tcPr>
+            <w:tcW w:type="dxa" w:w="1800"/>
+            <w:tcBorders>
+              <w:top w:val="single" w:color="CCCCCC" w:sz="1"/>
+              <w:left w:val="single" w:color="CCCCCC" w:sz="1"/>
+              <w:bottom w:val="single" w:color="CCCCCC" w:sz="1"/>
+              <w:right w:val="single" w:color="CCCCCC" w:sz="1"/>
+            </w:tcBorders>
+            <w:tcMar>
+              <w:top w:type="dxa" w:w="80"/>
+              <w:left w:type="dxa" w:w="120"/>
+              <w:bottom w:type="dxa" w:w="80"/>
+              <w:right w:type="dxa" w:w="120"/>
+            </w:tcMar>
+          </w:tcPr>
+          <w:p>
+            <w:pPr>
+              <w:jc w:val="left"/>
+            </w:pPr>
+            <w:r>
+              <w:rPr>
+                <w:rFonts w:ascii="Arial" w:cs="Arial" w:eastAsia="Arial" w:hAnsi="Arial"/>
+                <w:b w:val="false"/>
+                <w:bCs w:val="false"/>
+                <w:color w:val="222222"/>
+                <w:sz w:val="19"/>
+                <w:szCs w:val="19"/>
+              </w:rPr>
+              <w:t xml:space="preserve">~3.2% per order</w:t>
+            </w:r>
+          </w:p>
+        </w:tc>
+        <w:tc>
+          <w:tcPr>
+            <w:tcW w:type="dxa" w:w="2000"/>
+            <w:tcBorders>
+              <w:top w:val="single" w:color="CCCCCC" w:sz="1"/>
+              <w:left w:val="single" w:color="CCCCCC" w:sz="1"/>
+              <w:bottom w:val="single" w:color="CCCCCC" w:sz="1"/>
+              <w:right w:val="single" w:color="CCCCCC" w:sz="1"/>
+            </w:tcBorders>
+            <w:tcMar>
+              <w:top w:type="dxa" w:w="80"/>
+              <w:left w:type="dxa" w:w="120"/>
+              <w:bottom w:type="dxa" w:w="80"/>
+              <w:right w:type="dxa" w:w="120"/>
+            </w:tcMar>
+          </w:tcPr>
+          <w:p>
+            <w:pPr>
+              <w:jc w:val="left"/>
+            </w:pPr>
+            <w:r>
+              <w:rPr>
+                <w:rFonts w:ascii="Arial" w:cs="Arial" w:eastAsia="Arial" w:hAnsi="Arial"/>
+                <w:b w:val="false"/>
+                <w:bCs w:val="false"/>
+                <w:color w:val="222222"/>
+                <w:sz w:val="19"/>
+                <w:szCs w:val="19"/>
+              </w:rPr>
+              <w:t xml:space="preserve">Deducted from orders</w:t>
+            </w:r>
+          </w:p>
+        </w:tc>
+        <w:tc>
+          <w:tcPr>
+            <w:tcW w:type="dxa" w:w="2760"/>
+            <w:tcBorders>
+              <w:top w:val="single" w:color="CCCCCC" w:sz="1"/>
+              <w:left w:val="single" w:color="CCCCCC" w:sz="1"/>
+              <w:bottom w:val="single" w:color="CCCCCC" w:sz="1"/>
+              <w:right w:val="single" w:color="CCCCCC" w:sz="1"/>
+            </w:tcBorders>
+            <w:tcMar>
+              <w:top w:type="dxa" w:w="80"/>
+              <w:left w:type="dxa" w:w="120"/>
+              <w:bottom w:type="dxa" w:w="80"/>
+              <w:right w:type="dxa" w:w="120"/>
+            </w:tcMar>
+          </w:tcPr>
+          <w:p>
+            <w:pPr>
+              <w:jc w:val="left"/>
+            </w:pPr>
+            <w:r>
+              <w:rPr>
+                <w:rFonts w:ascii="Arial" w:cs="Arial" w:eastAsia="Arial" w:hAnsi="Arial"/>
+                <w:b w:val="false"/>
+                <w:bCs w:val="false"/>
+                <w:color w:val="222222"/>
+                <w:sz w:val="19"/>
+                <w:szCs w:val="19"/>
+              </w:rPr>
+              <w:t xml:space="preserve">2.9% + €0.30 per card charge + 0.25% per supplier payout. No monthly fee. Paid from each transaction automatically.</w:t>
+            </w:r>
+          </w:p>
+        </w:tc>
+      </w:tr>
+      <w:tr>
+        <w:tc>
+          <w:tcPr>
+            <w:tcW w:type="dxa" w:w="2800"/>
+            <w:tcBorders>
+              <w:top w:val="single" w:color="CCCCCC" w:sz="1"/>
+              <w:left w:val="single" w:color="CCCCCC" w:sz="1"/>
+              <w:bottom w:val="single" w:color="CCCCCC" w:sz="1"/>
+              <w:right w:val="single" w:color="CCCCCC" w:sz="1"/>
+            </w:tcBorders>
+            <w:shd w:fill="F0F4F8" w:val="clear"/>
+            <w:tcMar>
+              <w:top w:type="dxa" w:w="80"/>
+              <w:left w:type="dxa" w:w="120"/>
+              <w:bottom w:type="dxa" w:w="80"/>
+              <w:right w:type="dxa" w:w="120"/>
+            </w:tcMar>
+          </w:tcPr>
+          <w:p>
+            <w:pPr>
+              <w:jc w:val="left"/>
+            </w:pPr>
+            <w:r>
+              <w:rPr>
+                <w:rFonts w:ascii="Arial" w:cs="Arial" w:eastAsia="Arial" w:hAnsi="Arial"/>
+                <w:b w:val="false"/>
+                <w:bCs w:val="false"/>
+                <w:color w:val="222222"/>
+                <w:sz w:val="19"/>
+                <w:szCs w:val="19"/>
+              </w:rPr>
+              <w:t xml:space="preserve">Hostinger Email (SMTP)</w:t>
+            </w:r>
+          </w:p>
+        </w:tc>
+        <w:tc>
+          <w:tcPr>
+            <w:tcW w:type="dxa" w:w="1800"/>
+            <w:tcBorders>
+              <w:top w:val="single" w:color="CCCCCC" w:sz="1"/>
+              <w:left w:val="single" w:color="CCCCCC" w:sz="1"/>
+              <w:bottom w:val="single" w:color="CCCCCC" w:sz="1"/>
+              <w:right w:val="single" w:color="CCCCCC" w:sz="1"/>
+            </w:tcBorders>
+            <w:shd w:fill="F0F4F8" w:val="clear"/>
+            <w:tcMar>
+              <w:top w:type="dxa" w:w="80"/>
+              <w:left w:type="dxa" w:w="120"/>
+              <w:bottom w:type="dxa" w:w="80"/>
+              <w:right w:type="dxa" w:w="120"/>
+            </w:tcMar>
+          </w:tcPr>
+          <w:p>
+            <w:pPr>
+              <w:jc w:val="left"/>
+            </w:pPr>
+            <w:r>
+              <w:rPr>
+                <w:rFonts w:ascii="Arial" w:cs="Arial" w:eastAsia="Arial" w:hAnsi="Arial"/>
+                <w:b w:val="false"/>
+                <w:bCs w:val="false"/>
+                <w:color w:val="222222"/>
+                <w:sz w:val="19"/>
+                <w:szCs w:val="19"/>
+              </w:rPr>
+              <w:t xml:space="preserve">Included</w:t>
+            </w:r>
+          </w:p>
+        </w:tc>
+        <w:tc>
+          <w:tcPr>
+            <w:tcW w:type="dxa" w:w="2000"/>
+            <w:tcBorders>
+              <w:top w:val="single" w:color="CCCCCC" w:sz="1"/>
+              <w:left w:val="single" w:color="CCCCCC" w:sz="1"/>
+              <w:bottom w:val="single" w:color="CCCCCC" w:sz="1"/>
+              <w:right w:val="single" w:color="CCCCCC" w:sz="1"/>
+            </w:tcBorders>
+            <w:shd w:fill="F0F4F8" w:val="clear"/>
+            <w:tcMar>
+              <w:top w:type="dxa" w:w="80"/>
+              <w:left w:type="dxa" w:w="120"/>
+              <w:bottom w:type="dxa" w:w="80"/>
+              <w:right w:type="dxa" w:w="120"/>
+            </w:tcMar>
+          </w:tcPr>
+          <w:p>
+            <w:pPr>
+              <w:jc w:val="left"/>
+            </w:pPr>
+            <w:r>
+              <w:rPr>
+                <w:rFonts w:ascii="Arial" w:cs="Arial" w:eastAsia="Arial" w:hAnsi="Arial"/>
+                <w:b w:val="false"/>
+                <w:bCs w:val="false"/>
+                <w:color w:val="222222"/>
+                <w:sz w:val="19"/>
+                <w:szCs w:val="19"/>
+              </w:rPr>
+              <w:t xml:space="preserve">Already paid by client</w:t>
+            </w:r>
+          </w:p>
+        </w:tc>
+        <w:tc>
+          <w:tcPr>
+            <w:tcW w:type="dxa" w:w="2760"/>
+            <w:tcBorders>
+              <w:top w:val="single" w:color="CCCCCC" w:sz="1"/>
+              <w:left w:val="single" w:color="CCCCCC" w:sz="1"/>
+              <w:bottom w:val="single" w:color="CCCCCC" w:sz="1"/>
+              <w:right w:val="single" w:color="CCCCCC" w:sz="1"/>
+            </w:tcBorders>
+            <w:shd w:fill="F0F4F8" w:val="clear"/>
+            <w:tcMar>
+              <w:top w:type="dxa" w:w="80"/>
+              <w:left w:type="dxa" w:w="120"/>
+              <w:bottom w:type="dxa" w:w="80"/>
+              <w:right w:type="dxa" w:w="120"/>
+            </w:tcMar>
+          </w:tcPr>
+          <w:p>
+            <w:pPr>
+              <w:jc w:val="left"/>
+            </w:pPr>
+            <w:r>
+              <w:rPr>
+                <w:rFonts w:ascii="Arial" w:cs="Arial" w:eastAsia="Arial" w:hAnsi="Arial"/>
+                <w:b w:val="false"/>
+                <w:bCs w:val="false"/>
+                <w:color w:val="222222"/>
+                <w:sz w:val="19"/>
+                <w:szCs w:val="19"/>
+              </w:rPr>
+              <w:t xml:space="preserve">Part of existing Atlantis Hostinger hosting plan. No extra cost.</w:t>
+            </w:r>
+          </w:p>
+        </w:tc>
+      </w:tr>
+      <w:tr>
+        <w:tc>
+          <w:tcPr>
+            <w:tcW w:type="dxa" w:w="2800"/>
+            <w:tcBorders>
+              <w:top w:val="single" w:color="CCCCCC" w:sz="1"/>
+              <w:left w:val="single" w:color="CCCCCC" w:sz="1"/>
+              <w:bottom w:val="single" w:color="CCCCCC" w:sz="1"/>
+              <w:right w:val="single" w:color="CCCCCC" w:sz="1"/>
+            </w:tcBorders>
+            <w:tcMar>
+              <w:top w:type="dxa" w:w="80"/>
+              <w:left w:type="dxa" w:w="120"/>
+              <w:bottom w:type="dxa" w:w="80"/>
+              <w:right w:type="dxa" w:w="120"/>
+            </w:tcMar>
+          </w:tcPr>
+          <w:p>
+            <w:pPr>
+              <w:jc w:val="left"/>
+            </w:pPr>
+            <w:r>
+              <w:rPr>
+                <w:rFonts w:ascii="Arial" w:cs="Arial" w:eastAsia="Arial" w:hAnsi="Arial"/>
+                <w:b w:val="false"/>
+                <w:bCs w:val="false"/>
+                <w:color w:val="222222"/>
+                <w:sz w:val="19"/>
+                <w:szCs w:val="19"/>
+              </w:rPr>
+              <w:t xml:space="preserve">Resend (Email Fallback)</w:t>
+            </w:r>
+          </w:p>
+        </w:tc>
+        <w:tc>
+          <w:tcPr>
+            <w:tcW w:type="dxa" w:w="1800"/>
+            <w:tcBorders>
+              <w:top w:val="single" w:color="CCCCCC" w:sz="1"/>
+              <w:left w:val="single" w:color="CCCCCC" w:sz="1"/>
+              <w:bottom w:val="single" w:color="CCCCCC" w:sz="1"/>
+              <w:right w:val="single" w:color="CCCCCC" w:sz="1"/>
+            </w:tcBorders>
+            <w:tcMar>
+              <w:top w:type="dxa" w:w="80"/>
+              <w:left w:type="dxa" w:w="120"/>
+              <w:bottom w:type="dxa" w:w="80"/>
+              <w:right w:type="dxa" w:w="120"/>
+            </w:tcMar>
+          </w:tcPr>
+          <w:p>
+            <w:pPr>
+              <w:jc w:val="left"/>
+            </w:pPr>
+            <w:r>
+              <w:rPr>
+                <w:rFonts w:ascii="Arial" w:cs="Arial" w:eastAsia="Arial" w:hAnsi="Arial"/>
+                <w:b w:val="false"/>
+                <w:bCs w:val="false"/>
+                <w:color w:val="222222"/>
+                <w:sz w:val="19"/>
+                <w:szCs w:val="19"/>
+              </w:rPr>
+              <w:t xml:space="preserve">$0 (FREE)</w:t>
+            </w:r>
+          </w:p>
+        </w:tc>
+        <w:tc>
+          <w:tcPr>
+            <w:tcW w:type="dxa" w:w="2000"/>
+            <w:tcBorders>
+              <w:top w:val="single" w:color="CCCCCC" w:sz="1"/>
+              <w:left w:val="single" w:color="CCCCCC" w:sz="1"/>
+              <w:bottom w:val="single" w:color="CCCCCC" w:sz="1"/>
+              <w:right w:val="single" w:color="CCCCCC" w:sz="1"/>
+            </w:tcBorders>
+            <w:tcMar>
+              <w:top w:type="dxa" w:w="80"/>
+              <w:left w:type="dxa" w:w="120"/>
+              <w:bottom w:type="dxa" w:w="80"/>
+              <w:right w:type="dxa" w:w="120"/>
+            </w:tcMar>
+          </w:tcPr>
+          <w:p>
+            <w:pPr>
+              <w:jc w:val="left"/>
+            </w:pPr>
+            <w:r>
+              <w:rPr>
+                <w:rFonts w:ascii="Arial" w:cs="Arial" w:eastAsia="Arial" w:hAnsi="Arial"/>
+                <w:b w:val="false"/>
+                <w:bCs w:val="false"/>
+                <w:color w:val="222222"/>
+                <w:sz w:val="19"/>
+                <w:szCs w:val="19"/>
+              </w:rPr>
+              <w:t xml:space="preserve">Monjez Agency</w:t>
+            </w:r>
+          </w:p>
+        </w:tc>
+        <w:tc>
+          <w:tcPr>
+            <w:tcW w:type="dxa" w:w="2760"/>
+            <w:tcBorders>
+              <w:top w:val="single" w:color="CCCCCC" w:sz="1"/>
+              <w:left w:val="single" w:color="CCCCCC" w:sz="1"/>
+              <w:bottom w:val="single" w:color="CCCCCC" w:sz="1"/>
+              <w:right w:val="single" w:color="CCCCCC" w:sz="1"/>
+            </w:tcBorders>
+            <w:tcMar>
+              <w:top w:type="dxa" w:w="80"/>
+              <w:left w:type="dxa" w:w="120"/>
+              <w:bottom w:type="dxa" w:w="80"/>
+              <w:right w:type="dxa" w:w="120"/>
+            </w:tcMar>
+          </w:tcPr>
+          <w:p>
+            <w:pPr>
+              <w:jc w:val="left"/>
+            </w:pPr>
+            <w:r>
+              <w:rPr>
+                <w:rFonts w:ascii="Arial" w:cs="Arial" w:eastAsia="Arial" w:hAnsi="Arial"/>
+                <w:b w:val="false"/>
+                <w:bCs w:val="false"/>
+                <w:color w:val="222222"/>
+                <w:sz w:val="19"/>
+                <w:szCs w:val="19"/>
+              </w:rPr>
+              <w:t xml:space="preserve">Free tier: 100 emails/day. Sufficient for most use cases.</w:t>
+            </w:r>
+          </w:p>
+        </w:tc>
+      </w:tr>
+      <w:tr>
+        <w:tc>
+          <w:tcPr>
+            <w:tcW w:type="dxa" w:w="2800"/>
+            <w:tcBorders>
+              <w:top w:val="single" w:color="CCCCCC" w:sz="1"/>
+              <w:left w:val="single" w:color="CCCCCC" w:sz="1"/>
+              <w:bottom w:val="single" w:color="CCCCCC" w:sz="1"/>
+              <w:right w:val="single" w:color="CCCCCC" w:sz="1"/>
+            </w:tcBorders>
+            <w:shd w:fill="FFF8D6" w:val="clear"/>
+            <w:tcMar>
+              <w:top w:type="dxa" w:w="80"/>
+              <w:left w:type="dxa" w:w="120"/>
+              <w:bottom w:type="dxa" w:w="80"/>
+              <w:right w:type="dxa" w:w="120"/>
+            </w:tcMar>
+          </w:tcPr>
+          <w:p>
+            <w:pPr>
+              <w:jc w:val="left"/>
+            </w:pPr>
+            <w:r>
+              <w:rPr>
+                <w:rFonts w:ascii="Arial" w:cs="Arial" w:eastAsia="Arial" w:hAnsi="Arial"/>
+                <w:b w:val="false"/>
+                <w:bCs w:val="false"/>
+                <w:color w:val="222222"/>
+                <w:sz w:val="19"/>
+                <w:szCs w:val="19"/>
+              </w:rPr>
+              <w:t xml:space="preserve">OpenRouter — AI (Claude Opus Model)</w:t>
+            </w:r>
+          </w:p>
+        </w:tc>
+        <w:tc>
+          <w:tcPr>
+            <w:tcW w:type="dxa" w:w="1800"/>
+            <w:tcBorders>
+              <w:top w:val="single" w:color="CCCCCC" w:sz="1"/>
+              <w:left w:val="single" w:color="CCCCCC" w:sz="1"/>
+              <w:bottom w:val="single" w:color="CCCCCC" w:sz="1"/>
+              <w:right w:val="single" w:color="CCCCCC" w:sz="1"/>
+            </w:tcBorders>
+            <w:shd w:fill="FFF8D6" w:val="clear"/>
+            <w:tcMar>
+              <w:top w:type="dxa" w:w="80"/>
+              <w:left w:type="dxa" w:w="120"/>
+              <w:bottom w:type="dxa" w:w="80"/>
+              <w:right w:type="dxa" w:w="120"/>
+            </w:tcMar>
+          </w:tcPr>
+          <w:p>
+            <w:pPr>
+              <w:jc w:val="left"/>
+            </w:pPr>
+            <w:r>
+              <w:rPr>
+                <w:rFonts w:ascii="Arial" w:cs="Arial" w:eastAsia="Arial" w:hAnsi="Arial"/>
+                <w:b w:val="false"/>
+                <w:bCs w:val="false"/>
+                <w:color w:val="222222"/>
+                <w:sz w:val="19"/>
+                <w:szCs w:val="19"/>
+              </w:rPr>
+              <w:t xml:space="preserve">$300 – $700/month</w:t>
+            </w:r>
+          </w:p>
+        </w:tc>
+        <w:tc>
+          <w:tcPr>
+            <w:tcW w:type="dxa" w:w="2000"/>
+            <w:tcBorders>
+              <w:top w:val="single" w:color="CCCCCC" w:sz="1"/>
+              <w:left w:val="single" w:color="CCCCCC" w:sz="1"/>
+              <w:bottom w:val="single" w:color="CCCCCC" w:sz="1"/>
+              <w:right w:val="single" w:color="CCCCCC" w:sz="1"/>
+            </w:tcBorders>
+            <w:shd w:fill="FFF8D6" w:val="clear"/>
+            <w:tcMar>
+              <w:top w:type="dxa" w:w="80"/>
+              <w:left w:type="dxa" w:w="120"/>
+              <w:bottom w:type="dxa" w:w="80"/>
+              <w:right w:type="dxa" w:w="120"/>
+            </w:tcMar>
+          </w:tcPr>
+          <w:p>
+            <w:pPr>
+              <w:jc w:val="left"/>
+            </w:pPr>
+            <w:r>
+              <w:rPr>
+                <w:rFonts w:ascii="Arial" w:cs="Arial" w:eastAsia="Arial" w:hAnsi="Arial"/>
+                <w:b w:val="false"/>
+                <w:bCs w:val="false"/>
+                <w:color w:val="222222"/>
+                <w:sz w:val="19"/>
+                <w:szCs w:val="19"/>
+              </w:rPr>
+              <w:t xml:space="preserve">Client</w:t>
+            </w:r>
+          </w:p>
+        </w:tc>
+        <w:tc>
+          <w:tcPr>
+            <w:tcW w:type="dxa" w:w="2760"/>
+            <w:tcBorders>
+              <w:top w:val="single" w:color="CCCCCC" w:sz="1"/>
+              <w:left w:val="single" w:color="CCCCCC" w:sz="1"/>
+              <w:bottom w:val="single" w:color="CCCCCC" w:sz="1"/>
+              <w:right w:val="single" w:color="CCCCCC" w:sz="1"/>
+            </w:tcBorders>
+            <w:shd w:fill="FFF8D6" w:val="clear"/>
+            <w:tcMar>
+              <w:top w:type="dxa" w:w="80"/>
+              <w:left w:type="dxa" w:w="120"/>
+              <w:bottom w:type="dxa" w:w="80"/>
+              <w:right w:type="dxa" w:w="120"/>
+            </w:tcMar>
+          </w:tcPr>
+          <w:p>
+            <w:pPr>
+              <w:jc w:val="left"/>
+            </w:pPr>
+            <w:r>
+              <w:rPr>
+                <w:rFonts w:ascii="Arial" w:cs="Arial" w:eastAsia="Arial" w:hAnsi="Arial"/>
+                <w:b w:val="false"/>
+                <w:bCs w:val="false"/>
+                <w:color w:val="222222"/>
+                <w:sz w:val="19"/>
+                <w:szCs w:val="19"/>
+              </w:rPr>
+              <w:t xml:space="preserve">The platform uses Claude Opus — an AI model selected specifically for its very high intelligence and accuracy. The AI works automatically behind the scenes: it analyzes every product on upload, writes product descriptions, fetches product images, runs pricing calculations, and powers the customer support chatbot. Each of these tasks consumes processing credits (tokens). At medium usage: ~$300–500/month. At high volume: ~$500–700/month.</w:t>
+            </w:r>
+          </w:p>
+        </w:tc>
+      </w:tr>
+      <w:tr>
+        <w:tc>
+          <w:tcPr>
+            <w:tcW w:type="dxa" w:w="2800"/>
+            <w:tcBorders>
+              <w:top w:val="single" w:color="CCCCCC" w:sz="1"/>
+              <w:left w:val="single" w:color="CCCCCC" w:sz="1"/>
+              <w:bottom w:val="single" w:color="CCCCCC" w:sz="1"/>
+              <w:right w:val="single" w:color="CCCCCC" w:sz="1"/>
+            </w:tcBorders>
+            <w:tcMar>
+              <w:top w:type="dxa" w:w="80"/>
+              <w:left w:type="dxa" w:w="120"/>
+              <w:bottom w:type="dxa" w:w="80"/>
+              <w:right w:type="dxa" w:w="120"/>
+            </w:tcMar>
+          </w:tcPr>
+          <w:p>
+            <w:pPr>
+              <w:jc w:val="left"/>
+            </w:pPr>
+            <w:r>
+              <w:rPr>
+                <w:rFonts w:ascii="Arial" w:cs="Arial" w:eastAsia="Arial" w:hAnsi="Arial"/>
+                <w:b w:val="false"/>
+                <w:bCs w:val="false"/>
+                <w:color w:val="222222"/>
+                <w:sz w:val="19"/>
+                <w:szCs w:val="19"/>
+              </w:rPr>
+              <w:t xml:space="preserve">EAN Barcode Search</w:t>
+            </w:r>
+          </w:p>
+        </w:tc>
+        <w:tc>
+          <w:tcPr>
+            <w:tcW w:type="dxa" w:w="1800"/>
+            <w:tcBorders>
+              <w:top w:val="single" w:color="CCCCCC" w:sz="1"/>
+              <w:left w:val="single" w:color="CCCCCC" w:sz="1"/>
+              <w:bottom w:val="single" w:color="CCCCCC" w:sz="1"/>
+              <w:right w:val="single" w:color="CCCCCC" w:sz="1"/>
+            </w:tcBorders>
+            <w:tcMar>
+              <w:top w:type="dxa" w:w="80"/>
+              <w:left w:type="dxa" w:w="120"/>
+              <w:bottom w:type="dxa" w:w="80"/>
+              <w:right w:type="dxa" w:w="120"/>
+            </w:tcMar>
+          </w:tcPr>
+          <w:p>
+            <w:pPr>
+              <w:jc w:val="left"/>
+            </w:pPr>
+            <w:r>
+              <w:rPr>
+                <w:rFonts w:ascii="Arial" w:cs="Arial" w:eastAsia="Arial" w:hAnsi="Arial"/>
+                <w:b w:val="false"/>
+                <w:bCs w:val="false"/>
+                <w:color w:val="222222"/>
+                <w:sz w:val="19"/>
+                <w:szCs w:val="19"/>
+              </w:rPr>
+              <w:t xml:space="preserve">$0 – $10/month</w:t>
+            </w:r>
+          </w:p>
+        </w:tc>
+        <w:tc>
+          <w:tcPr>
+            <w:tcW w:type="dxa" w:w="2000"/>
+            <w:tcBorders>
+              <w:top w:val="single" w:color="CCCCCC" w:sz="1"/>
+              <w:left w:val="single" w:color="CCCCCC" w:sz="1"/>
+              <w:bottom w:val="single" w:color="CCCCCC" w:sz="1"/>
+              <w:right w:val="single" w:color="CCCCCC" w:sz="1"/>
+            </w:tcBorders>
+            <w:tcMar>
+              <w:top w:type="dxa" w:w="80"/>
+              <w:left w:type="dxa" w:w="120"/>
+              <w:bottom w:type="dxa" w:w="80"/>
+              <w:right w:type="dxa" w:w="120"/>
+            </w:tcMar>
+          </w:tcPr>
+          <w:p>
+            <w:pPr>
+              <w:jc w:val="left"/>
+            </w:pPr>
+            <w:r>
+              <w:rPr>
+                <w:rFonts w:ascii="Arial" w:cs="Arial" w:eastAsia="Arial" w:hAnsi="Arial"/>
+                <w:b w:val="false"/>
+                <w:bCs w:val="false"/>
+                <w:color w:val="222222"/>
+                <w:sz w:val="19"/>
+                <w:szCs w:val="19"/>
+              </w:rPr>
+              <w:t xml:space="preserve">Client (if enabled)</w:t>
+            </w:r>
+          </w:p>
+        </w:tc>
+        <w:tc>
+          <w:tcPr>
+            <w:tcW w:type="dxa" w:w="2760"/>
+            <w:tcBorders>
+              <w:top w:val="single" w:color="CCCCCC" w:sz="1"/>
+              <w:left w:val="single" w:color="CCCCCC" w:sz="1"/>
+              <w:bottom w:val="single" w:color="CCCCCC" w:sz="1"/>
+              <w:right w:val="single" w:color="CCCCCC" w:sz="1"/>
+            </w:tcBorders>
+            <w:tcMar>
+              <w:top w:type="dxa" w:w="80"/>
+              <w:left w:type="dxa" w:w="120"/>
+              <w:bottom w:type="dxa" w:w="80"/>
+              <w:right w:type="dxa" w:w="120"/>
+            </w:tcMar>
+          </w:tcPr>
+          <w:p>
+            <w:pPr>
+              <w:jc w:val="left"/>
+            </w:pPr>
+            <w:r>
+              <w:rPr>
+                <w:rFonts w:ascii="Arial" w:cs="Arial" w:eastAsia="Arial" w:hAnsi="Arial"/>
+                <w:b w:val="false"/>
+                <w:bCs w:val="false"/>
+                <w:color w:val="222222"/>
+                <w:sz w:val="19"/>
+                <w:szCs w:val="19"/>
+              </w:rPr>
+              <w:t xml:space="preserve">OPTIONAL. For auto product image lookup by barcode. Free tier covers small catalogs.</w:t>
+            </w:r>
+          </w:p>
+        </w:tc>
+      </w:tr>
+      <w:tr>
+        <w:tc>
+          <w:tcPr>
+            <w:tcW w:type="dxa" w:w="2800"/>
+            <w:tcBorders>
+              <w:top w:val="single" w:color="CCCCCC" w:sz="1"/>
+              <w:left w:val="single" w:color="CCCCCC" w:sz="1"/>
+              <w:bottom w:val="single" w:color="CCCCCC" w:sz="1"/>
+              <w:right w:val="single" w:color="CCCCCC" w:sz="1"/>
+            </w:tcBorders>
+            <w:shd w:fill="F0F4F8" w:val="clear"/>
+            <w:tcMar>
+              <w:top w:type="dxa" w:w="80"/>
+              <w:left w:type="dxa" w:w="120"/>
+              <w:bottom w:type="dxa" w:w="80"/>
+              <w:right w:type="dxa" w:w="120"/>
+            </w:tcMar>
+          </w:tcPr>
+          <w:p>
+            <w:pPr>
+              <w:jc w:val="left"/>
+            </w:pPr>
+            <w:r>
+              <w:rPr>
+                <w:rFonts w:ascii="Arial" w:cs="Arial" w:eastAsia="Arial" w:hAnsi="Arial"/>
+                <w:b w:val="false"/>
+                <w:bCs w:val="false"/>
+                <w:color w:val="222222"/>
+                <w:sz w:val="19"/>
+                <w:szCs w:val="19"/>
+              </w:rPr>
+              <w:t xml:space="preserve">Custom Domain (optional)</w:t>
+            </w:r>
+          </w:p>
+        </w:tc>
+        <w:tc>
+          <w:tcPr>
+            <w:tcW w:type="dxa" w:w="1800"/>
+            <w:tcBorders>
+              <w:top w:val="single" w:color="CCCCCC" w:sz="1"/>
+              <w:left w:val="single" w:color="CCCCCC" w:sz="1"/>
+              <w:bottom w:val="single" w:color="CCCCCC" w:sz="1"/>
+              <w:right w:val="single" w:color="CCCCCC" w:sz="1"/>
+            </w:tcBorders>
+            <w:shd w:fill="F0F4F8" w:val="clear"/>
+            <w:tcMar>
+              <w:top w:type="dxa" w:w="80"/>
+              <w:left w:type="dxa" w:w="120"/>
+              <w:bottom w:type="dxa" w:w="80"/>
+              <w:right w:type="dxa" w:w="120"/>
+            </w:tcMar>
+          </w:tcPr>
+          <w:p>
+            <w:pPr>
+              <w:jc w:val="left"/>
+            </w:pPr>
+            <w:r>
+              <w:rPr>
+                <w:rFonts w:ascii="Arial" w:cs="Arial" w:eastAsia="Arial" w:hAnsi="Arial"/>
+                <w:b w:val="false"/>
+                <w:bCs w:val="false"/>
+                <w:color w:val="222222"/>
+                <w:sz w:val="19"/>
+                <w:szCs w:val="19"/>
+              </w:rPr>
+              <w:t xml:space="preserve">~€12/year (~€1/month)</w:t>
+            </w:r>
+          </w:p>
+        </w:tc>
+        <w:tc>
+          <w:tcPr>
+            <w:tcW w:type="dxa" w:w="2000"/>
+            <w:tcBorders>
+              <w:top w:val="single" w:color="CCCCCC" w:sz="1"/>
+              <w:left w:val="single" w:color="CCCCCC" w:sz="1"/>
+              <w:bottom w:val="single" w:color="CCCCCC" w:sz="1"/>
+              <w:right w:val="single" w:color="CCCCCC" w:sz="1"/>
+            </w:tcBorders>
+            <w:shd w:fill="F0F4F8" w:val="clear"/>
+            <w:tcMar>
+              <w:top w:type="dxa" w:w="80"/>
+              <w:left w:type="dxa" w:w="120"/>
+              <w:bottom w:type="dxa" w:w="80"/>
+              <w:right w:type="dxa" w:w="120"/>
+            </w:tcMar>
+          </w:tcPr>
+          <w:p>
+            <w:pPr>
+              <w:jc w:val="left"/>
+            </w:pPr>
+            <w:r>
+              <w:rPr>
+                <w:rFonts w:ascii="Arial" w:cs="Arial" w:eastAsia="Arial" w:hAnsi="Arial"/>
+                <w:b w:val="false"/>
+                <w:bCs w:val="false"/>
+                <w:color w:val="222222"/>
+                <w:sz w:val="19"/>
+                <w:szCs w:val="19"/>
+              </w:rPr>
+              <w:t xml:space="preserve">Client (if wanted)</w:t>
+            </w:r>
+          </w:p>
+        </w:tc>
+        <w:tc>
+          <w:tcPr>
+            <w:tcW w:type="dxa" w:w="2760"/>
+            <w:tcBorders>
+              <w:top w:val="single" w:color="CCCCCC" w:sz="1"/>
+              <w:left w:val="single" w:color="CCCCCC" w:sz="1"/>
+              <w:bottom w:val="single" w:color="CCCCCC" w:sz="1"/>
+              <w:right w:val="single" w:color="CCCCCC" w:sz="1"/>
+            </w:tcBorders>
+            <w:shd w:fill="F0F4F8" w:val="clear"/>
+            <w:tcMar>
+              <w:top w:type="dxa" w:w="80"/>
+              <w:left w:type="dxa" w:w="120"/>
+              <w:bottom w:type="dxa" w:w="80"/>
+              <w:right w:type="dxa" w:w="120"/>
+            </w:tcMar>
+          </w:tcPr>
+          <w:p>
+            <w:pPr>
+              <w:jc w:val="left"/>
+            </w:pPr>
+            <w:r>
+              <w:rPr>
+                <w:rFonts w:ascii="Arial" w:cs="Arial" w:eastAsia="Arial" w:hAnsi="Arial"/>
+                <w:b w:val="false"/>
+                <w:bCs w:val="false"/>
+                <w:color w:val="222222"/>
+                <w:sz w:val="19"/>
+                <w:szCs w:val="19"/>
+              </w:rPr>
+              <w:t xml:space="preserve">Only if client wants a custom domain like yourplatform.ro. We configure DNS for free.</w:t>
+            </w:r>
+          </w:p>
+        </w:tc>
+      </w:tr>
+    </w:tbl>
+    <w:p>
+      <w:r>
+        <w:t xml:space="preserve"/>
+      </w:r>
+    </w:p>
+    <w:tbl>
+      <w:tblPr>
+        <w:tblW w:type="dxa" w:w="9360"/>
+        <w:tblBorders>
+          <w:top w:val="single" w:color="auto" w:sz="4"/>
+          <w:left w:val="single" w:color="auto" w:sz="4"/>
+          <w:bottom w:val="single" w:color="auto" w:sz="4"/>
+          <w:right w:val="single" w:color="auto" w:sz="4"/>
+          <w:insideH w:val="single" w:color="auto" w:sz="4"/>
+          <w:insideV w:val="single" w:color="auto" w:sz="4"/>
+        </w:tblBorders>
+      </w:tblPr>
+      <w:tblGrid>
+        <w:gridCol w:w="4680"/>
+        <w:gridCol w:w="4680"/>
+      </w:tblGrid>
+      <w:tr>
+        <w:tc>
+          <w:tcPr>
+            <w:tcW w:type="dxa" w:w="4680"/>
+            <w:tcBorders>
+              <w:top w:val="single" w:color="CCCCCC" w:sz="1"/>
+              <w:left w:val="single" w:color="CCCCCC" w:sz="1"/>
+              <w:bottom w:val="single" w:color="CCCCCC" w:sz="1"/>
+              <w:right w:val="single" w:color="CCCCCC" w:sz="1"/>
+            </w:tcBorders>
+            <w:shd w:fill="1B3A5C" w:val="clear"/>
+            <w:tcMar>
+              <w:top w:type="dxa" w:w="80"/>
+              <w:left w:type="dxa" w:w="120"/>
+              <w:bottom w:type="dxa" w:w="80"/>
+              <w:right w:type="dxa" w:w="120"/>
+            </w:tcMar>
+          </w:tcPr>
+          <w:p>
+            <w:pPr>
+              <w:jc w:val="left"/>
+            </w:pPr>
+            <w:r>
+              <w:rPr>
+                <w:rFonts w:ascii="Arial" w:cs="Arial" w:eastAsia="Arial" w:hAnsi="Arial"/>
+                <w:b/>
+                <w:bCs/>
+                <w:color w:val="FFFFFF"/>
+                <w:sz w:val="19"/>
+                <w:szCs w:val="19"/>
+              </w:rPr>
+              <w:t xml:space="preserve">TOTAL ESTIMATED MONTHLY COST (client pays)</w:t>
+            </w:r>
+          </w:p>
+        </w:tc>
+        <w:tc>
+          <w:tcPr>
+            <w:tcW w:type="dxa" w:w="4680"/>
+            <w:tcBorders>
+              <w:top w:val="single" w:color="CCCCCC" w:sz="1"/>
+              <w:left w:val="single" w:color="CCCCCC" w:sz="1"/>
+              <w:bottom w:val="single" w:color="CCCCCC" w:sz="1"/>
+              <w:right w:val="single" w:color="CCCCCC" w:sz="1"/>
+            </w:tcBorders>
+            <w:shd w:fill="1B3A5C" w:val="clear"/>
+            <w:tcMar>
+              <w:top w:type="dxa" w:w="80"/>
+              <w:left w:type="dxa" w:w="120"/>
+              <w:bottom w:type="dxa" w:w="80"/>
+              <w:right w:type="dxa" w:w="120"/>
+            </w:tcMar>
+          </w:tcPr>
+          <w:p>
+            <w:pPr>
+              <w:jc w:val="left"/>
+            </w:pPr>
+            <w:r>
+              <w:rPr>
+                <w:rFonts w:ascii="Arial" w:cs="Arial" w:eastAsia="Arial" w:hAnsi="Arial"/>
+                <w:b/>
+                <w:bCs/>
+                <w:color w:val="FFFFFF"/>
+                <w:sz w:val="19"/>
+                <w:szCs w:val="19"/>
+              </w:rPr>
+              <w:t xml:space="preserve">~$350 – $750/month + Stripe fees per transaction</w:t>
+            </w:r>
+          </w:p>
+        </w:tc>
+      </w:tr>
+    </w:tbl>
+    <w:p>
+      <w:r>
+        <w:t xml:space="preserve"/>
+      </w:r>
+    </w:p>
+    <w:p>
+      <w:pPr>
+        <w:pBdr>
+          <w:top w:val="single" w:color="555555" w:sz="4" w:space="1"/>
+          <w:bottom w:val="single" w:color="555555" w:sz="4" w:space="1"/>
+          <w:left w:val="single" w:color="555555" w:sz="8" w:space="1"/>
+          <w:right w:val="single" w:color="555555" w:sz="4" w:space="1"/>
+        </w:pBdr>
+        <w:shd w:fill="F5F5F5" w:val="clear"/>
+        <w:spacing w:after="120" w:before="120"/>
+        <w:ind w:left="240" w:right="240"/>
+      </w:pPr>
+      <w:r>
+        <w:rPr>
+          <w:rFonts w:ascii="Arial" w:cs="Arial" w:eastAsia="Arial" w:hAnsi="Arial"/>
+          <w:b/>
+          <w:bCs/>
+          <w:color w:val="555555"/>
+          <w:sz w:val="20"/>
+          <w:szCs w:val="20"/>
+        </w:rPr>
+        <w:t xml:space="preserve">Cost breakdown summary: The largest cost driver is the AI at $300–700/month. The platform uses Claude Opus, chosen for its very high intelligence and accuracy. The AI works automatically behind the scenes on every product upload, description generation, image retrieval, pricing, and chatbot support. The more active the platform (more products, more orders, more customers), the higher the AI usage and cost. Railway (server) adds $20–50/month. Stripe fees come directly from each transaction as a percentage — they are not a fixed monthly charge.</w:t>
+      </w:r>
+    </w:p>
     <w:p>
       <w:r>
         <w:br w:type="page"/>
@@ -17898,7 +20723,7 @@
                 <w:sz w:val="19"/>
                 <w:szCs w:val="19"/>
               </w:rPr>
-              <w:t xml:space="preserve">AI chat is built but requires OPENROUTER_API_KEY. Client must decide if they want this feature and provide the key.</w:t>
+              <w:t xml:space="preserve">AI chat is built but requires OPENROUTER_API_KEY. Client must decide if they want this feature and provide the key. There is a per-message cost.</w:t>
             </w:r>
           </w:p>
         </w:tc>
@@ -25055,7 +27880,7 @@
           <w:sz w:val="19"/>
           <w:szCs w:val="19"/>
         </w:rPr>
-        <w:t xml:space="preserve">✅  Railway account created and backend deployed</w:t>
+        <w:t xml:space="preserve">✅  Railway Pro plan activated</w:t>
       </w:r>
     </w:p>
     <w:p>
@@ -25073,7 +27898,25 @@
           <w:sz w:val="19"/>
           <w:szCs w:val="19"/>
         </w:rPr>
-        <w:t xml:space="preserve">✅  Vercel account connected and frontend deployed</w:t>
+        <w:t xml:space="preserve">✅  Client email (Info@atlantisfmcg.com) invited to Railway project</w:t>
+      </w:r>
+    </w:p>
+    <w:p>
+      <w:pPr>
+        <w:pStyle w:val="ListParagraph"/>
+        <w:numPr>
+          <w:ilvl w:val="0"/>
+          <w:numId w:val="2"/>
+        </w:numPr>
+        <w:spacing w:after="40" w:before="40"/>
+      </w:pPr>
+      <w:r>
+        <w:rPr>
+          <w:rFonts w:ascii="Arial" w:cs="Arial" w:eastAsia="Arial" w:hAnsi="Arial"/>
+          <w:sz w:val="19"/>
+          <w:szCs w:val="19"/>
+        </w:rPr>
+        <w:t xml:space="preserve">✅  Backend deployed and running on Railway</w:t>
       </w:r>
     </w:p>
     <w:p>
@@ -25128,6 +27971,24 @@
           <w:szCs w:val="19"/>
         </w:rPr>
         <w:t xml:space="preserve">✅  Owner account seeded and password changed</w:t>
+      </w:r>
+    </w:p>
+    <w:p>
+      <w:pPr>
+        <w:pStyle w:val="ListParagraph"/>
+        <w:numPr>
+          <w:ilvl w:val="0"/>
+          <w:numId w:val="2"/>
+        </w:numPr>
+        <w:spacing w:after="40" w:before="40"/>
+      </w:pPr>
+      <w:r>
+        <w:rPr>
+          <w:rFonts w:ascii="Arial" w:cs="Arial" w:eastAsia="Arial" w:hAnsi="Arial"/>
+          <w:sz w:val="19"/>
+          <w:szCs w:val="19"/>
+        </w:rPr>
+        <w:t xml:space="preserve">✅  Vercel frontend deployed (already live at marketpl7ce.vercel.app)</w:t>
       </w:r>
     </w:p>
     <w:p>
@@ -25275,7 +28136,7 @@
           <w:sz w:val="19"/>
           <w:szCs w:val="19"/>
         </w:rPr>
-        <w:t xml:space="preserve">✅  All required webhook events subscribed (see Section 4.1a)</w:t>
+        <w:t xml:space="preserve">✅  All required webhook events subscribed</w:t>
       </w:r>
     </w:p>
     <w:p>
@@ -25575,101 +28436,7 @@
           <w:sz w:val="26"/>
           <w:szCs w:val="26"/>
         </w:rPr>
-        <w:t xml:space="preserve">9.5 Storage</w:t>
-      </w:r>
-    </w:p>
-    <w:p>
-      <w:pPr>
-        <w:pStyle w:val="ListParagraph"/>
-        <w:numPr>
-          <w:ilvl w:val="0"/>
-          <w:numId w:val="2"/>
-        </w:numPr>
-        <w:spacing w:after="40" w:before="40"/>
-      </w:pPr>
-      <w:r>
-        <w:rPr>
-          <w:rFonts w:ascii="Arial" w:cs="Arial" w:eastAsia="Arial" w:hAnsi="Arial"/>
-          <w:sz w:val="19"/>
-          <w:szCs w:val="19"/>
-        </w:rPr>
-        <w:t xml:space="preserve">✅  Supabase project created</w:t>
-      </w:r>
-    </w:p>
-    <w:p>
-      <w:pPr>
-        <w:pStyle w:val="ListParagraph"/>
-        <w:numPr>
-          <w:ilvl w:val="0"/>
-          <w:numId w:val="2"/>
-        </w:numPr>
-        <w:spacing w:after="40" w:before="40"/>
-      </w:pPr>
-      <w:r>
-        <w:rPr>
-          <w:rFonts w:ascii="Arial" w:cs="Arial" w:eastAsia="Arial" w:hAnsi="Arial"/>
-          <w:sz w:val="19"/>
-          <w:szCs w:val="19"/>
-        </w:rPr>
-        <w:t xml:space="preserve">✅  kyc-documents storage bucket created (private)</w:t>
-      </w:r>
-    </w:p>
-    <w:p>
-      <w:pPr>
-        <w:pStyle w:val="ListParagraph"/>
-        <w:numPr>
-          <w:ilvl w:val="0"/>
-          <w:numId w:val="2"/>
-        </w:numPr>
-        <w:spacing w:after="40" w:before="40"/>
-      </w:pPr>
-      <w:r>
-        <w:rPr>
-          <w:rFonts w:ascii="Arial" w:cs="Arial" w:eastAsia="Arial" w:hAnsi="Arial"/>
-          <w:sz w:val="19"/>
-          <w:szCs w:val="19"/>
-        </w:rPr>
-        <w:t xml:space="preserve">✅  SUPABASE_URL and SUPABASE_SERVICE_ROLE_KEY set in Railway</w:t>
-      </w:r>
-    </w:p>
-    <w:p>
-      <w:pPr>
-        <w:pStyle w:val="ListParagraph"/>
-        <w:numPr>
-          <w:ilvl w:val="0"/>
-          <w:numId w:val="2"/>
-        </w:numPr>
-        <w:spacing w:after="40" w:before="40"/>
-      </w:pPr>
-      <w:r>
-        <w:rPr>
-          <w:rFonts w:ascii="Arial" w:cs="Arial" w:eastAsia="Arial" w:hAnsi="Arial"/>
-          <w:sz w:val="19"/>
-          <w:szCs w:val="19"/>
-        </w:rPr>
-        <w:t xml:space="preserve">✅  KYC upload tested end-to-end</w:t>
-      </w:r>
-    </w:p>
-    <w:p>
-      <w:r>
-        <w:t xml:space="preserve"/>
-      </w:r>
-    </w:p>
-    <w:p>
-      <w:pPr>
-        <w:pStyle w:val="Heading2"/>
-        <w:spacing w:after="160" w:before="300"/>
-      </w:pPr>
-      <w:r>
-        <w:rPr>
-          <w:rFonts w:ascii="Arial" w:cs="Arial" w:eastAsia="Arial" w:hAnsi="Arial"/>
-          <w:b/>
-          <w:bCs/>
-          <w:color w:val="2E5E8A"/>
-          <w:sz w:val="26"/>
-          <w:szCs w:val="26"/>
-        </w:rPr>
-        <w:t xml:space="preserve">9.6 Legal &amp; Compliance (Romania / EU)</w:t>
+        <w:t xml:space="preserve">9.5 Legal &amp; Compliance (Romania / EU)</w:t>
       </w:r>
     </w:p>
     <w:p>
@@ -26123,7 +28890,7 @@
                 <w:sz w:val="19"/>
                 <w:szCs w:val="19"/>
               </w:rPr>
-              <w:t xml:space="preserve">GitHub Repository</w:t>
+              <w:t xml:space="preserve">GitHub Repository (All Files)</w:t>
             </w:r>
           </w:p>
         </w:tc>
@@ -26157,7 +28924,7 @@
                 <w:sz w:val="19"/>
                 <w:szCs w:val="19"/>
               </w:rPr>
-              <w:t xml:space="preserve">github.com/Abdelrhman7558/MarketPlace</w:t>
+              <w:t xml:space="preserve">https://github.com/MonjezAgency/MarketPlacee</w:t>
             </w:r>
           </w:p>
         </w:tc>
@@ -26261,7 +29028,7 @@
                 <w:sz w:val="19"/>
                 <w:szCs w:val="19"/>
               </w:rPr>
-              <w:t xml:space="preserve">Backend (Railway)</w:t>
+              <w:t xml:space="preserve">Railway Dashboard</w:t>
             </w:r>
           </w:p>
         </w:tc>
@@ -26295,7 +29062,7 @@
                 <w:sz w:val="19"/>
                 <w:szCs w:val="19"/>
               </w:rPr>
-              <w:t xml:space="preserve">Contact dev team for current Railway URL</w:t>
+              <w:t xml:space="preserve">https://railway.app/dashboard</w:t>
             </w:r>
           </w:p>
         </w:tc>
@@ -26399,7 +29166,7 @@
                 <w:sz w:val="19"/>
                 <w:szCs w:val="19"/>
               </w:rPr>
-              <w:t xml:space="preserve">Supabase Dashboard</w:t>
+              <w:t xml:space="preserve">Vercel Dashboard</w:t>
             </w:r>
           </w:p>
         </w:tc>
@@ -26433,7 +29200,7 @@
                 <w:sz w:val="19"/>
                 <w:szCs w:val="19"/>
               </w:rPr>
-              <w:t xml:space="preserve">https://app.supabase.com</w:t>
+              <w:t xml:space="preserve">https://vercel.com/dashboard</w:t>
             </w:r>
           </w:p>
         </w:tc>
@@ -26468,7 +29235,7 @@
                 <w:sz w:val="19"/>
                 <w:szCs w:val="19"/>
               </w:rPr>
-              <w:t xml:space="preserve">Railway Dashboard</w:t>
+              <w:t xml:space="preserve">OpenRouter (AI)</w:t>
             </w:r>
           </w:p>
         </w:tc>
@@ -26501,7 +29268,7 @@
                 <w:sz w:val="19"/>
                 <w:szCs w:val="19"/>
               </w:rPr>
-              <w:t xml:space="preserve">https://railway.app/dashboard</w:t>
+              <w:t xml:space="preserve">https://openrouter.ai (optional — for AI chatbot)</w:t>
             </w:r>
           </w:p>
         </w:tc>
@@ -26537,7 +29304,7 @@
                 <w:sz w:val="19"/>
                 <w:szCs w:val="19"/>
               </w:rPr>
-              <w:t xml:space="preserve">Vercel Dashboard</w:t>
+              <w:t xml:space="preserve">Resend (Email)</w:t>
             </w:r>
           </w:p>
         </w:tc>
@@ -26571,7 +29338,7 @@
                 <w:sz w:val="19"/>
                 <w:szCs w:val="19"/>
               </w:rPr>
-              <w:t xml:space="preserve">https://vercel.com/dashboard</w:t>
+              <w:t xml:space="preserve">https://resend.com (already set up — free tier)</w:t>
             </w:r>
           </w:p>
         </w:tc>

</xml_diff>